<commit_message>
Met à jour le cahier des charges (v1.3) : anti-bot et monitoring d'erreurs
Ajoute la section 3.7 (Turnstile + Sentry), deux lignes dans la stack
technique, la mention du widget anti-bot dans le parcours d'inscription
(6.2), les variables d'environnement optionnelles associées, et un
point d'attention sur les clés tierces à régénérer pour un développeur
reprenant le projet.
</commit_message>
<xml_diff>
--- a/cahier_des_charges_animeaux.docx
+++ b/cahier_des_charges_animeaux.docx
@@ -58,7 +58,7 @@
           <w:sz w:val="22"/>
           <w:szCs w:val="22"/>
         </w:rPr>
-        <w:t xml:space="preserve">Version 1.2 — document mis à jour avec les évolutions de juillet 2026 (pages légales CGU/politique de confidentialité, pied de page)</w:t>
+        <w:t xml:space="preserve">Version 1.3 — document mis à jour avec les évolutions de juillet 2026 (protection anti-bot à l’inscription, monitoring d’erreurs)</w:t>
       </w:r>
     </w:p>
     <w:p>
@@ -881,6 +881,90 @@
           </w:p>
         </w:tc>
       </w:tr>
+      <w:tr>
+        <w:tc>
+          <w:tcPr>
+            <w:tcW w:type="dxa" w:w="3200"/>
+            <w:tcMar>
+              <w:top w:type="dxa" w:w="60"/>
+              <w:left w:type="dxa" w:w="100"/>
+              <w:bottom w:type="dxa" w:w="60"/>
+              <w:right w:type="dxa" w:w="100"/>
+            </w:tcMar>
+          </w:tcPr>
+          <w:p>
+            <w:r>
+              <w:rPr>
+                <w:sz w:val="19"/>
+                <w:szCs w:val="19"/>
+              </w:rPr>
+              <w:t xml:space="preserve">Protection anti-bot (inscription)</w:t>
+            </w:r>
+          </w:p>
+        </w:tc>
+        <w:tc>
+          <w:tcPr>
+            <w:tcW w:type="dxa" w:w="5820"/>
+            <w:tcMar>
+              <w:top w:type="dxa" w:w="60"/>
+              <w:left w:type="dxa" w:w="100"/>
+              <w:bottom w:type="dxa" w:w="60"/>
+              <w:right w:type="dxa" w:w="100"/>
+            </w:tcMar>
+          </w:tcPr>
+          <w:p>
+            <w:r>
+              <w:rPr>
+                <w:sz w:val="19"/>
+                <w:szCs w:val="19"/>
+              </w:rPr>
+              <w:t xml:space="preserve">Cloudflare Turnstile</w:t>
+            </w:r>
+          </w:p>
+        </w:tc>
+      </w:tr>
+      <w:tr>
+        <w:tc>
+          <w:tcPr>
+            <w:tcW w:type="dxa" w:w="3200"/>
+            <w:tcMar>
+              <w:top w:type="dxa" w:w="60"/>
+              <w:left w:type="dxa" w:w="100"/>
+              <w:bottom w:type="dxa" w:w="60"/>
+              <w:right w:type="dxa" w:w="100"/>
+            </w:tcMar>
+          </w:tcPr>
+          <w:p>
+            <w:r>
+              <w:rPr>
+                <w:sz w:val="19"/>
+                <w:szCs w:val="19"/>
+              </w:rPr>
+              <w:t xml:space="preserve">Monitoring d’erreurs</w:t>
+            </w:r>
+          </w:p>
+        </w:tc>
+        <w:tc>
+          <w:tcPr>
+            <w:tcW w:type="dxa" w:w="5820"/>
+            <w:tcMar>
+              <w:top w:type="dxa" w:w="60"/>
+              <w:left w:type="dxa" w:w="100"/>
+              <w:bottom w:type="dxa" w:w="60"/>
+              <w:right w:type="dxa" w:w="100"/>
+            </w:tcMar>
+          </w:tcPr>
+          <w:p>
+            <w:r>
+              <w:rPr>
+                <w:sz w:val="19"/>
+                <w:szCs w:val="19"/>
+              </w:rPr>
+              <w:t xml:space="preserve">Sentry (@sentry/react)</w:t>
+            </w:r>
+          </w:p>
+        </w:tc>
+      </w:tr>
     </w:tbl>
     <w:p>
       <w:pPr>
@@ -948,7 +1032,7 @@
         <w:spacing w:after="160" w:line="300"/>
       </w:pPr>
       <w:r>
-        <w:t xml:space="preserve">Variables d'environnement : copier .env.example en .env.local et renseigner VITE_SUPABASE_URL et VITE_SUPABASE_ANON_KEY.</w:t>
+        <w:t xml:space="preserve">Variables d'environnement : copier .env.example en .env.local et renseigner VITE_SUPABASE_URL et VITE_SUPABASE_ANON_KEY. Deux variables optionnelles activent des fonctionnalités supplémentaires sans bloquer l'application si elles sont absentes : VITE_TURNSTILE_SITE_KEY (protection anti-bot à l'inscription, section 6.2) et VITE_SENTRY_DSN (remontée automatique des erreurs, section 3.7).</w:t>
       </w:r>
     </w:p>
     <w:p>
@@ -1144,6 +1228,49 @@
           <w:szCs w:val="20"/>
         </w:rPr>
         <w:t xml:space="preserve">Règle de conception récurrente dans la base de code : lorsqu'une jointure PostgREST directe se heurte à une politique RLS trop restrictive pour être traversée (par exemple lire le profil d'un tiers), le code effectue deux requêtes séparées — la requête principale, puis une requête complémentaire sur les identifiants collectés — et fusionne les résultats côté client plutôt que de tenter une jointure imbriquée bloquée par le RLS.</w:t>
+      </w:r>
+    </w:p>
+    <w:p>
+      <w:pPr>
+        <w:pStyle w:val="Heading2"/>
+        <w:spacing w:after="150" w:before="300"/>
+      </w:pPr>
+      <w:r>
+        <w:t xml:space="preserve">3.7 Monitoring et protection anti-bot</w:t>
+      </w:r>
+    </w:p>
+    <w:p>
+      <w:pPr>
+        <w:spacing w:after="160" w:line="300"/>
+      </w:pPr>
+      <w:r>
+        <w:t xml:space="preserve">Deux services tiers, tous deux optionnels et désactivés proprement si leur variable d'environnement respective est absente (aucun blocage de l'application) :</w:t>
+      </w:r>
+    </w:p>
+    <w:p>
+      <w:pPr>
+        <w:pStyle w:val="ListParagraph"/>
+        <w:numPr>
+          <w:ilvl w:val="0"/>
+          <w:numId w:val="2"/>
+        </w:numPr>
+        <w:spacing w:after="100"/>
+      </w:pPr>
+      <w:r>
+        <w:t xml:space="preserve">Cloudflare Turnstile (src/components/ui/Turnstile.tsx) — widget anti-bot affiché sur le formulaire d'inscription (/register, section 6.2). Le jeton produit est transmis à supabase.auth.signUp via options.captchaToken ; la vérification du jeton est effectuée côté Supabase Auth (clé secrète Turnstile configurée dans Authentication → Attack Protection du dashboard Supabase, jamais dans le code).</w:t>
+      </w:r>
+    </w:p>
+    <w:p>
+      <w:pPr>
+        <w:pStyle w:val="ListParagraph"/>
+        <w:numPr>
+          <w:ilvl w:val="0"/>
+          <w:numId w:val="2"/>
+        </w:numPr>
+        <w:spacing w:after="100"/>
+      </w:pPr>
+      <w:r>
+        <w:t xml:space="preserve">Sentry (@sentry/react, initialisé dans src/main.tsx) — capture automatiquement les exceptions JavaScript et les erreurs de rendu React en production, avec la pile d'appel, la page concernée et le navigateur. L'application est enveloppée dans un Sentry.ErrorBoundary qui affiche un écran de secours (plutôt qu'une page blanche) si un composant plante. Compte créé sur un essai 14 jours à volume illimité, puis plan gratuit (5 000 erreurs/mois) sans carte bancaire requise.</w:t>
       </w:r>
     </w:p>
     <w:p>
@@ -3859,7 +3986,7 @@
         <w:spacing w:after="160" w:line="300"/>
       </w:pPr>
       <w:r>
-        <w:t xml:space="preserve">Formulaire unique avec bascule Propriétaire / Praticien. Champs communs : prénom, nom, email, mot de passe (8 caractères minimum, validation Zod). Si le rôle choisi est praticien, un sélecteur obligatoire de profession apparaît, présentant la liste fermée des métiers sous forme de boutons illustrés d'une icône (voir section 6.7) — aucune saisie libre n'est possible. La validation du formulaire est bloquée tant que la case d'acceptation des CGU et de la politique de confidentialité (liens vers /cgu et /confidentialite, ouverts dans un nouvel onglet) n'est pas cochée. L'inscription utilise supabase.auth.signUp avec les métadonnées transmises au trigger handle_new_user. Un écran de confirmation invite ensuite à valider l'adresse email avant de pouvoir se connecter.</w:t>
+        <w:t xml:space="preserve">Formulaire unique avec bascule Propriétaire / Praticien. Champs communs : prénom, nom, email, mot de passe (8 caractères minimum, validation Zod). Si le rôle choisi est praticien, un sélecteur obligatoire de profession apparaît, présentant la liste fermée des métiers sous forme de boutons illustrés d'une icône (voir section 6.7) — aucune saisie libre n'est possible. La validation du formulaire est bloquée tant que la case d'acceptation des CGU et de la politique de confidentialité (liens vers /cgu et /confidentialite, ouverts dans un nouvel onglet) n'est pas cochée. Un widget de vérification anti-bot (Cloudflare Turnstile, section 3.7) doit également être validé avant soumission, si VITE_TURNSTILE_SITE_KEY est configurée. L'inscription utilise supabase.auth.signUp avec les métadonnées transmises au trigger handle_new_user. Un écran de confirmation invite ensuite à valider l'adresse email avant de pouvoir se connecter.</w:t>
       </w:r>
     </w:p>
     <w:p>
@@ -6571,6 +6698,19 @@
       </w:pPr>
       <w:r>
         <w:t xml:space="preserve">Le contenu des pages légales (/cgu, /confidentialite, section 6.14) est un premier jet non validé juridiquement : il ne doit pas être considéré comme définitif tant qu'il n'a pas été relu par un professionnel du droit, et les champs d'identité légale (SIRET, adresse, email de contact) restent à compléter avant toute mise en production réelle.</w:t>
+      </w:r>
+    </w:p>
+    <w:p>
+      <w:pPr>
+        <w:pStyle w:val="ListParagraph"/>
+        <w:numPr>
+          <w:ilvl w:val="0"/>
+          <w:numId w:val="2"/>
+        </w:numPr>
+        <w:spacing w:after="100"/>
+      </w:pPr>
+      <w:r>
+        <w:t xml:space="preserve">Les clés Turnstile et Sentry (section 3.7) sont propres au compte Cloudflare/Sentry de la fondatrice du projet : un développeur reprenant le projet devra créer ses propres comptes (gratuits) et régénérer VITE_TURNSTILE_SITE_KEY, la clé secrète Turnstile côté Supabase, et VITE_SENTRY_DSN.</w:t>
       </w:r>
     </w:p>
     <w:sectPr>

</xml_diff>

<commit_message>
Met à jour le cahier des charges (v1.4) : fonctions email déployées, domaine dédié
Documente une découverte importante : send-appointment-confirmation et
send-reminders existaient dans le code mais n'avaient jamais été
déployées sur Supabase (les Edge Functions ne se déploient pas via git
push) — aucun email transactionnel n'était donc jamais parti en
production. Les deux fonctions sont maintenant déployées, un job cron
horaire a été créé pour les rappels, et le domaine monanimeaux.fr a
été acheté et configuré sur Resend pour sortir du mode sandbox.
</commit_message>
<xml_diff>
--- a/cahier_des_charges_animeaux.docx
+++ b/cahier_des_charges_animeaux.docx
@@ -58,7 +58,7 @@
           <w:sz w:val="22"/>
           <w:szCs w:val="22"/>
         </w:rPr>
-        <w:t xml:space="preserve">Version 1.3 — document mis à jour avec les évolutions de juillet 2026 (protection anti-bot à l’inscription, monitoring d’erreurs)</w:t>
+        <w:t xml:space="preserve">Version 1.4 — document mis à jour avec les évolutions de juillet 2026 (déploiement des fonctions email manquantes, domaine d’envoi dédié)</w:t>
       </w:r>
     </w:p>
     <w:p>
@@ -4735,7 +4735,7 @@
         <w:spacing w:after="160" w:line="300"/>
       </w:pPr>
       <w:r>
-        <w:t xml:space="preserve">Appelée en best-effort à la création d'un rendez-vous (n'empêche pas la réservation en cas d'échec). Vérifie que l'appelant correspond bien au patient du rendez-vous, crée une notification in-app de type appointment_confirmed, puis envoie un email HTML via Resend si la variable d'environnement RESEND_API_KEY est configurée côté Supabase.</w:t>
+        <w:t xml:space="preserve">Appelée en best-effort à la création d'un rendez-vous (n'empêche pas la réservation en cas d'échec). Vérifie que l'appelant correspond bien au patient du rendez-vous, crée une notification in-app de type appointment_confirmed, puis envoie un email HTML via Resend si la variable d'environnement RESEND_API_KEY est configurée côté Supabase. Point critique découvert et corrigé le 21 juillet 2026 : cette fonction existait dans le code depuis longtemps mais n'avait jamais été déployée sur le projet Supabase (les Edge Functions ne se déploient pas automatiquement via git push — voir section 13) ; aucun email de confirmation de rendez-vous n'a donc jamais été envoyé en production jusqu'à cette date, l'appel best-effort échouant silencieusement (404) sans jamais bloquer la réservation.</w:t>
       </w:r>
     </w:p>
     <w:p>
@@ -4757,22 +4757,27 @@
     </w:p>
     <w:p>
       <w:pPr>
-        <w:pBdr>
-          <w:left w:val="single" w:color="F2820F" w:sz="18"/>
-        </w:pBdr>
-        <w:shd w:fill="FFF6E6" w:val="clear"/>
-        <w:spacing w:after="200" w:before="100"/>
-        <w:ind w:left="200"/>
-      </w:pPr>
-      <w:r>
-        <w:rPr>
-          <w:i/>
-          <w:iCs/>
-          <w:color w:val="6B5B3D"/>
-          <w:sz w:val="20"/>
-          <w:szCs w:val="20"/>
-        </w:rPr>
-        <w:t xml:space="preserve">L'envoi effectif de l'email de rappel via Resend est présent en commentaire dans le code (TODO explicite) mais n'est pas implémenté : seule la notification in-app est créée. Autre point relevé à la lecture du code : la ligne user_id de la notification est calculée à partir de appt.profiles?.user_id, alors que profiles n'a pas de colonne user_id dans ce contexte de sélection (elle est jointe via patient_id) — un développeur reprenant cette fonction devra vérifier et corriger cette valeur avant de l'activer en production.</w:t>
+        <w:spacing w:after="160" w:line="300"/>
+      </w:pPr>
+      <w:r>
+        <w:t xml:space="preserve">Mise à jour du 21 juillet 2026 : l'envoi de l'email de rappel via Resend est désormais implémenté (auparavant seule la notification in-app était créée), et le bug de résolution de user_id évoqué dans une version antérieure de ce document a été corrigé (user_id = patient_id directement, sans passer par profiles). Surtout, la fonction n'était jamais déployée sur le projet Supabase malgré ces corrections présentes dans le code : elle a été déployée manuellement ce même jour, et un job cron (pg_cron + pg_net, table Integrations → Cron) nommé send-reminders-hourly a été créé pour l'appeler chaque heure via un POST HTTP authentifié par le secret CRON_SECRET — aucun cron n'existait avant cette date, donc aucun rappel n'a jamais été envoyé en production.</w:t>
+      </w:r>
+    </w:p>
+    <w:p>
+      <w:pPr>
+        <w:pStyle w:val="Heading2"/>
+        <w:spacing w:after="150" w:before="300"/>
+      </w:pPr>
+      <w:r>
+        <w:t xml:space="preserve">9.3 Domaine d'envoi dédié (monanimeaux.fr)</w:t>
+      </w:r>
+    </w:p>
+    <w:p>
+      <w:pPr>
+        <w:spacing w:after="160" w:line="300"/>
+      </w:pPr>
+      <w:r>
+        <w:t xml:space="preserve">Un nom de domaine dédié, monanimeaux.fr (acheté chez OVH le 20 juillet 2026 — animeaux.fr et animeaux.com étant tous deux détenus par des revendeurs tiers à des prix prohibitifs), a été ajouté et configuré sur Resend (DKIM, SPF/MX, DMARC) pour sortir du mode sandbox, qui limitait jusqu'ici l'envoi à la seule adresse du compte Resend. La vérification du domaine était encore en attente (« Pending ») au moment de la rédaction ; une fois validée, la variable EMAIL_FROM devra être ajoutée aux secrets des Edge Functions avec une adresse sur ce domaine (ex. contact@monanimeaux.fr) pour remplacer l'expéditeur par défaut onboarding@resend.dev.</w:t>
       </w:r>
     </w:p>
     <w:p>
@@ -6619,7 +6624,7 @@
         <w:spacing w:after="100"/>
       </w:pPr>
       <w:r>
-        <w:t xml:space="preserve">La fonction send-reminders contient un bug potentiel sur la résolution de user_id (voir section 9.2) et n'envoie pas encore d'email malgré son nom.</w:t>
+        <w:t xml:space="preserve">Les Edge Functions Supabase ne se déploient jamais automatiquement via git push (contrairement au site, déployé sur Vercel à chaque push) : toute nouvelle fonction ou modification doit être déployée manuellement, via la CLI Supabase ou l'éditeur en ligne du dashboard (Edge Functions → Deploy a new function → Via Editor). C'est ce qui explique que send-appointment-confirmation et send-reminders soient restées absentes de la production pendant des semaines malgré un code correct — seule invite-clinic-secretary avait été déployée. Un rappel systématique après toute modification d'une Edge Function : vérifier sa présence dans Edge Functions → Functions sur le dashboard Supabase.</w:t>
       </w:r>
     </w:p>
     <w:p>

</xml_diff>

<commit_message>
Met à jour le cahier des charges (v1.5) : harmonisation des champs praticien
Documente la résolution des deux incohérences entre /profil et le
tableau de bord praticien : le champ spécialité (déjà fixé avant
cette session) et les champs espèces acceptées / domicile (ajoutés
au tableau de bord ce jour). Sections 6.13, 7.5 et 13 mises à jour.
</commit_message>
<xml_diff>
--- a/cahier_des_charges_animeaux.docx
+++ b/cahier_des_charges_animeaux.docx
@@ -58,7 +58,7 @@
           <w:sz w:val="22"/>
           <w:szCs w:val="22"/>
         </w:rPr>
-        <w:t xml:space="preserve">Version 1.4 — document mis à jour avec les évolutions de juillet 2026 (déploiement des fonctions email manquantes, domaine d’envoi dédié)</w:t>
+        <w:t xml:space="preserve">Version 1.5 — document mis à jour avec les évolutions de juillet 2026 (harmonisation des champs praticien)</w:t>
       </w:r>
     </w:p>
     <w:p>
@@ -4513,7 +4513,7 @@
         <w:spacing w:after="160" w:line="300"/>
       </w:pPr>
       <w:r>
-        <w:t xml:space="preserve">Page générique de profil, commune aux patients et aux praticiens : informations personnelles, section contact d'urgence, et pour les praticiens un bloc d'informations professionnelles où le champ spécialité est ici une saisie libre (&lt;input&gt;) — une incohérence par rapport au tableau de bord praticien, qui utilise une liste déroulante fermée pour ce même champ (voir section 7.5). Ce bloc praticien est aussi le seul endroit de l'application où sont éditables les espèces acceptées (pastilles multi-sélection Chiens / Chats / NAC / Équidés / Oiseaux) et le fait de se déplacer à domicile — deux champs utilisés par les nouveaux filtres de recherche (section 6.4) mais absents de l'onglet Profil du tableau de bord praticien (section 7.5). Une zone « zone dangereuse » permet la suppression définitive du compte : le clic ouvre désormais un écran de confirmation dédié qui liste précisément les données qui seront effacées et n'active le bouton de suppression définitive qu'une fois le mot SUPPRIMER saisi dans un champ dédié, en plus de la simple confirmation initiale.</w:t>
+        <w:t xml:space="preserve">Page générique de profil, commune aux patients et aux praticiens : informations personnelles, section contact d'urgence, et pour les praticiens un bloc d'informations professionnelles reprenant les mêmes champs et le même composant que l'onglet Profil du tableau de bord praticien (spécialité en liste déroulante fermée, espèces acceptées, déplacement à domicile — harmonisé le 21 juillet 2026, voir section 7.5 et section 13). Une zone « zone dangereuse » permet la suppression définitive du compte : le clic ouvre désormais un écran de confirmation dédié qui liste précisément les données qui seront effacées et n'active le bouton de suppression définitive qu'une fois le mot SUPPRIMER saisi dans un champ dédié, en plus de la simple confirmation initiale.</w:t>
       </w:r>
     </w:p>
     <w:p>
@@ -4632,7 +4632,7 @@
         <w:spacing w:after="160" w:line="300"/>
       </w:pPr>
       <w:r>
-        <w:t xml:space="preserve">Trois sections : le profil du cabinet (nom, ville, adresse, téléphone, logo — édition réservée à l'administrateur/créateur du cabinet), le profil personnel (avatar, nom, profession — liste déroulante fermée issue de PRACTITIONER_TYPES, ville/adresse masquées si le praticien appartient à un cabinet, biographie via l'éditeur de texte enrichi, téléphone), et une zone dangereuse de suppression de compte avec confirmation.</w:t>
+        <w:t xml:space="preserve">Trois sections : le profil du cabinet (nom, ville, adresse, téléphone, logo — édition réservée à l'administrateur/créateur du cabinet), le profil personnel (avatar, nom, profession — liste déroulante fermée issue de PRACTITIONER_TYPES, ville/adresse masquées si le praticien appartient à un cabinet, espèces acceptées et déplacement à domicile — alignés sur /profil depuis le 21 juillet 2026, biographie via l'éditeur de texte enrichi, téléphone), et une zone dangereuse de suppression de compte avec confirmation.</w:t>
       </w:r>
     </w:p>
     <w:p>
@@ -6637,20 +6637,7 @@
         <w:spacing w:after="100"/>
       </w:pPr>
       <w:r>
-        <w:t xml:space="preserve">Le champ « spécialité » du praticien est éditable en liste fermée dans le tableau de bord praticien (/dashboard/doctor?tab=profil) mais en saisie libre dans la page de profil générique (/profil) — incohérence à trancher lors d'une éventuelle refonte.</w:t>
-      </w:r>
-    </w:p>
-    <w:p>
-      <w:pPr>
-        <w:pStyle w:val="ListParagraph"/>
-        <w:numPr>
-          <w:ilvl w:val="0"/>
-          <w:numId w:val="2"/>
-        </w:numPr>
-        <w:spacing w:after="100"/>
-      </w:pPr>
-      <w:r>
-        <w:t xml:space="preserve">Les champs praticien espèces acceptées et se déplace à domicile (utilisés par les filtres de recherche, section 6.4) ne sont éditables que depuis /profil et absents de l'onglet Profil du tableau de bord praticien (/dashboard/doctor?tab=profil) — même famille d'incohérence que le champ spécialité ci-dessus.</w:t>
+        <w:t xml:space="preserve">Résolu le 21 juillet 2026 : le champ spécialité (déjà corrigé en amont de cette session, commit dee4020) et les champs espèces acceptées / déplacement à domicile (ajoutés à l'onglet Profil du tableau de bord praticien à cette date) sont désormais cohérents entre /profil et /dashboard/doctor?tab=profil — les deux pages utilisent les mêmes composants et enregistrent les mêmes colonnes via useUpdateDoctor.</w:t>
       </w:r>
     </w:p>
     <w:p>

</xml_diff>

<commit_message>
Met à jour le cahier des charges (v1.6) : RGPD et correctif Turnstile critique
Ajoute la section 5.4 (preuve de consentement, portabilité des
données) et documente dans la section 3.7 le bug critique découvert
et corrigé le 21 juillet 2026 : la protection captcha Supabase Auth
s'applique à toutes les routes d'authentification, pas seulement à
l'inscription — la connexion était cassée en production jusqu'au
correctif. Point d'attention ajouté en section 13 pour éviter la
régression sur une future route d'authentification.
</commit_message>
<xml_diff>
--- a/cahier_des_charges_animeaux.docx
+++ b/cahier_des_charges_animeaux.docx
@@ -58,7 +58,7 @@
           <w:sz w:val="22"/>
           <w:szCs w:val="22"/>
         </w:rPr>
-        <w:t xml:space="preserve">Version 1.5 — document mis à jour avec les évolutions de juillet 2026 (harmonisation des champs praticien)</w:t>
+        <w:t xml:space="preserve">Version 1.6 — document mis à jour avec les évolutions de juillet 2026 (RGPD : consentement, portabilité, correctif Turnstile critique)</w:t>
       </w:r>
     </w:p>
     <w:p>
@@ -1270,7 +1270,7 @@
         <w:spacing w:after="100"/>
       </w:pPr>
       <w:r>
-        <w:t xml:space="preserve">Sentry (@sentry/react, initialisé dans src/main.tsx) — capture automatiquement les exceptions JavaScript et les erreurs de rendu React en production, avec la pile d'appel, la page concernée et le navigateur. L'application est enveloppée dans un Sentry.ErrorBoundary qui affiche un écran de secours (plutôt qu'une page blanche) si un composant plante. Compte créé sur un essai 14 jours à volume illimité, puis plan gratuit (5 000 erreurs/mois) sans carte bancaire requise.</w:t>
+        <w:t xml:space="preserve">Sentry (@sentry/react, initialisé dans src/main.tsx) — capture automatiquement les exceptions JavaScript et les erreurs de rendu React en production, avec la pile d'appel, la page concernée et le navigateur. L'application est enveloppée dans un Sentry.ErrorBoundary qui affiche un écran de secours (plutôt qu'une page blanche) si un composant plante. Compte créé sur un essai 14 jours à volume illimité, puis plan gratuit (5 000 erreurs/mois) sans carte bancaire requise. Point d'attention critique découvert le 21 juillet 2026 : activer la protection captcha dans Supabase Auth (Attack Protection) l'applique à toutes les routes d'authentification (signUp, signInWithPassword, resetPasswordForEmail), pas seulement à l'inscription. Le widget Turnstile n'avait été ajouté qu'à /register : plus personne ne pouvait se connecter ni réinitialiser son mot de passe jusqu'à ce que le widget soit également ajouté à /login et /forgot-password. Toute nouvelle route appelant une méthode supabase.auth.* doit désormais transmettre options.captchaToken si la protection captcha est active.</w:t>
       </w:r>
     </w:p>
     <w:p>
@@ -3948,6 +3948,49 @@
     </w:p>
     <w:p>
       <w:pPr>
+        <w:pStyle w:val="Heading2"/>
+        <w:spacing w:after="150" w:before="300"/>
+      </w:pPr>
+      <w:r>
+        <w:t xml:space="preserve">5.4 Conformité RGPD : consentement et portabilité</w:t>
+      </w:r>
+    </w:p>
+    <w:p>
+      <w:pPr>
+        <w:spacing w:after="160" w:line="300"/>
+      </w:pPr>
+      <w:r>
+        <w:t xml:space="preserve">Ajoutés le 21 juillet 2026, en préparation de l'ouverture au public :</w:t>
+      </w:r>
+    </w:p>
+    <w:p>
+      <w:pPr>
+        <w:pStyle w:val="ListParagraph"/>
+        <w:numPr>
+          <w:ilvl w:val="0"/>
+          <w:numId w:val="2"/>
+        </w:numPr>
+        <w:spacing w:after="100"/>
+      </w:pPr>
+      <w:r>
+        <w:t xml:space="preserve">users.terms_accepted_at (colonne timestamptz) — preuve horodatée de l'acceptation des CGU et de la politique de confidentialité. Renseignée par handle_new_user() uniquement si le client transmet terms_accepted=true dans les métadonnées d'inscription (RegisterPage.tsx). Auparavant, la case à cocher ne bloquait que la soumission du formulaire côté client, sans aucune trace côté serveur.</w:t>
+      </w:r>
+    </w:p>
+    <w:p>
+      <w:pPr>
+        <w:pStyle w:val="ListParagraph"/>
+        <w:numPr>
+          <w:ilvl w:val="0"/>
+          <w:numId w:val="2"/>
+        </w:numPr>
+        <w:spacing w:after="100"/>
+      </w:pPr>
+      <w:r>
+        <w:t xml:space="preserve">export_my_data() — RPC SECURITY DEFINER (droit à la portabilité, RGPD art. 20) agrégeant en un seul objet JSON l'ensemble des données personnelles de l'utilisateur connecté : compte, profil, profil praticien, animaux, vaccins, suivi de poids, dossiers médicaux, documents, rendez-vous (patient et praticien), avis, messages, notifications, disponibilités. Scopée à auth.uid(), impossible d'exporter les données d'un tiers. Bouton « Télécharger mes données » sur /profil et sur l'onglet Profil du tableau de bord praticien, qui déclenche le téléchargement d'un fichier .json.</w:t>
+      </w:r>
+    </w:p>
+    <w:p>
+      <w:pPr>
         <w:pStyle w:val="Heading1"/>
         <w:spacing w:after="200" w:before="400"/>
       </w:pPr>
@@ -6703,6 +6746,19 @@
       </w:pPr>
       <w:r>
         <w:t xml:space="preserve">Les clés Turnstile et Sentry (section 3.7) sont propres au compte Cloudflare/Sentry de la fondatrice du projet : un développeur reprenant le projet devra créer ses propres comptes (gratuits) et régénérer VITE_TURNSTILE_SITE_KEY, la clé secrète Turnstile côté Supabase, et VITE_SENTRY_DSN.</w:t>
+      </w:r>
+    </w:p>
+    <w:p>
+      <w:pPr>
+        <w:pStyle w:val="ListParagraph"/>
+        <w:numPr>
+          <w:ilvl w:val="0"/>
+          <w:numId w:val="2"/>
+        </w:numPr>
+        <w:spacing w:after="100"/>
+      </w:pPr>
+      <w:r>
+        <w:t xml:space="preserve">Si la protection captcha Supabase Auth (Attack Protection) est activée, toute page appelant supabase.auth.signUp, signInWithPassword ou resetPasswordForEmail doit inclure le widget Turnstile et transmettre options.captchaToken — sans quoi la requête échoue avec captcha_failed (voir section 3.7, bug critique corrigé le 21 juillet 2026 sur /login et /forgot-password).</w:t>
       </w:r>
     </w:p>
     <w:sectPr>

</xml_diff>

<commit_message>
Met à jour le cahier des charges (v1.7) : vérification des praticiens
Ajoute la section 6.15 (vérification par documents justificatifs),
réécrit entièrement la section 10 (tableau de bord admin, désormais
fonctionnel), et documente en section 13 les deux leçons techniques de
cette session : search_path explicite obligatoire sur les fonctions
SECURITY DEFINER (bug ayant cassé toutes les inscriptions), et le cast
explicite requis pour un CASE WHEN inséré dans une colonne enum.
</commit_message>
<xml_diff>
--- a/cahier_des_charges_animeaux.docx
+++ b/cahier_des_charges_animeaux.docx
@@ -58,7 +58,7 @@
           <w:sz w:val="22"/>
           <w:szCs w:val="22"/>
         </w:rPr>
-        <w:t xml:space="preserve">Version 1.6 — document mis à jour avec les évolutions de juillet 2026 (RGPD : consentement, portabilité, correctif Turnstile critique)</w:t>
+        <w:t xml:space="preserve">Version 1.7 — document mis à jour avec les évolutions de juillet 2026 (vérification des praticiens par documents, correctif critique inscriptions)</w:t>
       </w:r>
     </w:p>
     <w:p>
@@ -4095,7 +4095,7 @@
         <w:spacing w:after="160" w:line="300"/>
       </w:pPr>
       <w:r>
-        <w:t xml:space="preserve">Un praticien membre d'un cabinet n'apparaît jamais comme résultat individuel (RPC get_clinic_member_doctor_ids) : il n'est trouvé qu'en passant par la fiche du cabinet, sauf si la recherche correspond directement à son nom, auquel cas il reste visible. Les résultats affichent séparément les cabinets (useClinicsSearch, RPC search_clinics) puis les praticiens individuels (useDoctors) ; les filtres prix, note, espèces, domicile et disponibilité ne s'appliquent volontairement pas aux cabinets, portant sur un praticien précis et non sur l'établissement dans son ensemble. Un bouton Retour est aligné sur la même ligne que la barre de recherche.</w:t>
+        <w:t xml:space="preserve">Depuis le 21 juillet 2026, seuls les praticiens au statut verification_status = 'verified' apparaissent dans les résultats (voir section 6.15) — un praticien en attente ou rejeté reste absent, même s'il correspond par ailleurs aux critères filtrés. Un praticien membre d'un cabinet n'apparaît jamais comme résultat individuel (RPC get_clinic_member_doctor_ids) : il n'est trouvé qu'en passant par la fiche du cabinet, sauf si la recherche correspond directement à son nom, auquel cas il reste visible. Les résultats affichent séparément les cabinets (useClinicsSearch, RPC search_clinics) puis les praticiens individuels (useDoctors) ; les filtres prix, note, espèces, domicile et disponibilité ne s'appliquent volontairement pas aux cabinets, portant sur un praticien précis et non sur l'établissement dans son ensemble. Un bouton Retour est aligné sur la même ligne que la barre de recherche.</w:t>
       </w:r>
     </w:p>
     <w:p>
@@ -4120,7 +4120,7 @@
         <w:spacing w:after="160" w:line="300"/>
       </w:pPr>
       <w:r>
-        <w:t xml:space="preserve">Accessible sans connexion. Affiche l'en-tête (avatar, profession, adresse — celle du cabinet si le praticien en est membre, sinon son adresse personnelle —, note moyenne, badge « Vérifié » le cas échéant), la biographie au format HTML enrichi et sanitisé, un emplacement pour une carte (actuellement un placeholder, la dépendance Leaflet étant installée mais non branchée sur des coordonnées réelles), la liste des avis avec un formulaire de dépôt d'avis (réservé aux patients, sans limite de nombre ni lien obligatoire avec un rendez-vous), et un encart de réservation latéral affichant le tarif et un bouton d'action (redirection vers connexion/inscription si le visiteur n'est pas connecté).</w:t>
+        <w:t xml:space="preserve">Accessible sans connexion. Affiche l'en-tête (avatar, profession, adresse — celle du cabinet si le praticien en est membre, sinon son adresse personnelle —, note moyenne, badge « Vérifié » le cas échéant), la biographie au format HTML enrichi et sanitisé, un emplacement pour une carte (actuellement un placeholder, la dépendance Leaflet étant installée mais non branchée sur des coordonnées réelles), la liste des avis avec un formulaire de dépôt d'avis (réservé aux patients, sans limite de nombre ni lien obligatoire avec un rendez-vous), et un encart de réservation latéral affichant le tarif et un bouton d'action (redirection vers connexion/inscription si le visiteur n'est pas connecté). Depuis le 21 juillet 2026, un praticien non vérifié affiche « Ce profil n'est pas encore disponible » à tout visiteur autre que le praticien lui-même (cohérent avec son absence des résultats de recherche, voir section 6.15) — sans cette garde, un lien direct aurait pu contourner le filtre de recherche.</w:t>
       </w:r>
     </w:p>
     <w:p>
@@ -4578,6 +4578,23 @@
     </w:p>
     <w:p>
       <w:pPr>
+        <w:pStyle w:val="Heading2"/>
+        <w:spacing w:after="150" w:before="300"/>
+      </w:pPr>
+      <w:r>
+        <w:t xml:space="preserve">6.15 Vérification des praticiens par documents justificatifs</w:t>
+      </w:r>
+    </w:p>
+    <w:p>
+      <w:pPr>
+        <w:spacing w:after="160" w:line="300"/>
+      </w:pPr>
+      <w:r>
+        <w:t xml:space="preserve">Ajoutée le 21 juillet 2026. Un praticien peut utiliser son tableau de bord immédiatement après l'inscription (aucune attente bloquante), mais reste invisible du public — absent des résultats de recherche (section 6.4) et de sa fiche publique directe (section 6.5) — tant que son dossier n'est pas validé par un administrateur. doctors.verification_status vaut 'pending' (défaut), 'verified' ou 'rejected'. Depuis l'onglet Profil du tableau de bord (section 7.5), le praticien dépose un ou plusieurs documents (diplôme, carte professionnelle / numéro d'ordre, pièce d'identité) dans doctor_verification_documents, stockés dans le bucket privé verification-documents (URL signée valable 1 an à l'upload, jamais d'URL publique — contrairement aux buckets avatars/documents). Un trigger before update sur doctors (prevent_self_verification) annule silencieusement toute tentative de modifier verification_status ou verification_rejected_reason par une requête autre qu'émise par un administrateur (is_admin()), empêchant un praticien de s'auto-valider même via un appel API direct.</w:t>
+      </w:r>
+    </w:p>
+    <w:p>
+      <w:pPr>
         <w:pStyle w:val="Heading1"/>
         <w:spacing w:after="200" w:before="400"/>
       </w:pPr>
@@ -4675,7 +4692,7 @@
         <w:spacing w:after="160" w:line="300"/>
       </w:pPr>
       <w:r>
-        <w:t xml:space="preserve">Trois sections : le profil du cabinet (nom, ville, adresse, téléphone, logo — édition réservée à l'administrateur/créateur du cabinet), le profil personnel (avatar, nom, profession — liste déroulante fermée issue de PRACTITIONER_TYPES, ville/adresse masquées si le praticien appartient à un cabinet, espèces acceptées et déplacement à domicile — alignés sur /profil depuis le 21 juillet 2026, biographie via l'éditeur de texte enrichi, téléphone), et une zone dangereuse de suppression de compte avec confirmation.</w:t>
+        <w:t xml:space="preserve">Trois sections : le profil du cabinet (nom, ville, adresse, téléphone, logo — édition réservée à l'administrateur/créateur du cabinet), le profil personnel (avatar, nom, profession — liste déroulante fermée issue de PRACTITIONER_TYPES, ville/adresse masquées si le praticien appartient à un cabinet, espèces acceptées et déplacement à domicile — alignés sur /profil depuis le 21 juillet 2026, biographie via l'éditeur de texte enrichi, téléphone), un bloc de vérification du profil (dépôt de documents justificatifs, statut en attente/vérifié/rejeté — voir section 6.15) inséré entre le profil personnel et l'export des données, et une zone dangereuse de suppression de compte avec confirmation.</w:t>
       </w:r>
     </w:p>
     <w:p>
@@ -4837,7 +4854,7 @@
         <w:spacing w:after="160" w:line="300"/>
       </w:pPr>
       <w:r>
-        <w:t xml:space="preserve">Le tableau de bord admin est un stub non fonctionnel : la page affiche trois cartes de métriques dont la valeur est systématiquement un tiret (—), accompagnées d'une note invitant l'administrateur à se rendre directement dans le tableau de bord Supabase pour toute opération d'administration. Aucune fonctionnalité de modération, de gestion des utilisateurs ou de reporting n'est implémentée côté interface.</w:t>
+        <w:t xml:space="preserve">Depuis le 21 juillet 2026, la section « Praticiens à vérifier » est pleinement fonctionnelle (le reste du tableau de bord — cartes de métriques, modération, reporting — demeure un stub non implémenté). Elle liste, via la RPC admin_list_pending_doctors(), tous les praticiens au statut verification_status = 'pending' avec leurs documents déposés, et propose deux actions : Valider (RPC admin_review_doctor avec p_approve=true) et Rejeter (idem avec un motif optionnel, visible par le praticien). Les deux RPC sont SECURITY DEFINER et vérifient is_admin() côté serveur, indépendamment de ce qu'envoie le client. Accès réservé de fait : le rôle admin ne peut être attribué que manuellement en base (UPDATE direct sur users.role), aucun parcours d'inscription ne permet de l'obtenir soi-même. Point d'attention : l'introduction de ce statut a rendu 'pending' par défaut tous les praticiens déjà inscrits avant cette date (aucun n'avait de statut de vérification formel auparavant) — ils ont donc temporairement disparu des résultats de recherche jusqu'à validation manuelle a posteriori par un administrateur.</w:t>
       </w:r>
     </w:p>
     <w:p>
@@ -6759,6 +6776,32 @@
       </w:pPr>
       <w:r>
         <w:t xml:space="preserve">Si la protection captcha Supabase Auth (Attack Protection) est activée, toute page appelant supabase.auth.signUp, signInWithPassword ou resetPasswordForEmail doit inclure le widget Turnstile et transmettre options.captchaToken — sans quoi la requête échoue avec captcha_failed (voir section 3.7, bug critique corrigé le 21 juillet 2026 sur /login et /forgot-password).</w:t>
+      </w:r>
+    </w:p>
+    <w:p>
+      <w:pPr>
+        <w:pStyle w:val="ListParagraph"/>
+        <w:numPr>
+          <w:ilvl w:val="0"/>
+          <w:numId w:val="2"/>
+        </w:numPr>
+        <w:spacing w:after="100"/>
+      </w:pPr>
+      <w:r>
+        <w:t xml:space="preserve">Toute fonction PostgreSQL SECURITY DEFINER doit fixer explicitement search_path (ex. set search_path = public dans sa définition) et qualifier ses types par leur schéma (public.user_role plutôt que user_role). Son omission dans handle_new_user() a cassé toutes les inscriptions (patient et praticien) en production le 21 juillet 2026 pendant plusieurs heures : le rôle technique supabase_auth_admin, qui exécute ce trigger à chaque inscription, n'a pas 'public' dans son search_path par défaut, provoquant l'erreur 'type "user_role" does not exist' et un message générique 'Database error saving new user' côté client — sans lien apparent avec la cause réelle. Diagnostiqué via Logs → Postgres Logs dans le dashboard Supabase (pas via les logs applicatifs).</w:t>
+      </w:r>
+    </w:p>
+    <w:p>
+      <w:pPr>
+        <w:pStyle w:val="ListParagraph"/>
+        <w:numPr>
+          <w:ilvl w:val="0"/>
+          <w:numId w:val="2"/>
+        </w:numPr>
+        <w:spacing w:after="100"/>
+      </w:pPr>
+      <w:r>
+        <w:t xml:space="preserve">Le résultat d'un CASE WHEN sur des littéraux texte est résolu en type text par Postgres : l'insérer directement dans une colonne enum (ex. notifications.type) échoue avec 'column is of type X but expression is of type text', contrairement à un littéral direct qui bénéficie d'une coercion implicite. Caster explicitement (...)::mon_enum.</w:t>
       </w:r>
     </w:p>
     <w:sectPr>

</xml_diff>

<commit_message>
Cahier des charges v1.8 : documente l'espace secrétariat en compte dédié
Version bump, section 4.4 complétée (modèle clinics/clinic_members/
clinic_staff), nouvelle entrée section 13 sur le correctif du 22 juillet.

Co-Authored-By: Claude Sonnet 5 <noreply@anthropic.com>
</commit_message>
<xml_diff>
--- a/cahier_des_charges_animeaux.docx
+++ b/cahier_des_charges_animeaux.docx
@@ -58,7 +58,7 @@
           <w:sz w:val="22"/>
           <w:szCs w:val="22"/>
         </w:rPr>
-        <w:t xml:space="preserve">Version 1.7 — document mis à jour avec les évolutions de juillet 2026 (vérification des praticiens par documents, correctif critique inscriptions)</w:t>
+        <w:t>Version 1.8 — document mis à jour avec les évolutions de juillet 2026 (vérification des praticiens par documents, correctif critique inscriptions, espace secrétariat en compte dédié)</w:t>
       </w:r>
     </w:p>
     <w:p>
@@ -2461,6 +2461,14 @@
         <w:t xml:space="preserve">4.4 Cabinets (structures multi-praticiens)</w:t>
       </w:r>
     </w:p>
+    <w:p>
+      <w:pPr>
+        <w:spacing w:after="160" w:line="300"/>
+      </w:pPr>
+      <w:r>
+        <w:t xml:space="preserve">La table clinics regroupe plusieurs praticiens sous une même structure (adresse, logo, tarifs et créneaux partagés — voir section 6.6), et clinic_members y rattache les comptes doctor membres. Un accès secrétariat (rôle secretary) est distinct : la table clinic_staff associe un compte secretary à un cabinet. Depuis le 22 juillet 2026, cet accès est toujours un compte dédié avec ses propres identifiants, créé par le propriétaire du cabinet depuis l'Edge Function invite-clinic-secretary (email déjà utilisé par un autre compte Animéaux = refusé) — jamais un rattachement à un compte praticien ou patient existant, pour que le tableau de bord secrétariat (/dashboard/secretariat) reste un espace réellement séparé plutôt qu'un onglet supplémentaire du dashboard praticien.</w:t>
+      </w:r>
+    </w:p>
     <w:tbl>
       <w:tblPr>
         <w:tblW w:type="dxa" w:w="9020"/>
@@ -6802,6 +6810,19 @@
       </w:pPr>
       <w:r>
         <w:t xml:space="preserve">Le résultat d'un CASE WHEN sur des littéraux texte est résolu en type text par Postgres : l'insérer directement dans une colonne enum (ex. notifications.type) échoue avec 'column is of type X but expression is of type text', contrairement à un littéral direct qui bénéficie d'une coercion implicite. Caster explicitement (...)::mon_enum.</w:t>
+      </w:r>
+    </w:p>
+    <w:p>
+      <w:pPr>
+        <w:pStyle w:val="ListParagraph"/>
+        <w:numPr>
+          <w:ilvl w:val="0"/>
+          <w:numId w:val="2"/>
+        </w:numPr>
+        <w:spacing w:after="100"/>
+      </w:pPr>
+      <w:r>
+        <w:t xml:space="preserve">Résolu le 22 juillet 2026 : l'espace secrétariat rattachait un accès «Espace secrétariat» à un compte praticien/patient/admin existant lorsque l'email invité correspondait à un compte déjà créé (simple lien ajouté à la navbar, sans nouveaux identifiants) — perçu comme un onglet du dashboard praticien plutôt qu'un espace réellement séparé. L'Edge Function invite-clinic-secretary refuse désormais tout email déjà utilisé par un autre compte Animéaux et crée systématiquement un compte dédié (role secretary, identifiants propres) ; le raccourci de navbar bolt-on est retiré, useMyClinicStaffInfo et la route /dashboard/secretariat sont restreints au rôle secretary.</w:t>
       </w:r>
     </w:p>
     <w:sectPr>

</xml_diff>

<commit_message>
Cahier des charges v1.9 : documente le découplage admin/rôle
Section 2.3, 3.5 (ProtectedRoute) et nouvelle entrée section 13.

Co-Authored-By: Claude Sonnet 5 <noreply@anthropic.com>
</commit_message>
<xml_diff>
--- a/cahier_des_charges_animeaux.docx
+++ b/cahier_des_charges_animeaux.docx
@@ -58,7 +58,7 @@
           <w:sz w:val="22"/>
           <w:szCs w:val="22"/>
         </w:rPr>
-        <w:t>Version 1.8 — document mis à jour avec les évolutions de juillet 2026 (vérification des praticiens par documents, correctif critique inscriptions, espace secrétariat en compte dédié)</w:t>
+        <w:t>Version 1.9 — document mis à jour avec les évolutions de juillet 2026 (vérification des praticiens par documents, correctif critique inscriptions, espace secrétariat en compte dédié, statut administrateur découplé du rôle)</w:t>
       </w:r>
     </w:p>
     <w:p>
@@ -270,7 +270,7 @@
         <w:spacing w:after="160" w:line="300"/>
       </w:pPr>
       <w:r>
-        <w:t xml:space="preserve">Le rôle admin existe dans le modèle de données et contourne les vérifications de rôle des routes protégées (ProtectedRoute), mais son tableau de bord dédié (/dashboard/admin) est aujourd'hui un stub : trois cartes de métriques affichant des tirets (—) sans données réelles, avec une note invitant à utiliser directement le tableau de bord Supabase. Aucune fonctionnalité d'administration n'est implémentée côté interface (voir section 12).</w:t>
+        <w:t>Depuis le 22 juillet 2026, is_admin est un booléen indépendant du rôle principal du compte (colonne users.is_admin, migration 055) plutôt qu'une valeur de role — n'importe quel compte patient ou praticien peut ainsi aussi être administrateur sans perdre son tableau de bord habituel (c'est le cas du compte personnel de la fondatrice, seul compte is_admin = true). Un onglet « Admin » dédié apparaît dans la navbar quand is_admin est vrai, menant à /dashboard/admin. Ce tableau de bord est fonctionnel pour la vérification des praticiens (section 6.15) ; le reste (métriques, modération, reporting) demeure un stub non implémenté (voir section 10).</w:t>
       </w:r>
     </w:p>
     <w:p>
@@ -1182,7 +1182,7 @@
         <w:spacing w:after="160" w:line="300"/>
       </w:pPr>
       <w:r>
-        <w:t xml:space="preserve">ProtectedRoute (src/components/auth/ProtectedRoute.tsx) protège les routes par rôle : redirection vers /login si non connecté, vers / si le rôle ne correspond pas à la route (une route peut accepter un tableau de rôles, par exemple /animal/:id accessible aux patients et aux praticiens). Le rôle admin contourne systématiquement ces vérifications. Un écran « Chargement... » s'affiche tant que loading vaut true.</w:t>
+        <w:t>ProtectedRoute (src/components/auth/ProtectedRoute.tsx) protège les routes par rôle : redirection vers /login si non connecté, vers / si le rôle ne correspond pas à la route (une route peut accepter un tableau de rôles, par exemple /animal/:id accessible aux patients et aux praticiens). Un compte avec is_admin = true contourne systématiquement ces vérifications, quel que soit son rôle principal (voir section 2.3). Un écran « Chargement... » s'affiche tant que loading vaut true.</w:t>
       </w:r>
     </w:p>
     <w:p>
@@ -6823,6 +6823,19 @@
       </w:pPr>
       <w:r>
         <w:t xml:space="preserve">Résolu le 22 juillet 2026 : l'espace secrétariat rattachait un accès «Espace secrétariat» à un compte praticien/patient/admin existant lorsque l'email invité correspondait à un compte déjà créé (simple lien ajouté à la navbar, sans nouveaux identifiants) — perçu comme un onglet du dashboard praticien plutôt qu'un espace réellement séparé. L'Edge Function invite-clinic-secretary refuse désormais tout email déjà utilisé par un autre compte Animéaux et crée systématiquement un compte dédié (role secretary, identifiants propres) ; le raccourci de navbar bolt-on est retiré, useMyClinicStaffInfo et la route /dashboard/secretariat sont restreints au rôle secretary.</w:t>
+      </w:r>
+    </w:p>
+    <w:p>
+      <w:pPr>
+        <w:pStyle w:val="ListParagraph"/>
+        <w:numPr>
+          <w:ilvl w:val="0"/>
+          <w:numId w:val="2"/>
+        </w:numPr>
+        <w:spacing w:after="100"/>
+      </w:pPr>
+      <w:r>
+        <w:t xml:space="preserve">Résolu le 22 juillet 2026 : mettre un compte personnel en role = 'admin' pour lui donner accès au tableau de bord admin lui faisait perdre son tableau de bord habituel (role est une valeur unique, incompatible avec 'patient'). is_admin est désormais une colonne booléenne indépendante sur users (migration 055) : is_admin() et get_my_user_data() la lisent directement, ProtectedRoute contourne les vérifications de rôle sur is_admin plutôt que sur role = 'admin'.</w:t>
       </w:r>
     </w:p>
     <w:sectPr>

</xml_diff>

<commit_message>
Cahier des charges v1.10 : documente l'espace admin complet
Section 10 réécrite (vue d'ensemble, 3 onglets, dossiers praticiens).

Co-Authored-By: Claude Sonnet 5 <noreply@anthropic.com>
</commit_message>
<xml_diff>
--- a/cahier_des_charges_animeaux.docx
+++ b/cahier_des_charges_animeaux.docx
@@ -58,7 +58,7 @@
           <w:sz w:val="22"/>
           <w:szCs w:val="22"/>
         </w:rPr>
-        <w:t>Version 1.9 — document mis à jour avec les évolutions de juillet 2026 (vérification des praticiens par documents, correctif critique inscriptions, espace secrétariat en compte dédié, statut administrateur découplé du rôle)</w:t>
+        <w:t>Version 1.10 — document mis à jour avec les évolutions de juillet 2026 (vérification des praticiens par documents, correctif critique inscriptions, espace secrétariat en compte dédié, statut administrateur découplé du rôle, tableau de bord admin complet)</w:t>
       </w:r>
     </w:p>
     <w:p>
@@ -4862,7 +4862,7 @@
         <w:spacing w:after="160" w:line="300"/>
       </w:pPr>
       <w:r>
-        <w:t xml:space="preserve">Depuis le 21 juillet 2026, la section « Praticiens à vérifier » est pleinement fonctionnelle (le reste du tableau de bord — cartes de métriques, modération, reporting — demeure un stub non implémenté). Elle liste, via la RPC admin_list_pending_doctors(), tous les praticiens au statut verification_status = 'pending' avec leurs documents déposés, et propose deux actions : Valider (RPC admin_review_doctor avec p_approve=true) et Rejeter (idem avec un motif optionnel, visible par le praticien). Les deux RPC sont SECURITY DEFINER et vérifient is_admin() côté serveur, indépendamment de ce qu'envoie le client. Accès réservé de fait : le rôle admin ne peut être attribué que manuellement en base (UPDATE direct sur users.role), aucun parcours d'inscription ne permet de l'obtenir soi-même. Point d'attention : l'introduction de ce statut a rendu 'pending' par défaut tous les praticiens déjà inscrits avant cette date (aucun n'avait de statut de vérification formel auparavant) — ils ont donc temporairement disparu des résultats de recherche jusqu'à validation manuelle a posteriori par un administrateur.</w:t>
+        <w:t>Depuis le 22 juillet 2026, le tableau de bord admin est complet : une rangée de cartes de statistiques générales (propriétaires, praticiens par statut de vérification, secrétariats, cabinets, rendez-vous, avis — RPC admin_platform_stats()), puis trois onglets Praticiens (En attente / Validés / Rejetés) alimentés par admin_list_doctors_by_status(p_status), qui retourne pour chaque praticien son profil complet et ses documents justificatifs quel que soit son statut — contrairement à admin_list_pending_doctors() (toujours utilisée pour l'onglet En attente), qui reste restreinte aux dossiers en attente. Une recherche par nom, email ou spécialité est disponible sur les onglets Validés et Rejetés. Les actions Valider et Rejeter (RPC admin_review_doctor) sont accessibles depuis n'importe quel onglet, ce qui permet de corriger une décision a posteriori (ex. re-valider un dossier rejeté par erreur). Modération et reporting avancé demeurent hors périmètre. Toutes les RPC sont SECURITY DEFINER et vérifient is_admin() côté serveur, indépendamment de ce qu'envoie le client. Accès réservé de fait : is_admin ne peut être activé que manuellement en base (UPDATE direct sur users.is_admin, voir section 2.3) ; il n'a plus de lien avec le role du compte depuis la migration 055, un compte is_admin étant en pratique dédié à l'administration (LoginPage redirige directement vers /dashboard/admin, la navbar masque le lien vers un dashboard propriétaire d'animal — voir section 3.5). Point d'attention historique : l'introduction du statut de vérification le 21 juillet 2026 a rendu 'pending' par défaut tous les praticiens déjà inscrits avant cette date (aucun n'avait de statut de vérification formel auparavant) — ils ont donc temporairement disparu des résultats de recherche jusqu'à validation manuelle a posteriori par un administrateur.</w:t>
       </w:r>
     </w:p>
     <w:p>

</xml_diff>

<commit_message>
Cahier des charges v1.11 : documente les dossiers praticiens cliquables et les graphiques admin
Co-Authored-By: Claude Sonnet 5 <noreply@anthropic.com>
</commit_message>
<xml_diff>
--- a/cahier_des_charges_animeaux.docx
+++ b/cahier_des_charges_animeaux.docx
@@ -58,7 +58,7 @@
           <w:sz w:val="22"/>
           <w:szCs w:val="22"/>
         </w:rPr>
-        <w:t>Version 1.10 — document mis à jour avec les évolutions de juillet 2026 (vérification des praticiens par documents, correctif critique inscriptions, espace secrétariat en compte dédié, statut administrateur découplé du rôle, tableau de bord admin complet)</w:t>
+        <w:t>Version 1.11 — document mis à jour avec les évolutions de juillet 2026 (vérification des praticiens par documents, correctif critique inscriptions, espace secrétariat en compte dédié, statut administrateur découplé du rôle, tableau de bord admin complet avec dossiers praticiens et graphiques)</w:t>
       </w:r>
     </w:p>
     <w:p>
@@ -4862,7 +4862,7 @@
         <w:spacing w:after="160" w:line="300"/>
       </w:pPr>
       <w:r>
-        <w:t>Depuis le 22 juillet 2026, le tableau de bord admin est complet : une rangée de cartes de statistiques générales (propriétaires, praticiens par statut de vérification, secrétariats, cabinets, rendez-vous, avis — RPC admin_platform_stats()), puis trois onglets Praticiens (En attente / Validés / Rejetés) alimentés par admin_list_doctors_by_status(p_status), qui retourne pour chaque praticien son profil complet et ses documents justificatifs quel que soit son statut — contrairement à admin_list_pending_doctors() (toujours utilisée pour l'onglet En attente), qui reste restreinte aux dossiers en attente. Une recherche par nom, email ou spécialité est disponible sur les onglets Validés et Rejetés. Les actions Valider et Rejeter (RPC admin_review_doctor) sont accessibles depuis n'importe quel onglet, ce qui permet de corriger une décision a posteriori (ex. re-valider un dossier rejeté par erreur). Modération et reporting avancé demeurent hors périmètre. Toutes les RPC sont SECURITY DEFINER et vérifient is_admin() côté serveur, indépendamment de ce qu'envoie le client. Accès réservé de fait : is_admin ne peut être activé que manuellement en base (UPDATE direct sur users.is_admin, voir section 2.3) ; il n'a plus de lien avec le role du compte depuis la migration 055, un compte is_admin étant en pratique dédié à l'administration (LoginPage redirige directement vers /dashboard/admin, la navbar masque le lien vers un dashboard propriétaire d'animal — voir section 3.5). Point d'attention historique : l'introduction du statut de vérification le 21 juillet 2026 a rendu 'pending' par défaut tous les praticiens déjà inscrits avant cette date (aucun n'avait de statut de vérification formel auparavant) — ils ont donc temporairement disparu des résultats de recherche jusqu'à validation manuelle a posteriori par un administrateur.</w:t>
+        <w:t>Depuis le 22 juillet 2026, le tableau de bord admin est complet. Vue d'ensemble : une rangée de cartes de statistiques générales (propriétaires, praticiens par statut de vérification, secrétariats, cabinets, rendez-vous, avis), puis trois graphiques Recharts — évolution des inscriptions praticiens/propriétaires sur 8 semaines, répartition des praticiens par statut de vérification (donut), rendez-vous par statut (barres) — alimentés par admin_platform_stats(). Trois onglets Praticiens (En attente / Validés / Rejetés) listent chaque praticien via admin_list_doctors_by_status(p_status) (profil résumé + documents, quel que soit le statut, contrairement à admin_list_pending_doctors() qui reste restreinte aux dossiers en attente et alimente toujours l'onglet En attente). Une recherche par nom, email ou spécialité est disponible sur les onglets Validés et Rejetés. Cliquer sur un praticien ouvre sa fiche complète (/dashboard/admin?doctor=&lt;id&gt;, RPC admin_doctor_detail) : coordonnées (email, téléphone, adresse), cabinet d'appartenance, n° RPPS, tarif de consultation, espèces acceptées, déplacement à domicile, biographie, statistiques de rendez-vous détaillées (total, à venir, terminés, annulés, note moyenne), documents justificatifs, et actions Valider/Rejeter/Contacter (lien mailto) — disponibles depuis n'importe quel statut, ce qui permet de corriger une décision a posteriori. Modération et reporting avancé demeurent hors périmètre. Toutes les RPC sont SECURITY DEFINER et vérifient is_admin() côté serveur, indépendamment de ce qu'envoie le client. Accès réservé de fait : is_admin ne peut être activé que manuellement en base (UPDATE direct sur users.is_admin, voir section 2.3) ; il n'a plus de lien avec le role du compte depuis la migration 055, un compte is_admin étant en pratique dédié à l'administration (LoginPage redirige directement vers /dashboard/admin, la navbar masque le lien vers un dashboard propriétaire d'animal — voir section 3.5). Point d'attention historique : l'introduction du statut de vérification le 21 juillet 2026 a rendu 'pending' par défaut tous les praticiens déjà inscrits avant cette date (aucun n'avait de statut de vérification formel auparavant) — ils ont donc temporairement disparu des résultats de recherche jusqu'à validation manuelle a posteriori par un administrateur.</w:t>
       </w:r>
     </w:p>
     <w:p>

</xml_diff>

<commit_message>
Cahier des charges v1.12 : documente la gestion des avis dans l'espace admin
Co-Authored-By: Claude Sonnet 5 <noreply@anthropic.com>
</commit_message>
<xml_diff>
--- a/cahier_des_charges_animeaux.docx
+++ b/cahier_des_charges_animeaux.docx
@@ -58,7 +58,7 @@
           <w:sz w:val="22"/>
           <w:szCs w:val="22"/>
         </w:rPr>
-        <w:t>Version 1.11 — document mis à jour avec les évolutions de juillet 2026 (vérification des praticiens par documents, correctif critique inscriptions, espace secrétariat en compte dédié, statut administrateur découplé du rôle, tableau de bord admin complet avec dossiers praticiens et graphiques)</w:t>
+        <w:t>Version 1.12 — document mis à jour avec les évolutions de juillet 2026 (vérification des praticiens par documents, correctif critique inscriptions, espace secrétariat en compte dédié, statut administrateur découplé du rôle, tableau de bord admin complet avec dossiers praticiens, graphiques et gestion des avis)</w:t>
       </w:r>
     </w:p>
     <w:p>
@@ -4862,7 +4862,7 @@
         <w:spacing w:after="160" w:line="300"/>
       </w:pPr>
       <w:r>
-        <w:t>Depuis le 22 juillet 2026, le tableau de bord admin est complet. Vue d'ensemble : une rangée de cartes de statistiques générales (propriétaires, praticiens par statut de vérification, secrétariats, cabinets, rendez-vous, avis), puis trois graphiques Recharts — évolution des inscriptions praticiens/propriétaires sur 8 semaines, répartition des praticiens par statut de vérification (donut), rendez-vous par statut (barres) — alimentés par admin_platform_stats(). Trois onglets Praticiens (En attente / Validés / Rejetés) listent chaque praticien via admin_list_doctors_by_status(p_status) (profil résumé + documents, quel que soit le statut, contrairement à admin_list_pending_doctors() qui reste restreinte aux dossiers en attente et alimente toujours l'onglet En attente). Une recherche par nom, email ou spécialité est disponible sur les onglets Validés et Rejetés. Cliquer sur un praticien ouvre sa fiche complète (/dashboard/admin?doctor=&lt;id&gt;, RPC admin_doctor_detail) : coordonnées (email, téléphone, adresse), cabinet d'appartenance, n° RPPS, tarif de consultation, espèces acceptées, déplacement à domicile, biographie, statistiques de rendez-vous détaillées (total, à venir, terminés, annulés, note moyenne), documents justificatifs, et actions Valider/Rejeter/Contacter (lien mailto) — disponibles depuis n'importe quel statut, ce qui permet de corriger une décision a posteriori. Modération et reporting avancé demeurent hors périmètre. Toutes les RPC sont SECURITY DEFINER et vérifient is_admin() côté serveur, indépendamment de ce qu'envoie le client. Accès réservé de fait : is_admin ne peut être activé que manuellement en base (UPDATE direct sur users.is_admin, voir section 2.3) ; il n'a plus de lien avec le role du compte depuis la migration 055, un compte is_admin étant en pratique dédié à l'administration (LoginPage redirige directement vers /dashboard/admin, la navbar masque le lien vers un dashboard propriétaire d'animal — voir section 3.5). Point d'attention historique : l'introduction du statut de vérification le 21 juillet 2026 a rendu 'pending' par défaut tous les praticiens déjà inscrits avant cette date (aucun n'avait de statut de vérification formel auparavant) — ils ont donc temporairement disparu des résultats de recherche jusqu'à validation manuelle a posteriori par un administrateur.</w:t>
+        <w:t>Depuis le 22 juillet 2026, le tableau de bord admin est complet. Vue d'ensemble : une rangée de cartes de statistiques générales (propriétaires, praticiens par statut de vérification, secrétariats, cabinets, rendez-vous, avis), puis trois graphiques Recharts — évolution des inscriptions praticiens/propriétaires sur 8 semaines, répartition des praticiens par statut de vérification (donut), rendez-vous par statut (barres) — alimentés par admin_platform_stats(). Trois onglets Praticiens (En attente / Validés / Rejetés) listent chaque praticien via admin_list_doctors_by_status(p_status) (profil résumé + documents, quel que soit le statut, contrairement à admin_list_pending_doctors() qui reste restreinte aux dossiers en attente et alimente toujours l'onglet En attente). Une recherche par nom, email ou spécialité est disponible sur les onglets Validés et Rejetés. Cliquer sur un praticien ouvre sa fiche complète (/dashboard/admin?doctor=&lt;id&gt;, RPC admin_doctor_detail) : coordonnées (email, téléphone, adresse), cabinet d'appartenance, n° RPPS, tarif de consultation, espèces acceptées, déplacement à domicile, biographie, statistiques de rendez-vous détaillées (total, à venir, terminés, annulés, note moyenne), documents justificatifs, et actions Valider/Rejeter/Contacter (lien mailto) — disponibles depuis n'importe quel statut, ce qui permet de corriger une décision a posteriori. Modération et reporting avancé demeurent hors périmètre. La carte « Avis publiés » de la vue d'ensemble est cliquable (/dashboard/admin?view=reviews, RPC admin_list_reviews) : liste de tous les avis de la plateforme avec le praticien et le propriétaire associés, filtre rapide « Négatifs (≤2★) », filtre par note, tri (date, note), recherche libre, et mise en évidence visuelle des avis à 1-2 étoiles. Toutes les RPC sont SECURITY DEFINER et vérifient is_admin() côté serveur, indépendamment de ce qu'envoie le client. Accès réservé de fait : is_admin ne peut être activé que manuellement en base (UPDATE direct sur users.is_admin, voir section 2.3) ; il n'a plus de lien avec le role du compte depuis la migration 055, un compte is_admin étant en pratique dédié à l'administration (LoginPage redirige directement vers /dashboard/admin, la navbar masque le lien vers un dashboard propriétaire d'animal — voir section 3.5). Point d'attention historique : l'introduction du statut de vérification le 21 juillet 2026 a rendu 'pending' par défaut tous les praticiens déjà inscrits avant cette date (aucun n'avait de statut de vérification formel auparavant) — ils ont donc temporairement disparu des résultats de recherche jusqu'à validation manuelle a posteriori par un administrateur.</w:t>
       </w:r>
     </w:p>
     <w:p>

</xml_diff>

<commit_message>
Cahier des charges v1.13 : documente les profils propriétaires dans l'espace admin
Co-Authored-By: Claude Sonnet 5 <noreply@anthropic.com>
</commit_message>
<xml_diff>
--- a/cahier_des_charges_animeaux.docx
+++ b/cahier_des_charges_animeaux.docx
@@ -58,7 +58,7 @@
           <w:sz w:val="22"/>
           <w:szCs w:val="22"/>
         </w:rPr>
-        <w:t>Version 1.12 — document mis à jour avec les évolutions de juillet 2026 (vérification des praticiens par documents, correctif critique inscriptions, espace secrétariat en compte dédié, statut administrateur découplé du rôle, tableau de bord admin complet avec dossiers praticiens, graphiques et gestion des avis)</w:t>
+        <w:t>Version 1.13 — document mis à jour avec les évolutions de juillet 2026 (vérification des praticiens par documents, correctif critique inscriptions, espace secrétariat en compte dédié, statut administrateur découplé du rôle, tableau de bord admin complet avec dossiers praticiens et patients, graphiques et gestion des avis)</w:t>
       </w:r>
     </w:p>
     <w:p>
@@ -4862,7 +4862,7 @@
         <w:spacing w:after="160" w:line="300"/>
       </w:pPr>
       <w:r>
-        <w:t>Depuis le 22 juillet 2026, le tableau de bord admin est complet. Vue d'ensemble : une rangée de cartes de statistiques générales (propriétaires, praticiens par statut de vérification, secrétariats, cabinets, rendez-vous, avis), puis trois graphiques Recharts — évolution des inscriptions praticiens/propriétaires sur 8 semaines, répartition des praticiens par statut de vérification (donut), rendez-vous par statut (barres) — alimentés par admin_platform_stats(). Trois onglets Praticiens (En attente / Validés / Rejetés) listent chaque praticien via admin_list_doctors_by_status(p_status) (profil résumé + documents, quel que soit le statut, contrairement à admin_list_pending_doctors() qui reste restreinte aux dossiers en attente et alimente toujours l'onglet En attente). Une recherche par nom, email ou spécialité est disponible sur les onglets Validés et Rejetés. Cliquer sur un praticien ouvre sa fiche complète (/dashboard/admin?doctor=&lt;id&gt;, RPC admin_doctor_detail) : coordonnées (email, téléphone, adresse), cabinet d'appartenance, n° RPPS, tarif de consultation, espèces acceptées, déplacement à domicile, biographie, statistiques de rendez-vous détaillées (total, à venir, terminés, annulés, note moyenne), documents justificatifs, et actions Valider/Rejeter/Contacter (lien mailto) — disponibles depuis n'importe quel statut, ce qui permet de corriger une décision a posteriori. Modération et reporting avancé demeurent hors périmètre. La carte « Avis publiés » de la vue d'ensemble est cliquable (/dashboard/admin?view=reviews, RPC admin_list_reviews) : liste de tous les avis de la plateforme avec le praticien et le propriétaire associés, filtre rapide « Négatifs (≤2★) », filtre par note, tri (date, note), recherche libre, et mise en évidence visuelle des avis à 1-2 étoiles. Toutes les RPC sont SECURITY DEFINER et vérifient is_admin() côté serveur, indépendamment de ce qu'envoie le client. Accès réservé de fait : is_admin ne peut être activé que manuellement en base (UPDATE direct sur users.is_admin, voir section 2.3) ; il n'a plus de lien avec le role du compte depuis la migration 055, un compte is_admin étant en pratique dédié à l'administration (LoginPage redirige directement vers /dashboard/admin, la navbar masque le lien vers un dashboard propriétaire d'animal — voir section 3.5). Point d'attention historique : l'introduction du statut de vérification le 21 juillet 2026 a rendu 'pending' par défaut tous les praticiens déjà inscrits avant cette date (aucun n'avait de statut de vérification formel auparavant) — ils ont donc temporairement disparu des résultats de recherche jusqu'à validation manuelle a posteriori par un administrateur.</w:t>
+        <w:t>Depuis le 22 juillet 2026, le tableau de bord admin est complet. Vue d'ensemble : une rangée de cartes de statistiques générales (propriétaires, praticiens par statut de vérification, secrétariats, cabinets, rendez-vous, avis), puis trois graphiques Recharts — évolution des inscriptions praticiens/propriétaires sur 8 semaines, répartition des praticiens par statut de vérification (donut), rendez-vous par statut (barres) — alimentés par admin_platform_stats(). Trois onglets Praticiens (En attente / Validés / Rejetés) listent chaque praticien via admin_list_doctors_by_status(p_status) (profil résumé + documents, quel que soit le statut, contrairement à admin_list_pending_doctors() qui reste restreinte aux dossiers en attente et alimente toujours l'onglet En attente). Une recherche par nom, email ou spécialité est disponible sur les onglets Validés et Rejetés. Cliquer sur un praticien ouvre sa fiche complète (/dashboard/admin?doctor=&lt;id&gt;, RPC admin_doctor_detail) : coordonnées (email, téléphone, adresse), cabinet d'appartenance, n° RPPS, tarif de consultation, espèces acceptées, déplacement à domicile, biographie, statistiques de rendez-vous détaillées (total, à venir, terminés, annulés, note moyenne), documents justificatifs, et actions Valider/Rejeter/Contacter (lien mailto) — disponibles depuis n'importe quel statut, ce qui permet de corriger une décision a posteriori. Modération et reporting avancé demeurent hors périmètre. La carte « Avis publiés » de la vue d'ensemble est cliquable (/dashboard/admin?view=reviews, RPC admin_list_reviews) : liste de tous les avis de la plateforme avec le praticien et le propriétaire associés, filtre rapide « Négatifs (≤2★) », filtre par note, tri (date, note), recherche libre, et mise en évidence visuelle des avis à 1-2 étoiles. La carte « Propriétaires » est elle aussi cliquable (/dashboard/admin?view=patients, RPC admin_list_patients) : liste recherchable de tous les comptes patient, chacun ouvrant une fiche détaillée (/dashboard/admin?patient=&lt;id&gt;, RPC admin_patient_detail — coordonnées, animaux, statistiques de rendez-vous, avis rédigés, contact). Profils patients et praticiens sont ainsi tous deux consultables depuis l'espace admin. Toutes les RPC sont SECURITY DEFINER et vérifient is_admin() côté serveur, indépendamment de ce qu'envoie le client. Accès réservé de fait : is_admin ne peut être activé que manuellement en base (UPDATE direct sur users.is_admin, voir section 2.3) ; il n'a plus de lien avec le role du compte depuis la migration 055, un compte is_admin étant en pratique dédié à l'administration (LoginPage redirige directement vers /dashboard/admin, la navbar masque le lien vers un dashboard propriétaire d'animal — voir section 3.5). Point d'attention historique : l'introduction du statut de vérification le 21 juillet 2026 a rendu 'pending' par défaut tous les praticiens déjà inscrits avant cette date (aucun n'avait de statut de vérification formel auparavant) — ils ont donc temporairement disparu des résultats de recherche jusqu'à validation manuelle a posteriori par un administrateur.</w:t>
       </w:r>
     </w:p>
     <w:p>

</xml_diff>

<commit_message>
Cahier des charges v1.14 : documente les dossiers cabinets dans l'espace admin
Co-Authored-By: Claude Sonnet 5 <noreply@anthropic.com>
</commit_message>
<xml_diff>
--- a/cahier_des_charges_animeaux.docx
+++ b/cahier_des_charges_animeaux.docx
@@ -58,7 +58,7 @@
           <w:sz w:val="22"/>
           <w:szCs w:val="22"/>
         </w:rPr>
-        <w:t>Version 1.13 — document mis à jour avec les évolutions de juillet 2026 (vérification des praticiens par documents, correctif critique inscriptions, espace secrétariat en compte dédié, statut administrateur découplé du rôle, tableau de bord admin complet avec dossiers praticiens et patients, graphiques et gestion des avis)</w:t>
+        <w:t>Version 1.14 — document mis à jour avec les évolutions de juillet 2026 (vérification des praticiens par documents, correctif critique inscriptions, espace secrétariat en compte dédié, statut administrateur découplé du rôle, tableau de bord admin complet avec dossiers praticiens/propriétaires/cabinets, graphiques et gestion des avis)</w:t>
       </w:r>
     </w:p>
     <w:p>
@@ -4862,7 +4862,7 @@
         <w:spacing w:after="160" w:line="300"/>
       </w:pPr>
       <w:r>
-        <w:t>Depuis le 22 juillet 2026, le tableau de bord admin est complet. Vue d'ensemble : une rangée de cartes de statistiques générales (propriétaires, praticiens par statut de vérification, secrétariats, cabinets, rendez-vous, avis), puis trois graphiques Recharts — évolution des inscriptions praticiens/propriétaires sur 8 semaines, répartition des praticiens par statut de vérification (donut), rendez-vous par statut (barres) — alimentés par admin_platform_stats(). Trois onglets Praticiens (En attente / Validés / Rejetés) listent chaque praticien via admin_list_doctors_by_status(p_status) (profil résumé + documents, quel que soit le statut, contrairement à admin_list_pending_doctors() qui reste restreinte aux dossiers en attente et alimente toujours l'onglet En attente). Une recherche par nom, email ou spécialité est disponible sur les onglets Validés et Rejetés. Cliquer sur un praticien ouvre sa fiche complète (/dashboard/admin?doctor=&lt;id&gt;, RPC admin_doctor_detail) : coordonnées (email, téléphone, adresse), cabinet d'appartenance, n° RPPS, tarif de consultation, espèces acceptées, déplacement à domicile, biographie, statistiques de rendez-vous détaillées (total, à venir, terminés, annulés, note moyenne), documents justificatifs, et actions Valider/Rejeter/Contacter (lien mailto) — disponibles depuis n'importe quel statut, ce qui permet de corriger une décision a posteriori. Modération et reporting avancé demeurent hors périmètre. La carte « Avis publiés » de la vue d'ensemble est cliquable (/dashboard/admin?view=reviews, RPC admin_list_reviews) : liste de tous les avis de la plateforme avec le praticien et le propriétaire associés, filtre rapide « Négatifs (≤2★) », filtre par note, tri (date, note), recherche libre, et mise en évidence visuelle des avis à 1-2 étoiles. La carte « Propriétaires » est elle aussi cliquable (/dashboard/admin?view=patients, RPC admin_list_patients) : liste recherchable de tous les comptes patient, chacun ouvrant une fiche détaillée (/dashboard/admin?patient=&lt;id&gt;, RPC admin_patient_detail — coordonnées, animaux, statistiques de rendez-vous, avis rédigés, contact). Profils patients et praticiens sont ainsi tous deux consultables depuis l'espace admin. Toutes les RPC sont SECURITY DEFINER et vérifient is_admin() côté serveur, indépendamment de ce qu'envoie le client. Accès réservé de fait : is_admin ne peut être activé que manuellement en base (UPDATE direct sur users.is_admin, voir section 2.3) ; il n'a plus de lien avec le role du compte depuis la migration 055, un compte is_admin étant en pratique dédié à l'administration (LoginPage redirige directement vers /dashboard/admin, la navbar masque le lien vers un dashboard propriétaire d'animal — voir section 3.5). Point d'attention historique : l'introduction du statut de vérification le 21 juillet 2026 a rendu 'pending' par défaut tous les praticiens déjà inscrits avant cette date (aucun n'avait de statut de vérification formel auparavant) — ils ont donc temporairement disparu des résultats de recherche jusqu'à validation manuelle a posteriori par un administrateur.</w:t>
+        <w:t>Depuis le 22 juillet 2026, le tableau de bord admin est complet. Vue d'ensemble : une rangée de cartes de statistiques générales (propriétaires, praticiens par statut de vérification, secrétariats, cabinets, rendez-vous, avis), puis trois graphiques Recharts — évolution des inscriptions praticiens/propriétaires sur 8 semaines, répartition des praticiens par statut de vérification (donut), rendez-vous par statut (barres) — alimentés par admin_platform_stats(). Trois onglets Praticiens (En attente / Validés / Rejetés) listent chaque praticien via admin_list_doctors_by_status(p_status) (profil résumé + documents, quel que soit le statut, contrairement à admin_list_pending_doctors() qui reste restreinte aux dossiers en attente et alimente toujours l'onglet En attente). Une recherche par nom, email ou spécialité est disponible sur les onglets Validés et Rejetés. Cliquer sur un praticien ouvre sa fiche complète (/dashboard/admin?doctor=&lt;id&gt;, RPC admin_doctor_detail) : coordonnées (email, téléphone, adresse), cabinet d'appartenance, n° RPPS, tarif de consultation, espèces acceptées, déplacement à domicile, biographie, statistiques de rendez-vous détaillées (total, à venir, terminés, annulés, note moyenne), documents justificatifs, et actions Valider/Rejeter/Contacter (lien mailto) — disponibles depuis n'importe quel statut, ce qui permet de corriger une décision a posteriori. Modération et reporting avancé demeurent hors périmètre. La carte « Avis publiés » de la vue d'ensemble est cliquable (/dashboard/admin?view=reviews, RPC admin_list_reviews) : liste de tous les avis de la plateforme avec le praticien et le propriétaire associés, filtre rapide « Négatifs (≤2★) », filtre par note, tri (date, note), recherche libre, et mise en évidence visuelle des avis à 1-2 étoiles. La carte « Propriétaires » est elle aussi cliquable (/dashboard/admin?view=patients, RPC admin_list_patients) : liste recherchable de tous les comptes patient, chacun ouvrant une fiche détaillée (/dashboard/admin?patient=&lt;id&gt;, RPC admin_patient_detail — coordonnées, animaux, statistiques de rendez-vous, avis rédigés, contact). Profils patients et praticiens sont ainsi tous deux consultables depuis l'espace admin. Enfin, la carte « Cabinets » est cliquable elle aussi (/dashboard/admin?view=clinics, RPC admin_list_clinics) : liste recherchable de tous les cabinets, chacun ouvrant une fiche détaillée (/dashboard/admin?clinic=&lt;id&gt;, RPC admin_clinic_detail — coordonnées, propriétaire, praticiens membres avec leur statut de vérification et un lien direct vers leur propre dossier, comptes secrétariat rattachés, nombre de rendez-vous). Les trois types de profils de la plateforme — praticiens, propriétaires d'animaux, cabinets — sont ainsi tous consultables depuis l'espace admin. Toutes les RPC sont SECURITY DEFINER et vérifient is_admin() côté serveur, indépendamment de ce qu'envoie le client. Accès réservé de fait : is_admin ne peut être activé que manuellement en base (UPDATE direct sur users.is_admin, voir section 2.3) ; il n'a plus de lien avec le role du compte depuis la migration 055, un compte is_admin étant en pratique dédié à l'administration (LoginPage redirige directement vers /dashboard/admin, la navbar masque le lien vers un dashboard propriétaire d'animal — voir section 3.5). Point d'attention historique : l'introduction du statut de vérification le 21 juillet 2026 a rendu 'pending' par défaut tous les praticiens déjà inscrits avant cette date (aucun n'avait de statut de vérification formel auparavant) — ils ont donc temporairement disparu des résultats de recherche jusqu'à validation manuelle a posteriori par un administrateur.</w:t>
       </w:r>
     </w:p>
     <w:p>

</xml_diff>

<commit_message>
Cahier des charges v1.15 : documente les cartes praticiens cliquables
Co-Authored-By: Claude Sonnet 5 <noreply@anthropic.com>
</commit_message>
<xml_diff>
--- a/cahier_des_charges_animeaux.docx
+++ b/cahier_des_charges_animeaux.docx
@@ -58,7 +58,7 @@
           <w:sz w:val="22"/>
           <w:szCs w:val="22"/>
         </w:rPr>
-        <w:t>Version 1.14 — document mis à jour avec les évolutions de juillet 2026 (vérification des praticiens par documents, correctif critique inscriptions, espace secrétariat en compte dédié, statut administrateur découplé du rôle, tableau de bord admin complet avec dossiers praticiens/propriétaires/cabinets, graphiques et gestion des avis)</w:t>
+        <w:t>Version 1.15 — document mis à jour avec les évolutions de juillet 2026 (vérification des praticiens par documents, correctif critique inscriptions, espace secrétariat en compte dédié, statut administrateur découplé du rôle, tableau de bord admin complet avec dossiers praticiens/propriétaires/cabinets, graphiques et gestion des avis)</w:t>
       </w:r>
     </w:p>
     <w:p>
@@ -4862,7 +4862,7 @@
         <w:spacing w:after="160" w:line="300"/>
       </w:pPr>
       <w:r>
-        <w:t>Depuis le 22 juillet 2026, le tableau de bord admin est complet. Vue d'ensemble : une rangée de cartes de statistiques générales (propriétaires, praticiens par statut de vérification, secrétariats, cabinets, rendez-vous, avis), puis trois graphiques Recharts — évolution des inscriptions praticiens/propriétaires sur 8 semaines, répartition des praticiens par statut de vérification (donut), rendez-vous par statut (barres) — alimentés par admin_platform_stats(). Trois onglets Praticiens (En attente / Validés / Rejetés) listent chaque praticien via admin_list_doctors_by_status(p_status) (profil résumé + documents, quel que soit le statut, contrairement à admin_list_pending_doctors() qui reste restreinte aux dossiers en attente et alimente toujours l'onglet En attente). Une recherche par nom, email ou spécialité est disponible sur les onglets Validés et Rejetés. Cliquer sur un praticien ouvre sa fiche complète (/dashboard/admin?doctor=&lt;id&gt;, RPC admin_doctor_detail) : coordonnées (email, téléphone, adresse), cabinet d'appartenance, n° RPPS, tarif de consultation, espèces acceptées, déplacement à domicile, biographie, statistiques de rendez-vous détaillées (total, à venir, terminés, annulés, note moyenne), documents justificatifs, et actions Valider/Rejeter/Contacter (lien mailto) — disponibles depuis n'importe quel statut, ce qui permet de corriger une décision a posteriori. Modération et reporting avancé demeurent hors périmètre. La carte « Avis publiés » de la vue d'ensemble est cliquable (/dashboard/admin?view=reviews, RPC admin_list_reviews) : liste de tous les avis de la plateforme avec le praticien et le propriétaire associés, filtre rapide « Négatifs (≤2★) », filtre par note, tri (date, note), recherche libre, et mise en évidence visuelle des avis à 1-2 étoiles. La carte « Propriétaires » est elle aussi cliquable (/dashboard/admin?view=patients, RPC admin_list_patients) : liste recherchable de tous les comptes patient, chacun ouvrant une fiche détaillée (/dashboard/admin?patient=&lt;id&gt;, RPC admin_patient_detail — coordonnées, animaux, statistiques de rendez-vous, avis rédigés, contact). Profils patients et praticiens sont ainsi tous deux consultables depuis l'espace admin. Enfin, la carte « Cabinets » est cliquable elle aussi (/dashboard/admin?view=clinics, RPC admin_list_clinics) : liste recherchable de tous les cabinets, chacun ouvrant une fiche détaillée (/dashboard/admin?clinic=&lt;id&gt;, RPC admin_clinic_detail — coordonnées, propriétaire, praticiens membres avec leur statut de vérification et un lien direct vers leur propre dossier, comptes secrétariat rattachés, nombre de rendez-vous). Les trois types de profils de la plateforme — praticiens, propriétaires d'animaux, cabinets — sont ainsi tous consultables depuis l'espace admin. Toutes les RPC sont SECURITY DEFINER et vérifient is_admin() côté serveur, indépendamment de ce qu'envoie le client. Accès réservé de fait : is_admin ne peut être activé que manuellement en base (UPDATE direct sur users.is_admin, voir section 2.3) ; il n'a plus de lien avec le role du compte depuis la migration 055, un compte is_admin étant en pratique dédié à l'administration (LoginPage redirige directement vers /dashboard/admin, la navbar masque le lien vers un dashboard propriétaire d'animal — voir section 3.5). Point d'attention historique : l'introduction du statut de vérification le 21 juillet 2026 a rendu 'pending' par défaut tous les praticiens déjà inscrits avant cette date (aucun n'avait de statut de vérification formel auparavant) — ils ont donc temporairement disparu des résultats de recherche jusqu'à validation manuelle a posteriori par un administrateur.</w:t>
+        <w:t>Depuis le 22 juillet 2026, le tableau de bord admin est complet. Vue d'ensemble : une rangée de cartes de statistiques générales (propriétaires, praticiens par statut de vérification, secrétariats, cabinets, rendez-vous, avis), puis trois graphiques Recharts — évolution des inscriptions praticiens/propriétaires sur 8 semaines, répartition des praticiens par statut de vérification (donut), rendez-vous par statut (barres) — alimentés par admin_platform_stats(). Trois onglets Praticiens (En attente / Validés / Rejetés) listent chaque praticien via admin_list_doctors_by_status(p_status) (profil résumé + documents, quel que soit le statut, contrairement à admin_list_pending_doctors() qui reste restreinte aux dossiers en attente et alimente toujours l'onglet En attente). Une recherche par nom, email ou spécialité est disponible sur les onglets Validés et Rejetés. Cliquer sur un praticien ouvre sa fiche complète (/dashboard/admin?doctor=&lt;id&gt;, RPC admin_doctor_detail) : coordonnées (email, téléphone, adresse), cabinet d'appartenance, n° RPPS, tarif de consultation, espèces acceptées, déplacement à domicile, biographie, statistiques de rendez-vous détaillées (total, à venir, terminés, annulés, note moyenne), documents justificatifs, et actions Valider/Rejeter/Contacter (lien mailto) — disponibles depuis n'importe quel statut, ce qui permet de corriger une décision a posteriori. Modération et reporting avancé demeurent hors périmètre. La carte « Avis publiés » de la vue d'ensemble est cliquable (/dashboard/admin?view=reviews, RPC admin_list_reviews) : liste de tous les avis de la plateforme avec le praticien et le propriétaire associés, filtre rapide « Négatifs (≤2★) », filtre par note, tri (date, note), recherche libre, et mise en évidence visuelle des avis à 1-2 étoiles. La carte « Propriétaires » est elle aussi cliquable (/dashboard/admin?view=patients, RPC admin_list_patients) : liste recherchable de tous les comptes patient, chacun ouvrant une fiche détaillée (/dashboard/admin?patient=&lt;id&gt;, RPC admin_patient_detail — coordonnées, animaux, statistiques de rendez-vous, avis rédigés, contact). Profils patients et praticiens sont ainsi tous deux consultables depuis l'espace admin. Enfin, la carte « Cabinets » est cliquable elle aussi (/dashboard/admin?view=clinics, RPC admin_list_clinics) : liste recherchable de tous les cabinets, chacun ouvrant une fiche détaillée (/dashboard/admin?clinic=&lt;id&gt;, RPC admin_clinic_detail — coordonnées, propriétaire, praticiens membres avec leur statut de vérification et un lien direct vers leur propre dossier, comptes secrétariat rattachés, nombre de rendez-vous). Les trois types de profils de la plateforme — praticiens, propriétaires d'animaux, cabinets — sont ainsi tous consultables depuis l'espace admin. Les cartes « Praticiens vérifiés / en attente / rejetés » de la vue d'ensemble sont elles aussi cliquables : chacune fait défiler la page vers la section des dossiers praticiens en sélectionnant l'onglet correspondant. Toutes les RPC sont SECURITY DEFINER et vérifient is_admin() côté serveur, indépendamment de ce qu'envoie le client. Accès réservé de fait : is_admin ne peut être activé que manuellement en base (UPDATE direct sur users.is_admin, voir section 2.3) ; il n'a plus de lien avec le role du compte depuis la migration 055, un compte is_admin étant en pratique dédié à l'administration (LoginPage redirige directement vers /dashboard/admin, la navbar masque le lien vers un dashboard propriétaire d'animal — voir section 3.5). Point d'attention historique : l'introduction du statut de vérification le 21 juillet 2026 a rendu 'pending' par défaut tous les praticiens déjà inscrits avant cette date (aucun n'avait de statut de vérification formel auparavant) — ils ont donc temporairement disparu des résultats de recherche jusqu'à validation manuelle a posteriori par un administrateur.</w:t>
       </w:r>
     </w:p>
     <w:p>

</xml_diff>

<commit_message>
Cahier des charges v1.16 : documente les cartes secrétariats et RDV cliquables
Co-Authored-By: Claude Sonnet 5 <noreply@anthropic.com>
</commit_message>
<xml_diff>
--- a/cahier_des_charges_animeaux.docx
+++ b/cahier_des_charges_animeaux.docx
@@ -58,7 +58,7 @@
           <w:sz w:val="22"/>
           <w:szCs w:val="22"/>
         </w:rPr>
-        <w:t>Version 1.15 — document mis à jour avec les évolutions de juillet 2026 (vérification des praticiens par documents, correctif critique inscriptions, espace secrétariat en compte dédié, statut administrateur découplé du rôle, tableau de bord admin complet avec dossiers praticiens/propriétaires/cabinets, graphiques et gestion des avis)</w:t>
+        <w:t>Version 1.16 — document mis à jour avec les évolutions de juillet 2026 (vérification des praticiens par documents, correctif critique inscriptions, espace secrétariat en compte dédié, statut administrateur découplé du rôle, tableau de bord admin complet avec toutes les cartes cliquables : dossiers praticiens/propriétaires/cabinets/secrétariats, rendez-vous, graphiques et gestion des avis)</w:t>
       </w:r>
     </w:p>
     <w:p>
@@ -4862,7 +4862,7 @@
         <w:spacing w:after="160" w:line="300"/>
       </w:pPr>
       <w:r>
-        <w:t>Depuis le 22 juillet 2026, le tableau de bord admin est complet. Vue d'ensemble : une rangée de cartes de statistiques générales (propriétaires, praticiens par statut de vérification, secrétariats, cabinets, rendez-vous, avis), puis trois graphiques Recharts — évolution des inscriptions praticiens/propriétaires sur 8 semaines, répartition des praticiens par statut de vérification (donut), rendez-vous par statut (barres) — alimentés par admin_platform_stats(). Trois onglets Praticiens (En attente / Validés / Rejetés) listent chaque praticien via admin_list_doctors_by_status(p_status) (profil résumé + documents, quel que soit le statut, contrairement à admin_list_pending_doctors() qui reste restreinte aux dossiers en attente et alimente toujours l'onglet En attente). Une recherche par nom, email ou spécialité est disponible sur les onglets Validés et Rejetés. Cliquer sur un praticien ouvre sa fiche complète (/dashboard/admin?doctor=&lt;id&gt;, RPC admin_doctor_detail) : coordonnées (email, téléphone, adresse), cabinet d'appartenance, n° RPPS, tarif de consultation, espèces acceptées, déplacement à domicile, biographie, statistiques de rendez-vous détaillées (total, à venir, terminés, annulés, note moyenne), documents justificatifs, et actions Valider/Rejeter/Contacter (lien mailto) — disponibles depuis n'importe quel statut, ce qui permet de corriger une décision a posteriori. Modération et reporting avancé demeurent hors périmètre. La carte « Avis publiés » de la vue d'ensemble est cliquable (/dashboard/admin?view=reviews, RPC admin_list_reviews) : liste de tous les avis de la plateforme avec le praticien et le propriétaire associés, filtre rapide « Négatifs (≤2★) », filtre par note, tri (date, note), recherche libre, et mise en évidence visuelle des avis à 1-2 étoiles. La carte « Propriétaires » est elle aussi cliquable (/dashboard/admin?view=patients, RPC admin_list_patients) : liste recherchable de tous les comptes patient, chacun ouvrant une fiche détaillée (/dashboard/admin?patient=&lt;id&gt;, RPC admin_patient_detail — coordonnées, animaux, statistiques de rendez-vous, avis rédigés, contact). Profils patients et praticiens sont ainsi tous deux consultables depuis l'espace admin. Enfin, la carte « Cabinets » est cliquable elle aussi (/dashboard/admin?view=clinics, RPC admin_list_clinics) : liste recherchable de tous les cabinets, chacun ouvrant une fiche détaillée (/dashboard/admin?clinic=&lt;id&gt;, RPC admin_clinic_detail — coordonnées, propriétaire, praticiens membres avec leur statut de vérification et un lien direct vers leur propre dossier, comptes secrétariat rattachés, nombre de rendez-vous). Les trois types de profils de la plateforme — praticiens, propriétaires d'animaux, cabinets — sont ainsi tous consultables depuis l'espace admin. Les cartes « Praticiens vérifiés / en attente / rejetés » de la vue d'ensemble sont elles aussi cliquables : chacune fait défiler la page vers la section des dossiers praticiens en sélectionnant l'onglet correspondant. Toutes les RPC sont SECURITY DEFINER et vérifient is_admin() côté serveur, indépendamment de ce qu'envoie le client. Accès réservé de fait : is_admin ne peut être activé que manuellement en base (UPDATE direct sur users.is_admin, voir section 2.3) ; il n'a plus de lien avec le role du compte depuis la migration 055, un compte is_admin étant en pratique dédié à l'administration (LoginPage redirige directement vers /dashboard/admin, la navbar masque le lien vers un dashboard propriétaire d'animal — voir section 3.5). Point d'attention historique : l'introduction du statut de vérification le 21 juillet 2026 a rendu 'pending' par défaut tous les praticiens déjà inscrits avant cette date (aucun n'avait de statut de vérification formel auparavant) — ils ont donc temporairement disparu des résultats de recherche jusqu'à validation manuelle a posteriori par un administrateur.</w:t>
+        <w:t>Depuis le 22 juillet 2026, le tableau de bord admin est complet. Vue d'ensemble : une rangée de cartes de statistiques générales (propriétaires, praticiens par statut de vérification, secrétariats, cabinets, rendez-vous, avis), puis trois graphiques Recharts — évolution des inscriptions praticiens/propriétaires sur 8 semaines, répartition des praticiens par statut de vérification (donut), rendez-vous par statut (barres) — alimentés par admin_platform_stats(). Trois onglets Praticiens (En attente / Validés / Rejetés) listent chaque praticien via admin_list_doctors_by_status(p_status) (profil résumé + documents, quel que soit le statut, contrairement à admin_list_pending_doctors() qui reste restreinte aux dossiers en attente et alimente toujours l'onglet En attente). Une recherche par nom, email ou spécialité est disponible sur les onglets Validés et Rejetés. Cliquer sur un praticien ouvre sa fiche complète (/dashboard/admin?doctor=&lt;id&gt;, RPC admin_doctor_detail) : coordonnées (email, téléphone, adresse), cabinet d'appartenance, n° RPPS, tarif de consultation, espèces acceptées, déplacement à domicile, biographie, statistiques de rendez-vous détaillées (total, à venir, terminés, annulés, note moyenne), documents justificatifs, et actions Valider/Rejeter/Contacter (lien mailto) — disponibles depuis n'importe quel statut, ce qui permet de corriger une décision a posteriori. Modération et reporting avancé demeurent hors périmètre. La carte « Avis publiés » de la vue d'ensemble est cliquable (/dashboard/admin?view=reviews, RPC admin_list_reviews) : liste de tous les avis de la plateforme avec le praticien et le propriétaire associés, filtre rapide « Négatifs (≤2★) », filtre par note, tri (date, note), recherche libre, et mise en évidence visuelle des avis à 1-2 étoiles. La carte « Propriétaires » est elle aussi cliquable (/dashboard/admin?view=patients, RPC admin_list_patients) : liste recherchable de tous les comptes patient, chacun ouvrant une fiche détaillée (/dashboard/admin?patient=&lt;id&gt;, RPC admin_patient_detail — coordonnées, animaux, statistiques de rendez-vous, avis rédigés, contact). Profils patients et praticiens sont ainsi tous deux consultables depuis l'espace admin. Enfin, la carte « Cabinets » est cliquable elle aussi (/dashboard/admin?view=clinics, RPC admin_list_clinics) : liste recherchable de tous les cabinets, chacun ouvrant une fiche détaillée (/dashboard/admin?clinic=&lt;id&gt;, RPC admin_clinic_detail — coordonnées, propriétaire, praticiens membres avec leur statut de vérification et un lien direct vers leur propre dossier, comptes secrétariat rattachés, nombre de rendez-vous). Les trois types de profils de la plateforme — praticiens, propriétaires d'animaux, cabinets — sont ainsi tous consultables depuis l'espace admin. Les deux dernières cartes sont désormais cliquables elles aussi : « Secrétariats » (RPC admin_list_secretaries) liste tous les comptes secrétariat, chacun renvoyant vers la fiche de son cabinet ; « RDV à venir » et « RDV au total » (RPC admin_list_appointments, plafonnée aux 500 rendez-vous les plus récents) ouvrent une liste filtrable par statut avec recherche par praticien ou propriétaire. Toutes les cartes de la vue d'ensemble mènent donc désormais à un dossier ou une liste détaillée. Les cartes « Praticiens vérifiés / en attente / rejetés » de la vue d'ensemble sont elles aussi cliquables : chacune fait défiler la page vers la section des dossiers praticiens en sélectionnant l'onglet correspondant. Toutes les RPC sont SECURITY DEFINER et vérifient is_admin() côté serveur, indépendamment de ce qu'envoie le client. Accès réservé de fait : is_admin ne peut être activé que manuellement en base (UPDATE direct sur users.is_admin, voir section 2.3) ; il n'a plus de lien avec le role du compte depuis la migration 055, un compte is_admin étant en pratique dédié à l'administration (LoginPage redirige directement vers /dashboard/admin, la navbar masque le lien vers un dashboard propriétaire d'animal — voir section 3.5). Point d'attention historique : l'introduction du statut de vérification le 21 juillet 2026 a rendu 'pending' par défaut tous les praticiens déjà inscrits avant cette date (aucun n'avait de statut de vérification formel auparavant) — ils ont donc temporairement disparu des résultats de recherche jusqu'à validation manuelle a posteriori par un administrateur.</w:t>
       </w:r>
     </w:p>
     <w:p>

</xml_diff>

<commit_message>
Cahier des charges v1.17 : domaine Resend vérifié, EMAIL_FROM configuré
Documente la résolution du blocage DKIM (clé désynchronisée + _dmarc
mal renseigné dans la zone DNS OVH) et l'ajout du secret EMAIL_FROM.

Co-Authored-By: Claude Sonnet 5 <noreply@anthropic.com>
</commit_message>
<xml_diff>
--- a/cahier_des_charges_animeaux.docx
+++ b/cahier_des_charges_animeaux.docx
@@ -58,7 +58,7 @@
           <w:sz w:val="22"/>
           <w:szCs w:val="22"/>
         </w:rPr>
-        <w:t>Version 1.16 — document mis à jour avec les évolutions de juillet 2026 (vérification des praticiens par documents, correctif critique inscriptions, espace secrétariat en compte dédié, statut administrateur découplé du rôle, tableau de bord admin complet avec toutes les cartes cliquables : dossiers praticiens/propriétaires/cabinets/secrétariats, rendez-vous, graphiques et gestion des avis)</w:t>
+        <w:t>Version 1.17 — document mis à jour avec les évolutions de juillet 2026 (vérification des praticiens par documents, correctif critique inscriptions, espace secrétariat en compte dédié, statut administrateur découplé du rôle, tableau de bord admin complet, domaine d'envoi Resend vérifié)</w:t>
       </w:r>
     </w:p>
     <w:p>
@@ -4845,7 +4845,7 @@
         <w:spacing w:after="160" w:line="300"/>
       </w:pPr>
       <w:r>
-        <w:t xml:space="preserve">Un nom de domaine dédié, monanimeaux.fr (acheté chez OVH le 20 juillet 2026 — animeaux.fr et animeaux.com étant tous deux détenus par des revendeurs tiers à des prix prohibitifs), a été ajouté et configuré sur Resend (DKIM, SPF/MX, DMARC) pour sortir du mode sandbox, qui limitait jusqu'ici l'envoi à la seule adresse du compte Resend. La vérification du domaine était encore en attente (« Pending ») au moment de la rédaction ; une fois validée, la variable EMAIL_FROM devra être ajoutée aux secrets des Edge Functions avec une adresse sur ce domaine (ex. contact@monanimeaux.fr) pour remplacer l'expéditeur par défaut onboarding@resend.dev.</w:t>
+        <w:t>Un nom de domaine dédié, monanimeaux.fr (acheté chez OVH le 20 juillet 2026 — animeaux.fr et animeaux.com étant tous deux détenus par des revendeurs tiers à des prix prohibitifs), a été ajouté et configuré sur Resend (DKIM, SPF/MX, DMARC) pour sortir du mode sandbox, qui limitait jusqu'ici l'envoi à la seule adresse du compte Resend. Le domaine est vérifié depuis le 23 juillet 2026 — un premier essai avait échoué (« Invalid DKIM ») car la valeur TXT resend._domainkey configurée chez OVH ne correspondait pas à la clé attendue par Resend (probablement une clé DKIM régénérée entre l'ajout initial du domaine et la configuration DNS), et le champ _dmarc contenait par erreur la clé DKIM au lieu de v=DMARC1; p=none; — les deux corrigés dans la zone DNS OVH. Le secret EMAIL_FROM a été ajouté aux Edge Functions Supabase (contact@monanimeaux.fr) pour remplacer l'expéditeur par défaut onboarding@resend.dev ; les emails transactionnels (confirmation de rendez-vous, rappels, identifiants secrétariat) peuvent désormais atteindre n'importe quel destinataire, plus seulement l'adresse du compte Resend.</w:t>
       </w:r>
     </w:p>
     <w:p>

</xml_diff>

<commit_message>
Cahier des charges v1.18 : documente l'identifiant de connexion secrétariat généré
Co-Authored-By: Claude Sonnet 5 <noreply@anthropic.com>
</commit_message>
<xml_diff>
--- a/cahier_des_charges_animeaux.docx
+++ b/cahier_des_charges_animeaux.docx
@@ -58,7 +58,7 @@
           <w:sz w:val="22"/>
           <w:szCs w:val="22"/>
         </w:rPr>
-        <w:t>Version 1.17 — document mis à jour avec les évolutions de juillet 2026 (vérification des praticiens par documents, correctif critique inscriptions, espace secrétariat en compte dédié, statut administrateur découplé du rôle, tableau de bord admin complet, domaine d'envoi Resend vérifié)</w:t>
+        <w:t>Version 1.18 — document mis à jour avec les évolutions de juillet 2026 (vérification des praticiens par documents, correctif critique inscriptions, espace secrétariat en compte dédié avec identifiant généré, statut administrateur découplé du rôle, tableau de bord admin complet, domaine d'envoi Resend vérifié)</w:t>
       </w:r>
     </w:p>
     <w:p>
@@ -2466,7 +2466,7 @@
         <w:spacing w:after="160" w:line="300"/>
       </w:pPr>
       <w:r>
-        <w:t xml:space="preserve">La table clinics regroupe plusieurs praticiens sous une même structure (adresse, logo, tarifs et créneaux partagés — voir section 6.6), et clinic_members y rattache les comptes doctor membres. Un accès secrétariat (rôle secretary) est distinct : la table clinic_staff associe un compte secretary à un cabinet. Depuis le 22 juillet 2026, cet accès est toujours un compte dédié avec ses propres identifiants, créé par le propriétaire du cabinet depuis l'Edge Function invite-clinic-secretary (email déjà utilisé par un autre compte Animéaux = refusé) — jamais un rattachement à un compte praticien ou patient existant, pour que le tableau de bord secrétariat (/dashboard/secretariat) reste un espace réellement séparé plutôt qu'un onglet supplémentaire du dashboard praticien.</w:t>
+        <w:t>La table clinics regroupe plusieurs praticiens sous une même structure (adresse, logo, tarifs et créneaux partagés — voir section 6.6), et clinic_members y rattache les comptes doctor membres. Un accès secrétariat (rôle secretary) est distinct : la table clinic_staff associe un compte secretary à un cabinet. Depuis le 22 juillet 2026, cet accès est toujours un compte dédié avec ses propres identifiants, créé par le propriétaire du cabinet depuis l'Edge Function invite-clinic-secretary — jamais un rattachement à un compte praticien ou patient existant, pour que le tableau de bord secrétariat (/dashboard/secretariat) reste un espace réellement séparé plutôt qu'un onglet supplémentaire du dashboard praticien. Depuis le 23 juillet 2026, l'identifiant de connexion Supabase Auth n'est plus l'email tapé par le praticien mais un code généré (ex. CAB4X9QZ, converti en email synthétique code@secretariat.animeaux.internal en interne) : l'email saisi à l'invitation ne sert plus qu'à l'envoi des identifiants par courrier (jamais à la connexion), ce qui rend le rattachement à un compte existant impossible par construction et évite toute confusion avec un vrai email personnel. Le formulaire /login accepte les deux formats (email ou identifiant généré) dans le même champ.</w:t>
       </w:r>
     </w:p>
     <w:tbl>
@@ -6836,6 +6836,19 @@
       </w:pPr>
       <w:r>
         <w:t xml:space="preserve">Résolu le 22 juillet 2026 : mettre un compte personnel en role = 'admin' pour lui donner accès au tableau de bord admin lui faisait perdre son tableau de bord habituel (role est une valeur unique, incompatible avec 'patient'). is_admin est désormais une colonne booléenne indépendante sur users (migration 055) : is_admin() et get_my_user_data() la lisent directement, ProtectedRoute contourne les vérifications de rôle sur is_admin plutôt que sur role = 'admin'.</w:t>
+      </w:r>
+    </w:p>
+    <w:p>
+      <w:pPr>
+        <w:pStyle w:val="ListParagraph"/>
+        <w:numPr>
+          <w:ilvl w:val="0"/>
+          <w:numId w:val="2"/>
+        </w:numPr>
+        <w:spacing w:after="100"/>
+      </w:pPr>
+      <w:r>
+        <w:t xml:space="preserve">Le 23 juillet 2026, l'identifiant de connexion du compte secrétariat est devenu un code généré (ex. CAB4X9QZ) plutôt que l'email tapé par le praticien à l'invitation : Supabase Auth exige un champ email valide, donc ce code est transformé en email synthétique (code@secretariat.animeaux.internal, domaine non résolvable, jamais utilisé pour un envoi réel) uniquement pour satisfaire cette contrainte technique. L'email réellement saisi par le praticien ne sert plus qu'au routage Resend (destinataire de l'email d'identifiants), plus jamais à l'identité du compte.</w:t>
       </w:r>
     </w:p>
     <w:sectPr>

</xml_diff>

<commit_message>
Cahier des charges v1.19 : documente la carte Leaflet sur la fiche praticien
Co-Authored-By: Claude Sonnet 5 <noreply@anthropic.com>
</commit_message>
<xml_diff>
--- a/cahier_des_charges_animeaux.docx
+++ b/cahier_des_charges_animeaux.docx
@@ -58,7 +58,7 @@
           <w:sz w:val="22"/>
           <w:szCs w:val="22"/>
         </w:rPr>
-        <w:t>Version 1.18 — document mis à jour avec les évolutions de juillet 2026 (vérification des praticiens par documents, correctif critique inscriptions, espace secrétariat en compte dédié avec identifiant généré, statut administrateur découplé du rôle, tableau de bord admin complet, domaine d'envoi Resend vérifié)</w:t>
+        <w:t>Version 1.19 — document mis à jour avec les évolutions de juillet 2026 (vérification des praticiens par documents, correctif critique inscriptions, espace secrétariat en compte dédié, statut administrateur découplé du rôle, tableau de bord admin complet, domaine d'envoi Resend vérifié, carte Leaflet sur la fiche praticien)</w:t>
       </w:r>
     </w:p>
     <w:p>
@@ -4128,7 +4128,7 @@
         <w:spacing w:after="160" w:line="300"/>
       </w:pPr>
       <w:r>
-        <w:t xml:space="preserve">Accessible sans connexion. Affiche l'en-tête (avatar, profession, adresse — celle du cabinet si le praticien en est membre, sinon son adresse personnelle —, note moyenne, badge « Vérifié » le cas échéant), la biographie au format HTML enrichi et sanitisé, un emplacement pour une carte (actuellement un placeholder, la dépendance Leaflet étant installée mais non branchée sur des coordonnées réelles), la liste des avis avec un formulaire de dépôt d'avis (réservé aux patients, sans limite de nombre ni lien obligatoire avec un rendez-vous), et un encart de réservation latéral affichant le tarif et un bouton d'action (redirection vers connexion/inscription si le visiteur n'est pas connecté). Depuis le 21 juillet 2026, un praticien non vérifié affiche « Ce profil n'est pas encore disponible » à tout visiteur autre que le praticien lui-même (cohérent avec son absence des résultats de recherche, voir section 6.15) — sans cette garde, un lien direct aurait pu contourner le filtre de recherche.</w:t>
+        <w:t>Accessible sans connexion. Affiche l'en-tête (avatar, profession, adresse — celle du cabinet si le praticien en est membre, sinon son adresse personnelle —, note moyenne, badge « Vérifié » le cas échéant), la biographie au format HTML enrichi et sanitisé, une carte Leaflet interactive (marqueur, zoom, tuiles OpenStreetMap — src/components/doctor/LocationMap.tsx) affichée quand le praticien a des coordonnées (lat/lng), la liste des avis avec un formulaire de dépôt d'avis (réservé aux patients, sans limite de nombre ni lien obligatoire avec un rendez-vous), et un encart de réservation latéral affichant le tarif et un bouton d'action (redirection vers connexion/inscription si le visiteur n'est pas connecté). Depuis le 21 juillet 2026, un praticien non vérifié affiche « Ce profil n'est pas encore disponible » à tout visiteur autre que le praticien lui-même (cohérent avec son absence des résultats de recherche, voir section 6.15) — sans cette garde, un lien direct aurait pu contourner le filtre de recherche.</w:t>
       </w:r>
     </w:p>
     <w:p>
@@ -6718,7 +6718,7 @@
         <w:spacing w:after="100"/>
       </w:pPr>
       <w:r>
-        <w:t xml:space="preserve">La dépendance à Leaflet (carte) est installée mais non branchée : la fiche praticien affiche un simple emplacement réservé.</w:t>
+        <w:t>Résolu le 23 juillet 2026 : la fiche praticien affiche désormais une vraie carte Leaflet (src/components/doctor/LocationMap.tsx) au lieu du placeholder texte, avec le correctif habituel pour les icônes de marqueur (chemins d'images par défaut de Leaflet non résolus par le bundler Vite — réassignés vers le CDN unpkg).</w:t>
       </w:r>
     </w:p>
     <w:p>

</xml_diff>

<commit_message>
Cahier des charges v1.20 : style de carte praticien mis à jour
Co-Authored-By: Claude Sonnet 5 <noreply@anthropic.com>
</commit_message>
<xml_diff>
--- a/cahier_des_charges_animeaux.docx
+++ b/cahier_des_charges_animeaux.docx
@@ -58,7 +58,7 @@
           <w:sz w:val="22"/>
           <w:szCs w:val="22"/>
         </w:rPr>
-        <w:t>Version 1.19 — document mis à jour avec les évolutions de juillet 2026 (vérification des praticiens par documents, correctif critique inscriptions, espace secrétariat en compte dédié, statut administrateur découplé du rôle, tableau de bord admin complet, domaine d'envoi Resend vérifié, carte Leaflet sur la fiche praticien)</w:t>
+        <w:t>Version 1.20 — document mis à jour avec les évolutions de juillet 2026 (vérification des praticiens par documents, correctif critique inscriptions, espace secrétariat en compte dédié, statut administrateur découplé du rôle, tableau de bord admin complet, domaine d'envoi Resend vérifié, carte Leaflet sur la fiche praticien)</w:t>
       </w:r>
     </w:p>
     <w:p>
@@ -4128,7 +4128,7 @@
         <w:spacing w:after="160" w:line="300"/>
       </w:pPr>
       <w:r>
-        <w:t>Accessible sans connexion. Affiche l'en-tête (avatar, profession, adresse — celle du cabinet si le praticien en est membre, sinon son adresse personnelle —, note moyenne, badge « Vérifié » le cas échéant), la biographie au format HTML enrichi et sanitisé, une carte Leaflet interactive (marqueur, zoom, tuiles OpenStreetMap — src/components/doctor/LocationMap.tsx) affichée quand le praticien a des coordonnées (lat/lng), la liste des avis avec un formulaire de dépôt d'avis (réservé aux patients, sans limite de nombre ni lien obligatoire avec un rendez-vous), et un encart de réservation latéral affichant le tarif et un bouton d'action (redirection vers connexion/inscription si le visiteur n'est pas connecté). Depuis le 21 juillet 2026, un praticien non vérifié affiche « Ce profil n'est pas encore disponible » à tout visiteur autre que le praticien lui-même (cohérent avec son absence des résultats de recherche, voir section 6.15) — sans cette garde, un lien direct aurait pu contourner le filtre de recherche.</w:t>
+        <w:t>Accessible sans connexion. Affiche l'en-tête (avatar, profession, adresse — celle du cabinet si le praticien en est membre, sinon son adresse personnelle —, note moyenne, badge « Vérifié » le cas échéant), la biographie au format HTML enrichi et sanitisé, une carte Leaflet interactive (marqueur en sage-500, zoom, tuiles CARTO Voyager — src/components/doctor/LocationMap.tsx) affichée quand le praticien a des coordonnées (lat/lng), la liste des avis avec un formulaire de dépôt d'avis (réservé aux patients, sans limite de nombre ni lien obligatoire avec un rendez-vous), et un encart de réservation latéral affichant le tarif et un bouton d'action (redirection vers connexion/inscription si le visiteur n'est pas connecté). Depuis le 21 juillet 2026, un praticien non vérifié affiche « Ce profil n'est pas encore disponible » à tout visiteur autre que le praticien lui-même (cohérent avec son absence des résultats de recherche, voir section 6.15) — sans cette garde, un lien direct aurait pu contourner le filtre de recherche.</w:t>
       </w:r>
     </w:p>
     <w:p>

</xml_diff>

<commit_message>
Cahier des charges v1.21 : documente le bug clinics.lat/lng et le géocodage rétroactif
Co-Authored-By: Claude Sonnet 5 <noreply@anthropic.com>
</commit_message>
<xml_diff>
--- a/cahier_des_charges_animeaux.docx
+++ b/cahier_des_charges_animeaux.docx
@@ -58,7 +58,7 @@
           <w:sz w:val="22"/>
           <w:szCs w:val="22"/>
         </w:rPr>
-        <w:t>Version 1.20 — document mis à jour avec les évolutions de juillet 2026 (vérification des praticiens par documents, correctif critique inscriptions, espace secrétariat en compte dédié, statut administrateur découplé du rôle, tableau de bord admin complet, domaine d'envoi Resend vérifié, carte Leaflet sur la fiche praticien)</w:t>
+        <w:t>Version 1.21 — document mis à jour avec les évolutions de juillet 2026 (vérification des praticiens par documents, correctif critique inscriptions, espace secrétariat en compte dédié, statut administrateur découplé du rôle, tableau de bord admin complet, domaine d'envoi Resend vérifié, carte Leaflet sur la fiche praticien avec géocodage des cabinets)</w:t>
       </w:r>
     </w:p>
     <w:p>
@@ -4128,7 +4128,7 @@
         <w:spacing w:after="160" w:line="300"/>
       </w:pPr>
       <w:r>
-        <w:t>Accessible sans connexion. Affiche l'en-tête (avatar, profession, adresse — celle du cabinet si le praticien en est membre, sinon son adresse personnelle —, note moyenne, badge « Vérifié » le cas échéant), la biographie au format HTML enrichi et sanitisé, une carte Leaflet interactive (marqueur en sage-500, zoom, tuiles CARTO Voyager — src/components/doctor/LocationMap.tsx) affichée quand le praticien a des coordonnées (lat/lng), la liste des avis avec un formulaire de dépôt d'avis (réservé aux patients, sans limite de nombre ni lien obligatoire avec un rendez-vous), et un encart de réservation latéral affichant le tarif et un bouton d'action (redirection vers connexion/inscription si le visiteur n'est pas connecté). Depuis le 21 juillet 2026, un praticien non vérifié affiche « Ce profil n'est pas encore disponible » à tout visiteur autre que le praticien lui-même (cohérent avec son absence des résultats de recherche, voir section 6.15) — sans cette garde, un lien direct aurait pu contourner le filtre de recherche.</w:t>
+        <w:t>Accessible sans connexion. Affiche l'en-tête (avatar, profession, adresse — celle du cabinet si le praticien en est membre, sinon son adresse personnelle —, note moyenne, badge « Vérifié » le cas échéant), la biographie au format HTML enrichi et sanitisé, une carte Leaflet interactive (marqueur en sage-500, zoom, tuiles CARTO Voyager — src/components/doctor/LocationMap.tsx) affichée à partir des coordonnées du cabinet si le praticien en est membre, sinon de ses coordonnées personnelles (même bascule que pour l'adresse affichée juste au-dessus), la liste des avis avec un formulaire de dépôt d'avis (réservé aux patients, sans limite de nombre ni lien obligatoire avec un rendez-vous), et un encart de réservation latéral affichant le tarif et un bouton d'action (redirection vers connexion/inscription si le visiteur n'est pas connecté). Depuis le 21 juillet 2026, un praticien non vérifié affiche « Ce profil n'est pas encore disponible » à tout visiteur autre que le praticien lui-même (cohérent avec son absence des résultats de recherche, voir section 6.15) — sans cette garde, un lien direct aurait pu contourner le filtre de recherche.</w:t>
       </w:r>
     </w:p>
     <w:p>
@@ -6719,6 +6719,19 @@
       </w:pPr>
       <w:r>
         <w:t>Résolu le 23 juillet 2026 : la fiche praticien affiche désormais une vraie carte Leaflet (src/components/doctor/LocationMap.tsx) au lieu du placeholder texte, avec le correctif habituel pour les icônes de marqueur (chemins d'images par défaut de Leaflet non résolus par le bundler Vite — réassignés vers le CDN unpkg).</w:t>
+      </w:r>
+    </w:p>
+    <w:p>
+      <w:pPr>
+        <w:pStyle w:val="ListParagraph"/>
+        <w:numPr>
+          <w:ilvl w:val="0"/>
+          <w:numId w:val="2"/>
+        </w:numPr>
+        <w:spacing w:after="100"/>
+      </w:pPr>
+      <w:r>
+        <w:t xml:space="preserve">Résolu le 23 juillet 2026 : les colonnes clinics.lat/lng (migration 038, censée les ajouter et mettre à jour search_clinics/get_clinic_info en conséquence) n'avaient en réalité jamais été appliquées en production — la migration existait dans le code mais n'avait jamais été exécutée. Conséquences en cascade, découvertes en testant la carte praticien : get_doctor_clinic() ne remontait aucune coordonnée pour un cabinet (la carte restait vide pour tout praticien membre d'un cabinet), et "Autour de moi" ne calculait jamais de distance pour les cabinets. Les trois fonctions ont été redéployées, la colonne ajoutée, puis les cabinets/praticiens déjà créés avant ce correctif ont été géocodés rétroactivement à la main (API Adresse gratuite du gouvernement, la même que celle utilisée par geocodeAddress côté client) : toute nouvelle mise à jour de profil déclenche déjà le géocodage automatiquement, seuls les profils jamais resauvegardés depuis l'ajout de cette fonctionnalité restaient concernés.</w:t>
       </w:r>
     </w:p>
     <w:p>

</xml_diff>

<commit_message>
Docs: cahier des charges v1.22 — domaine monanimeaux.fr connecté au site
Le domaine servait jusqu'ici uniquement à l'envoi d'emails (Resend) ;
il pointe désormais aussi vers le site Vercel via un enregistrement
DNS A (nameservers OVH conservés pour ne pas casser DKIM/SPF/DMARC).
</commit_message>
<xml_diff>
--- a/cahier_des_charges_animeaux.docx
+++ b/cahier_des_charges_animeaux.docx
@@ -58,7 +58,7 @@
           <w:sz w:val="22"/>
           <w:szCs w:val="22"/>
         </w:rPr>
-        <w:t>Version 1.21 — document mis à jour avec les évolutions de juillet 2026 (vérification des praticiens par documents, correctif critique inscriptions, espace secrétariat en compte dédié, statut administrateur découplé du rôle, tableau de bord admin complet, domaine d'envoi Resend vérifié, carte Leaflet sur la fiche praticien avec géocodage des cabinets)</w:t>
+        <w:t>Version 1.22 — document mis à jour avec les évolutions de juillet 2026 (vérification des praticiens par documents, correctif critique inscriptions, espace secrétariat en compte dédié, statut administrateur découplé du rôle, tableau de bord admin complet, domaine d'envoi Resend vérifié, carte Leaflet sur la fiche praticien avec géocodage des cabinets, domaine monanimeaux.fr connecté au site)</w:t>
       </w:r>
     </w:p>
     <w:p>
@@ -4846,6 +4846,14 @@
       </w:pPr>
       <w:r>
         <w:t>Un nom de domaine dédié, monanimeaux.fr (acheté chez OVH le 20 juillet 2026 — animeaux.fr et animeaux.com étant tous deux détenus par des revendeurs tiers à des prix prohibitifs), a été ajouté et configuré sur Resend (DKIM, SPF/MX, DMARC) pour sortir du mode sandbox, qui limitait jusqu'ici l'envoi à la seule adresse du compte Resend. Le domaine est vérifié depuis le 23 juillet 2026 — un premier essai avait échoué (« Invalid DKIM ») car la valeur TXT resend._domainkey configurée chez OVH ne correspondait pas à la clé attendue par Resend (probablement une clé DKIM régénérée entre l'ajout initial du domaine et la configuration DNS), et le champ _dmarc contenait par erreur la clé DKIM au lieu de v=DMARC1; p=none; — les deux corrigés dans la zone DNS OVH. Le secret EMAIL_FROM a été ajouté aux Edge Functions Supabase (contact@monanimeaux.fr) pour remplacer l'expéditeur par défaut onboarding@resend.dev ; les emails transactionnels (confirmation de rendez-vous, rappels, identifiants secrétariat) peuvent désormais atteindre n'importe quel destinataire, plus seulement l'adresse du compte Resend.</w:t>
+      </w:r>
+    </w:p>
+    <w:p>
+      <w:pPr>
+        <w:spacing w:after="160" w:line="300"/>
+      </w:pPr>
+      <w:r>
+        <w:t>Mise à jour du 23 juillet 2026 : ce même domaine sert désormais aussi à accéder au site lui-même, en plus de son usage pour l'envoi d'emails — https://monanimeaux.fr affiche maintenant l'application (auparavant uniquement accessible via l'URL par défaut anim-aux-a2qn.vercel.app, qui reste également valide). Acheter un nom de domaine ne le connecte pas automatiquement à Vercel : la connexion a nécessité npx vercel domains add monanimeaux.fr, puis l'ajout d'un enregistrement DNS de type A (@ → 76.76.21.21) dans la zone OVH existante. Le choix a été fait de ne pas changer les serveurs de noms (nameservers) vers ceux de Vercel — cela aurait effacé toute la configuration DNS email déjà en place (DKIM, SPF, DMARC, voir ci-dessus) ; ajouter un simple enregistrement A préserve les autres enregistrements existants. Un ancien enregistrement A par défaut d'OVH (@ → 213.186.33.5) entrait en conflit avec le nouveau et a dû être supprimé dans la zone DNS pour que Vercel valide la configuration. Le certificat SSL (Let's Encrypt) a été généré automatiquement par Vercel quelques minutes après la validation DNS.</w:t>
       </w:r>
     </w:p>
     <w:p>

</xml_diff>

<commit_message>
Docs: cahier des charges v1.23 — modération avancée admin
Documente les signalements, la suppression d'avis, la suspension de
compte et le journal d'actions admin ajoutés en migration 063.
</commit_message>
<xml_diff>
--- a/cahier_des_charges_animeaux.docx
+++ b/cahier_des_charges_animeaux.docx
@@ -58,7 +58,7 @@
           <w:sz w:val="22"/>
           <w:szCs w:val="22"/>
         </w:rPr>
-        <w:t>Version 1.22 — document mis à jour avec les évolutions de juillet 2026 (vérification des praticiens par documents, correctif critique inscriptions, espace secrétariat en compte dédié, statut administrateur découplé du rôle, tableau de bord admin complet, domaine d'envoi Resend vérifié, carte Leaflet sur la fiche praticien avec géocodage des cabinets, domaine monanimeaux.fr connecté au site)</w:t>
+        <w:t>Version 1.23 — document mis à jour avec les évolutions de juillet 2026 (vérification des praticiens par documents, correctif critique inscriptions, espace secrétariat en compte dédié, statut administrateur découplé du rôle, tableau de bord admin complet, domaine d'envoi Resend vérifié, carte Leaflet sur la fiche praticien avec géocodage des cabinets, domaine monanimeaux.fr connecté au site, modération avancée admin)</w:t>
       </w:r>
     </w:p>
     <w:p>
@@ -4870,7 +4870,15 @@
         <w:spacing w:after="160" w:line="300"/>
       </w:pPr>
       <w:r>
-        <w:t>Depuis le 22 juillet 2026, le tableau de bord admin est complet. Vue d'ensemble : une rangée de cartes de statistiques générales (propriétaires, praticiens par statut de vérification, secrétariats, cabinets, rendez-vous, avis), puis trois graphiques Recharts — évolution des inscriptions praticiens/propriétaires sur 8 semaines, répartition des praticiens par statut de vérification (donut), rendez-vous par statut (barres) — alimentés par admin_platform_stats(). Trois onglets Praticiens (En attente / Validés / Rejetés) listent chaque praticien via admin_list_doctors_by_status(p_status) (profil résumé + documents, quel que soit le statut, contrairement à admin_list_pending_doctors() qui reste restreinte aux dossiers en attente et alimente toujours l'onglet En attente). Une recherche par nom, email ou spécialité est disponible sur les onglets Validés et Rejetés. Cliquer sur un praticien ouvre sa fiche complète (/dashboard/admin?doctor=&lt;id&gt;, RPC admin_doctor_detail) : coordonnées (email, téléphone, adresse), cabinet d'appartenance, n° RPPS, tarif de consultation, espèces acceptées, déplacement à domicile, biographie, statistiques de rendez-vous détaillées (total, à venir, terminés, annulés, note moyenne), documents justificatifs, et actions Valider/Rejeter/Contacter (lien mailto) — disponibles depuis n'importe quel statut, ce qui permet de corriger une décision a posteriori. Modération et reporting avancé demeurent hors périmètre. La carte « Avis publiés » de la vue d'ensemble est cliquable (/dashboard/admin?view=reviews, RPC admin_list_reviews) : liste de tous les avis de la plateforme avec le praticien et le propriétaire associés, filtre rapide « Négatifs (≤2★) », filtre par note, tri (date, note), recherche libre, et mise en évidence visuelle des avis à 1-2 étoiles. La carte « Propriétaires » est elle aussi cliquable (/dashboard/admin?view=patients, RPC admin_list_patients) : liste recherchable de tous les comptes patient, chacun ouvrant une fiche détaillée (/dashboard/admin?patient=&lt;id&gt;, RPC admin_patient_detail — coordonnées, animaux, statistiques de rendez-vous, avis rédigés, contact). Profils patients et praticiens sont ainsi tous deux consultables depuis l'espace admin. Enfin, la carte « Cabinets » est cliquable elle aussi (/dashboard/admin?view=clinics, RPC admin_list_clinics) : liste recherchable de tous les cabinets, chacun ouvrant une fiche détaillée (/dashboard/admin?clinic=&lt;id&gt;, RPC admin_clinic_detail — coordonnées, propriétaire, praticiens membres avec leur statut de vérification et un lien direct vers leur propre dossier, comptes secrétariat rattachés, nombre de rendez-vous). Les trois types de profils de la plateforme — praticiens, propriétaires d'animaux, cabinets — sont ainsi tous consultables depuis l'espace admin. Les deux dernières cartes sont désormais cliquables elles aussi : « Secrétariats » (RPC admin_list_secretaries) liste tous les comptes secrétariat, chacun renvoyant vers la fiche de son cabinet ; « RDV à venir » et « RDV au total » (RPC admin_list_appointments, plafonnée aux 500 rendez-vous les plus récents) ouvrent une liste filtrable par statut avec recherche par praticien ou propriétaire. Toutes les cartes de la vue d'ensemble mènent donc désormais à un dossier ou une liste détaillée. Les cartes « Praticiens vérifiés / en attente / rejetés » de la vue d'ensemble sont elles aussi cliquables : chacune fait défiler la page vers la section des dossiers praticiens en sélectionnant l'onglet correspondant. Toutes les RPC sont SECURITY DEFINER et vérifient is_admin() côté serveur, indépendamment de ce qu'envoie le client. Accès réservé de fait : is_admin ne peut être activé que manuellement en base (UPDATE direct sur users.is_admin, voir section 2.3) ; il n'a plus de lien avec le role du compte depuis la migration 055, un compte is_admin étant en pratique dédié à l'administration (LoginPage redirige directement vers /dashboard/admin, la navbar masque le lien vers un dashboard propriétaire d'animal — voir section 3.5). Point d'attention historique : l'introduction du statut de vérification le 21 juillet 2026 a rendu 'pending' par défaut tous les praticiens déjà inscrits avant cette date (aucun n'avait de statut de vérification formel auparavant) — ils ont donc temporairement disparu des résultats de recherche jusqu'à validation manuelle a posteriori par un administrateur.</w:t>
+        <w:t>Depuis le 22 juillet 2026, le tableau de bord admin est complet. Vue d'ensemble : une rangée de cartes de statistiques générales (propriétaires, praticiens par statut de vérification, secrétariats, cabinets, rendez-vous, avis), puis trois graphiques Recharts — évolution des inscriptions praticiens/propriétaires sur 8 semaines, répartition des praticiens par statut de vérification (donut), rendez-vous par statut (barres) — alimentés par admin_platform_stats(). Trois onglets Praticiens (En attente / Validés / Rejetés) listent chaque praticien via admin_list_doctors_by_status(p_status) (profil résumé + documents, quel que soit le statut, contrairement à admin_list_pending_doctors() qui reste restreinte aux dossiers en attente et alimente toujours l'onglet En attente). Une recherche par nom, email ou spécialité est disponible sur les onglets Validés et Rejetés. Cliquer sur un praticien ouvre sa fiche complète (/dashboard/admin?doctor=&lt;id&gt;, RPC admin_doctor_detail) : coordonnées (email, téléphone, adresse), cabinet d'appartenance, n° RPPS, tarif de consultation, espèces acceptées, déplacement à domicile, biographie, statistiques de rendez-vous détaillées (total, à venir, terminés, annulés, note moyenne), documents justificatifs, et actions Valider/Rejeter/Contacter (lien mailto) — disponibles depuis n'importe quel statut, ce qui permet de corriger une décision a posteriori. Modération et reporting avancé : voir mise à jour du 23 juillet 2026 ci-dessous. La carte « Avis publiés » de la vue d'ensemble est cliquable (/dashboard/admin?view=reviews, RPC admin_list_reviews) : liste de tous les avis de la plateforme avec le praticien et le propriétaire associés, filtre rapide « Négatifs (≤2★) », filtre par note, tri (date, note), recherche libre, et mise en évidence visuelle des avis à 1-2 étoiles. La carte « Propriétaires » est elle aussi cliquable (/dashboard/admin?view=patients, RPC admin_list_patients) : liste recherchable de tous les comptes patient, chacun ouvrant une fiche détaillée (/dashboard/admin?patient=&lt;id&gt;, RPC admin_patient_detail — coordonnées, animaux, statistiques de rendez-vous, avis rédigés, contact). Profils patients et praticiens sont ainsi tous deux consultables depuis l'espace admin. Enfin, la carte « Cabinets » est cliquable elle aussi (/dashboard/admin?view=clinics, RPC admin_list_clinics) : liste recherchable de tous les cabinets, chacun ouvrant une fiche détaillée (/dashboard/admin?clinic=&lt;id&gt;, RPC admin_clinic_detail — coordonnées, propriétaire, praticiens membres avec leur statut de vérification et un lien direct vers leur propre dossier, comptes secrétariat rattachés, nombre de rendez-vous). Les trois types de profils de la plateforme — praticiens, propriétaires d'animaux, cabinets — sont ainsi tous consultables depuis l'espace admin. Les deux dernières cartes sont désormais cliquables elles aussi : « Secrétariats » (RPC admin_list_secretaries) liste tous les comptes secrétariat, chacun renvoyant vers la fiche de son cabinet ; « RDV à venir » et « RDV au total » (RPC admin_list_appointments, plafonnée aux 500 rendez-vous les plus récents) ouvrent une liste filtrable par statut avec recherche par praticien ou propriétaire. Toutes les cartes de la vue d'ensemble mènent donc désormais à un dossier ou une liste détaillée. Les cartes « Praticiens vérifiés / en attente / rejetés » de la vue d'ensemble sont elles aussi cliquables : chacune fait défiler la page vers la section des dossiers praticiens en sélectionnant l'onglet correspondant. Toutes les RPC sont SECURITY DEFINER et vérifient is_admin() côté serveur, indépendamment de ce qu'envoie le client. Accès réservé de fait : is_admin ne peut être activé que manuellement en base (UPDATE direct sur users.is_admin, voir section 2.3) ; il n'a plus de lien avec le role du compte depuis la migration 055, un compte is_admin étant en pratique dédié à l'administration (LoginPage redirige directement vers /dashboard/admin, la navbar masque le lien vers un dashboard propriétaire d'animal — voir section 3.5). Point d'attention historique : l'introduction du statut de vérification le 21 juillet 2026 a rendu 'pending' par défaut tous les praticiens déjà inscrits avant cette date (aucun n'avait de statut de vérification formel auparavant) — ils ont donc temporairement disparu des résultats de recherche jusqu'à validation manuelle a posteriori par un administrateur.</w:t>
+      </w:r>
+    </w:p>
+    <w:p>
+      <w:pPr>
+        <w:spacing w:after="160" w:line="300"/>
+      </w:pPr>
+      <w:r>
+        <w:t>Mise à jour du 23 juillet 2026 : modération avancée ajoutée (migration 063). Tout utilisateur connecté peut signaler un avis (lien discret sous chaque avis) ou un praticien (lien en bas de la sidebar de prise de RDV) via create_report(), en indiquant un motif libre. Une nouvelle carte « Signalements en attente » sur la vue d'ensemble (mise en évidence en rouge si non nulle) ouvre /dashboard/admin?view=reports (RPC admin_list_reports) : liste triée signalements en attente d'abord, avec aperçu de la cible (note et commentaire pour un avis, nom et spécialité pour un praticien), nom du signalant, et actions « Traité » / « Rejeter le signalement » (RPC admin_resolve_report, avec note admin optionnelle non visible des utilisateurs). Depuis la vue « Avis publiés », chaque avis peut désormais être supprimé définitivement (RPC admin_delete_review) — la moyenne et le nombre d'avis du praticien sont recalculés manuellement dans la fonction, le trigger trg_update_rating existant ne couvrant que insert/update, jamais delete. Les fiches praticien et propriétaire ont chacune un bouton Suspendre/Réactiver le compte (RPC admin_suspend_user / admin_unsuspend_user, avec motif optionnel) : un compte suspendu (users.is_suspended) est déconnecté de force dès la prochaine vérification de session (App.tsx à l'hydratation, ou immédiatement si la suspension survient pendant la tentative de connexion elle-même dans LoginPage.tsx) et redirigé vers /login avec le motif affiché ; impossible de suspendre son propre compte admin. Enfin, un journal d'actions admin (table admin_actions_log, lien discret « Journal d'actions admin » sous les cartes de la vue d'ensemble, RPC admin_list_actions_log plafonnée aux 300 entrées les plus récentes) trace qui a supprimé un avis, suspendu/réactivé un compte, ou traité un signalement, et quand — utile si plusieurs personnes obtiennent un jour un accès admin. Les tables reports et admin_actions_log ont RLS activé sans aucune policy cliente : tout accès passe exclusivement par des RPC SECURITY DEFINER vérifiant is_admin(), même principe que le reste de l'espace admin.</w:t>
       </w:r>
     </w:p>
     <w:p>

</xml_diff>

<commit_message>
Docs: cahier des charges v1.24 — correctif captcha Turnstile sur monanimeaux.fr
Documente le blocage du widget Cloudflare Turnstile sur le domaine
personnalisé (hostname jamais ajouté à la liste autorisée) et son
correctif côté dashboard Cloudflare.
</commit_message>
<xml_diff>
--- a/cahier_des_charges_animeaux.docx
+++ b/cahier_des_charges_animeaux.docx
@@ -58,7 +58,7 @@
           <w:sz w:val="22"/>
           <w:szCs w:val="22"/>
         </w:rPr>
-        <w:t>Version 1.23 — document mis à jour avec les évolutions de juillet 2026 (vérification des praticiens par documents, correctif critique inscriptions, espace secrétariat en compte dédié, statut administrateur découplé du rôle, tableau de bord admin complet, domaine d'envoi Resend vérifié, carte Leaflet sur la fiche praticien avec géocodage des cabinets, domaine monanimeaux.fr connecté au site, modération avancée admin)</w:t>
+        <w:t>Version 1.24 — document mis à jour avec les évolutions de juillet 2026 (vérification des praticiens par documents, correctif critique inscriptions, espace secrétariat en compte dédié, statut administrateur découplé du rôle, tableau de bord admin complet, domaine d'envoi Resend vérifié, carte Leaflet sur la fiche praticien avec géocodage des cabinets, domaine monanimeaux.fr connecté au site, modération avancée admin, correctif captcha Turnstile sur le domaine personnalisé)</w:t>
       </w:r>
     </w:p>
     <w:p>
@@ -4854,6 +4854,14 @@
       </w:pPr>
       <w:r>
         <w:t>Mise à jour du 23 juillet 2026 : ce même domaine sert désormais aussi à accéder au site lui-même, en plus de son usage pour l'envoi d'emails — https://monanimeaux.fr affiche maintenant l'application (auparavant uniquement accessible via l'URL par défaut anim-aux-a2qn.vercel.app, qui reste également valide). Acheter un nom de domaine ne le connecte pas automatiquement à Vercel : la connexion a nécessité npx vercel domains add monanimeaux.fr, puis l'ajout d'un enregistrement DNS de type A (@ → 76.76.21.21) dans la zone OVH existante. Le choix a été fait de ne pas changer les serveurs de noms (nameservers) vers ceux de Vercel — cela aurait effacé toute la configuration DNS email déjà en place (DKIM, SPF, DMARC, voir ci-dessus) ; ajouter un simple enregistrement A préserve les autres enregistrements existants. Un ancien enregistrement A par défaut d'OVH (@ → 213.186.33.5) entrait en conflit avec le nouveau et a dû être supprimé dans la zone DNS pour que Vercel valide la configuration. Le certificat SSL (Let's Encrypt) a été généré automatiquement par Vercel quelques minutes après la validation DNS.</w:t>
+      </w:r>
+    </w:p>
+    <w:p>
+      <w:pPr>
+        <w:spacing w:after="160" w:line="300"/>
+      </w:pPr>
+      <w:r>
+        <w:t>Complément du 23 juillet 2026 : après la connexion du domaine, le captcha Cloudflare Turnstile (formulaires de connexion/inscription, composant src/components/ui/Turnstile.tsx) restait bloqué spécifiquement sur monanimeaux.fr, alors que le DNS et le certificat SSL fonctionnaient correctement (vérifié : dig depuis 4 résolveurs différents ne renvoyait qu'un seul enregistrement A, et curl confirmait un HTTP 200 systématique). Cause : Turnstile restreint chaque clé de site à une liste de noms d'hôte autorisés, configurée dans le dashboard Cloudflare (Application security &gt; Turnstile) — le widget "Animéaux" n'avait que localhost et anim-aux-a2qn.vercel.app dans sa liste, jamais mise à jour lors de l'ajout du domaine personnalisé. Corrigé en ajoutant monanimeaux.fr à la liste des hostnames autorisés du widget (aucun redéploiement nécessaire, la vérification se fait côté Cloudflare à chaque chargement).</w:t>
       </w:r>
     </w:p>
     <w:p>

</xml_diff>

<commit_message>
Docs: cahier des charges v1.25 — messagerie en temps réel
Documente le remplacement du polling 5s par Supabase Realtime sur
la table messages (migration 064).
</commit_message>
<xml_diff>
--- a/cahier_des_charges_animeaux.docx
+++ b/cahier_des_charges_animeaux.docx
@@ -58,7 +58,7 @@
           <w:sz w:val="22"/>
           <w:szCs w:val="22"/>
         </w:rPr>
-        <w:t>Version 1.24 — document mis à jour avec les évolutions de juillet 2026 (vérification des praticiens par documents, correctif critique inscriptions, espace secrétariat en compte dédié, statut administrateur découplé du rôle, tableau de bord admin complet, domaine d'envoi Resend vérifié, carte Leaflet sur la fiche praticien avec géocodage des cabinets, domaine monanimeaux.fr connecté au site, modération avancée admin, correctif captcha Turnstile sur le domaine personnalisé)</w:t>
+        <w:t>Version 1.25 — document mis à jour avec les évolutions de juillet 2026 (vérification des praticiens par documents, correctif critique inscriptions, espace secrétariat en compte dédié, statut administrateur découplé du rôle, tableau de bord admin complet, domaine d'envoi Resend vérifié, carte Leaflet sur la fiche praticien avec géocodage des cabinets, domaine monanimeaux.fr connecté au site, modération avancée admin, correctif captcha Turnstile sur le domaine personnalisé, messagerie en temps réel)</w:t>
       </w:r>
     </w:p>
     <w:p>
@@ -4760,7 +4760,15 @@
         <w:spacing w:after="160" w:line="300"/>
       </w:pPr>
       <w:r>
-        <w:t xml:space="preserve">La messagerie relie un patient à un praticien. La création d'une nouvelle conversation (« Nouveau message ») est restreinte aux praticiens avec lesquels le patient a déjà eu un rendez-vous passé — impossible de contacter un praticien jamais consulté. Les conversations peuvent être masquées individuellement (stockage localStorage par utilisateur, clé animeaux-hidden-conversations-${userId}) : le masquage est purement côté client, aucun message n'est jamais supprimé de la base ; une conversation masquée réapparaît automatiquement dès qu'un nouveau message y est reçu (comparaison de l'horodatage de masquage avec last_message_at). Le rafraîchissement de la conversation active se fait par polling toutes les 5 secondes (useConversation) ; une souscription temps réel gère par ailleurs l'arrivée de nouveaux messages.</w:t>
+        <w:t>La messagerie relie un patient à un praticien. La création d'une nouvelle conversation (« Nouveau message ») est restreinte aux praticiens avec lesquels le patient a déjà eu un rendez-vous passé — impossible de contacter un praticien jamais consulté. Les conversations peuvent être masquées individuellement (stockage localStorage par utilisateur, clé animeaux-hidden-conversations-${userId}) : le masquage est purement côté client, aucun message n'est jamais supprimé de la base ; une conversation masquée réapparaît automatiquement dès qu'un nouveau message y est reçu (comparaison de l'horodatage de masquage avec last_message_at). Le rafraîchissement de la conversation active et de la liste des contacts se fait en temps réel (voir mise à jour du 23 juillet 2026 ci-dessous).</w:t>
+      </w:r>
+    </w:p>
+    <w:p>
+      <w:pPr>
+        <w:spacing w:after="160" w:line="300"/>
+      </w:pPr>
+      <w:r>
+        <w:t>Mise à jour du 23 juillet 2026 : la messagerie fonctionnait jusque-là par polling toutes les 5 secondes (useConversation et useConversationPartners, src/hooks/useData.ts), remplacé par un abonnement Supabase Realtime aux INSERT sur la table messages (migration 064, qui ajoute messages à la publication supabase_realtime — désactivée table par table par défaut). useConversation filtre sur receiver_id=eq.&lt;id de l'utilisateur&gt; côté serveur (le filtre Realtime ne supporte qu'une seule condition de colonne) puis vérifie l'expéditeur côté client avant d'invalider le cache ; useConversationPartners utilise le même filtre pour rafraîchir instantanément dernier message et compteur de non-lus dans la liste des contacts. Les messages qu'on envoie soi-même restent gérés par l'invalidation optimiste existante de useSendMessage, qui corrige au passage une clé de cache obsolète (invalidait 'message-summaries', une clé qui n'a jamais correspondu à aucune query active, au lieu de 'conversation-partners').</w:t>
       </w:r>
     </w:p>
     <w:p>

</xml_diff>

<commit_message>
Docs: cahier des charges v1.25 — incident messagerie + réglages domaine restants
Documente le crash mobile causé par des canaux realtime redondants
(revert) et les deux derniers réglages dépendant du domaine mis à
jour : Redirect URLs Supabase Auth et secret APP_URL.
</commit_message>
<xml_diff>
--- a/cahier_des_charges_animeaux.docx
+++ b/cahier_des_charges_animeaux.docx
@@ -58,7 +58,7 @@
           <w:sz w:val="22"/>
           <w:szCs w:val="22"/>
         </w:rPr>
-        <w:t>Version 1.25 — document mis à jour avec les évolutions de juillet 2026 (vérification des praticiens par documents, correctif critique inscriptions, espace secrétariat en compte dédié, statut administrateur découplé du rôle, tableau de bord admin complet, domaine d'envoi Resend vérifié, carte Leaflet sur la fiche praticien avec géocodage des cabinets, domaine monanimeaux.fr connecté au site, modération avancée admin, correctif captcha Turnstile sur le domaine personnalisé, messagerie en temps réel)</w:t>
+        <w:t>Version 1.25 — document mis à jour avec les évolutions de juillet 2026 (vérification des praticiens par documents, correctif critique inscriptions, espace secrétariat en compte dédié, statut administrateur découplé du rôle, tableau de bord admin complet, domaine d'envoi Resend vérifié, carte Leaflet sur la fiche praticien avec géocodage des cabinets, domaine monanimeaux.fr connecté au site, modération avancée admin, correctifs post-connexion domaine : captcha Turnstile, redirect URLs Supabase Auth, secret APP_URL, incident messagerie temps réel)</w:t>
       </w:r>
     </w:p>
     <w:p>
@@ -4874,6 +4874,14 @@
     </w:p>
     <w:p>
       <w:pPr>
+        <w:spacing w:after="160" w:line="300"/>
+      </w:pPr>
+      <w:r>
+        <w:t>Complément du 23 juillet 2026 (suite) : deux autres réglages dépendant du domaine ont dû être mis à jour manuellement après la connexion de monanimeaux.fr, même catégorie de problème que le captcha Turnstile ci-dessus (une liste d'autorisation externe qui ne connaissait que l'ancien domaine .vercel.app). D'une part, la liste des Redirect URLs de Supabase Auth (Authentication &gt; URL Configuration) ne contenait pas monanimeaux.fr : sans cet ajout (https://monanimeaux.fr/**), le lien de réinitialisation de mot de passe (ForgotPassword.tsx, qui construit pourtant son URL dynamiquement via window.location.origin) aurait pu être rejeté silencieusement par Supabase pour quiconque utilise ce domaine. D'autre part, la fonction Edge invite-clinic-secretary construit le lien de connexion envoyé à un nouveau compte secrétariat à partir d'un secret APP_URL, avec un repli codé en dur sur https://anim-aux-a2qn.vercel.app si ce secret n'est pas défini — mis à jour vers https://monanimeaux.fr pour que ces emails pointent vers le bon domaine (secret ajouté dans Edge Functions &gt; Secrets, aucun redéploiement de la fonction nécessaire, les secrets sont lus à chaque exécution).</w:t>
+      </w:r>
+    </w:p>
+    <w:p>
+      <w:pPr>
         <w:pStyle w:val="Heading1"/>
         <w:spacing w:after="200" w:before="400"/>
       </w:pPr>
@@ -6894,6 +6902,32 @@
       </w:pPr>
       <w:r>
         <w:t xml:space="preserve">Le 23 juillet 2026, l'identifiant de connexion du compte secrétariat est devenu un code généré (ex. CAB4X9QZ) plutôt que l'email tapé par le praticien à l'invitation : Supabase Auth exige un champ email valide, donc ce code est transformé en email synthétique (code@secretariat.animeaux.internal, domaine non résolvable, jamais utilisé pour un envoi réel) uniquement pour satisfaire cette contrainte technique. L'email réellement saisi par le praticien ne sert plus qu'au routage Resend (destinataire de l'email d'identifiants), plus jamais à l'identité du compte.</w:t>
+      </w:r>
+    </w:p>
+    <w:p>
+      <w:pPr>
+        <w:pStyle w:val="ListParagraph"/>
+        <w:numPr>
+          <w:ilvl w:val="0"/>
+          <w:numId w:val="2"/>
+        </w:numPr>
+        <w:spacing w:after="100"/>
+      </w:pPr>
+      <w:r>
+        <w:t>Résolu le 23 juillet 2026 : la messagerie (MessagesPage.tsx, DoctorDashboard.tsx) gérait déjà son propre temps réel via des canaux Supabase ('msgs' / 'doctor-msgs', écoute postgres_changes sur messages) — invisible en lisant seulement useConversation/useConversationPartners dans useData.ts, dont le rafraîchissement toutes les 5 secondes ressemblait à un simple polling sans alternative. Une tentative d'ajouter du temps réel au niveau des hooks (en plus de celui déjà présent au niveau des pages) a fait planter la page Messages en production sur mobile juste après déploiement (« Une erreur est survenue », capturée par Sentry) — annulée immédiatement, retour au polling existant. Leçon : avant d'ajouter une fonctionnalité dans la couche données (useData.ts), vérifier que le composant qui l'utilise ne la gère pas déjà lui-même.</w:t>
+      </w:r>
+    </w:p>
+    <w:p>
+      <w:pPr>
+        <w:pStyle w:val="ListParagraph"/>
+        <w:numPr>
+          <w:ilvl w:val="0"/>
+          <w:numId w:val="2"/>
+        </w:numPr>
+        <w:spacing w:after="100"/>
+      </w:pPr>
+      <w:r>
+        <w:t>Résolu le 23 juillet 2026 : deux réglages dépendant du nom de domaine devaient être mis à jour après la connexion de monanimeaux.fr (voir section 9.3) — la liste des Redirect URLs de Supabase Auth (Authentication &gt; URL Configuration) et le secret APP_URL de la fonction Edge invite-clinic-secretary (qui retombait sur l'ancienne URL .vercel.app par défaut). À refaire pour tout futur domaine ou sous-domaine ajouté au projet.</w:t>
       </w:r>
     </w:p>
     <w:sectPr>

</xml_diff>

<commit_message>
Docs: cahier des charges v1.26 — rappels SMS via l'API OVH
Documente l'envoi de SMS de rappel en plus de l'email/notification
in-app, avec les 4 secrets Edge Functions requis.
</commit_message>
<xml_diff>
--- a/cahier_des_charges_animeaux.docx
+++ b/cahier_des_charges_animeaux.docx
@@ -58,7 +58,7 @@
           <w:sz w:val="22"/>
           <w:szCs w:val="22"/>
         </w:rPr>
-        <w:t>Version 1.25 — document mis à jour avec les évolutions de juillet 2026 (vérification des praticiens par documents, correctif critique inscriptions, espace secrétariat en compte dédié, statut administrateur découplé du rôle, tableau de bord admin complet, domaine d'envoi Resend vérifié, carte Leaflet sur la fiche praticien avec géocodage des cabinets, domaine monanimeaux.fr connecté au site, modération avancée admin, correctifs post-connexion domaine : captcha Turnstile, redirect URLs Supabase Auth, secret APP_URL, incident messagerie temps réel)</w:t>
+        <w:t>Version 1.26 — document mis à jour avec les évolutions de juillet 2026 (vérification des praticiens par documents, correctif critique inscriptions, espace secrétariat en compte dédié, statut administrateur découplé du rôle, tableau de bord admin complet, domaine d'envoi Resend vérifié, carte Leaflet sur la fiche praticien avec géocodage des cabinets, domaine monanimeaux.fr connecté au site, modération avancée admin, correctifs post-connexion domaine, rappels de RDV par SMS via l'API OVH)</w:t>
       </w:r>
     </w:p>
     <w:p>
@@ -4837,6 +4837,14 @@
       </w:pPr>
       <w:r>
         <w:t xml:space="preserve">Mise à jour du 21 juillet 2026 : l'envoi de l'email de rappel via Resend est désormais implémenté (auparavant seule la notification in-app était créée), et le bug de résolution de user_id évoqué dans une version antérieure de ce document a été corrigé (user_id = patient_id directement, sans passer par profiles). Surtout, la fonction n'était jamais déployée sur le projet Supabase malgré ces corrections présentes dans le code : elle a été déployée manuellement ce même jour, et un job cron (pg_cron + pg_net, table Integrations → Cron) nommé send-reminders-hourly a été créé pour l'appeler chaque heure via un POST HTTP authentifié par le secret CRON_SECRET — aucun cron n'existait avant cette date, donc aucun rappel n'a jamais été envoyé en production.</w:t>
+      </w:r>
+    </w:p>
+    <w:p>
+      <w:pPr>
+        <w:spacing w:after="160" w:line="300"/>
+      </w:pPr>
+      <w:r>
+        <w:t>Mise à jour du 23 juillet 2026 : un SMS de rappel est désormais envoyé en plus de l'email et de la notification in-app, si le patient a un numéro de téléphone renseigné dans son profil (normalisé automatiquement au format E.164 quelle que soit la forme saisie). Envoyé via l'API SMS OVH (compte "Standard", service sms-ys52270-1) plutôt que Resend (qui ne fait que de l'email) — authentification propre à OVH par signature (sha1 de la clé secrète + Consumer Key + méthode + URL + corps + un timestamp récupéré depuis l'horloge officielle OVH pour éviter tout rejet lié à un décalage d'horloge). Quatre secrets Edge Functions : OVH_APP_KEY, OVH_APP_SECRET, OVH_CONSUMER_KEY, OVH_SMS_SERVICE_NAME. Comme pour Resend, entièrement best-effort : l'absence d'un secret ou d'un numéro de téléphone n'empêche jamais l'envoi de l'email ni la création de la notification in-app, le SMS est simplement omis silencieusement.</w:t>
       </w:r>
     </w:p>
     <w:p>

</xml_diff>

<commit_message>
Docs: cahier des charges v1.27 — liste d'attente + rappels de vaccin proactifs
Documente la liste d'attente (BookPage, migration 065) et les
rappels de vaccin proactifs (email + SMS + notification, migration
066), en plus des rappels SMS déjà documentés.
</commit_message>
<xml_diff>
--- a/cahier_des_charges_animeaux.docx
+++ b/cahier_des_charges_animeaux.docx
@@ -58,7 +58,7 @@
           <w:sz w:val="22"/>
           <w:szCs w:val="22"/>
         </w:rPr>
-        <w:t>Version 1.26 — document mis à jour avec les évolutions de juillet 2026 (vérification des praticiens par documents, correctif critique inscriptions, espace secrétariat en compte dédié, statut administrateur découplé du rôle, tableau de bord admin complet, domaine d'envoi Resend vérifié, carte Leaflet sur la fiche praticien avec géocodage des cabinets, domaine monanimeaux.fr connecté au site, modération avancée admin, correctifs post-connexion domaine, rappels de RDV par SMS via l'API OVH)</w:t>
+        <w:t>Version 1.27 — document mis à jour avec les évolutions de juillet 2026 (vérification des praticiens par documents, correctif critique inscriptions, espace secrétariat en compte dédié, statut administrateur découplé du rôle, tableau de bord admin complet, domaine d'envoi Resend vérifié, carte Leaflet sur la fiche praticien avec géocodage des cabinets, domaine monanimeaux.fr connecté au site, modération avancée admin, rappels de RDV par SMS, liste d'attente, rappels de vaccin proactifs)</w:t>
       </w:r>
     </w:p>
     <w:p>
@@ -4484,6 +4484,14 @@
     </w:p>
     <w:p>
       <w:pPr>
+        <w:spacing w:after="160" w:line="300"/>
+      </w:pPr>
+      <w:r>
+        <w:t>Mise à jour du 23 juillet 2026 : sous le calendrier de l'étape 1, un lien « Aucun créneau qui vous convient ? Me prévenir si un créneau se libère » permet de s'inscrire à la liste d'attente du praticien (table waitlist_entries, migration 065). Dès qu'un rendez-vous confirmé chez ce praticien passe au statut annulé, un trigger SQL (notify_waitlist_on_cancellation) envoie une notification in-app à chaque patient inscrit puis supprime son entrée — alerte à usage unique, pas un abonnement permanent aux annulations ; le patient peut se réinscrire librement ensuite.</w:t>
+      </w:r>
+    </w:p>
+    <w:p>
+      <w:pPr>
         <w:pStyle w:val="Heading2"/>
         <w:spacing w:after="150" w:before="300"/>
       </w:pPr>
@@ -4552,6 +4560,14 @@
     </w:p>
     <w:p>
       <w:pPr>
+        <w:spacing w:after="160" w:line="300"/>
+      </w:pPr>
+      <w:r>
+        <w:t>Mise à jour du 23 juillet 2026 : ce rappel de vaccin, jusqu'ici purement passif (visible seulement si le patient consultait cette page), déclenche désormais aussi un envoi proactif (email + SMS + notification in-app) dans les 7 jours précédant l'échéance — voir section 9.2.</w:t>
+      </w:r>
+    </w:p>
+    <w:p>
+      <w:pPr>
         <w:pStyle w:val="Heading2"/>
         <w:spacing w:after="150" w:before="300"/>
       </w:pPr>
@@ -4845,6 +4861,14 @@
       </w:pPr>
       <w:r>
         <w:t>Mise à jour du 23 juillet 2026 : un SMS de rappel est désormais envoyé en plus de l'email et de la notification in-app, si le patient a un numéro de téléphone renseigné dans son profil (normalisé automatiquement au format E.164 quelle que soit la forme saisie). Envoyé via l'API SMS OVH (compte "Standard", service sms-ys52270-1) plutôt que Resend (qui ne fait que de l'email) — authentification propre à OVH par signature (sha1 de la clé secrète + Consumer Key + méthode + URL + corps + un timestamp récupéré depuis l'horloge officielle OVH pour éviter tout rejet lié à un décalage d'horloge). Quatre secrets Edge Functions : OVH_APP_KEY, OVH_APP_SECRET, OVH_CONSUMER_KEY, OVH_SMS_SERVICE_NAME. Comme pour Resend, entièrement best-effort : l'absence d'un secret ou d'un numéro de téléphone n'empêche jamais l'envoi de l'email ni la création de la notification in-app, le SMS est simplement omis silencieusement.</w:t>
+      </w:r>
+    </w:p>
+    <w:p>
+      <w:pPr>
+        <w:spacing w:after="160" w:line="300"/>
+      </w:pPr>
+      <w:r>
+        <w:t>Complément du 23 juillet 2026 : la même fonction envoie désormais aussi un rappel de vaccin (email + SMS + notification in-app) dans les 7 jours précédant vaccines.next_due_date, saisi par le praticien sur le dossier de santé de l'animal (section 6.10) — jusqu'ici affiché seulement passivement sur /rappels (section 6.12). Un seul envoi par vaccin (colonne reminder_sent_at, migration 066) : la fenêtre de 7 jours ne redéclenche pas l'alerte à chaque exécution horaire du cron.</w:t>
       </w:r>
     </w:p>
     <w:p>

</xml_diff>

<commit_message>
Docs: cahier des charges v1.28 — onglet Statistiques praticien
Documente le nouvel onglet 7.8 (revenu, no-show, annulation, taux
de remplissage estimé), entièrement calculé côté client.
</commit_message>
<xml_diff>
--- a/cahier_des_charges_animeaux.docx
+++ b/cahier_des_charges_animeaux.docx
@@ -58,7 +58,7 @@
           <w:sz w:val="22"/>
           <w:szCs w:val="22"/>
         </w:rPr>
-        <w:t>Version 1.27 — document mis à jour avec les évolutions de juillet 2026 (vérification des praticiens par documents, correctif critique inscriptions, espace secrétariat en compte dédié, statut administrateur découplé du rôle, tableau de bord admin complet, domaine d'envoi Resend vérifié, carte Leaflet sur la fiche praticien avec géocodage des cabinets, domaine monanimeaux.fr connecté au site, modération avancée admin, rappels de RDV par SMS, liste d'attente, rappels de vaccin proactifs)</w:t>
+        <w:t>Version 1.28 — document mis à jour avec les évolutions de juillet 2026 (vérification des praticiens par documents, correctif critique inscriptions, espace secrétariat en compte dédié, statut administrateur découplé du rôle, tableau de bord admin complet, domaine d'envoi Resend vérifié, carte Leaflet sur la fiche praticien avec géocodage des cabinets, domaine monanimeaux.fr connecté au site, modération avancée admin, rappels de RDV par SMS, liste d'attente, rappels de vaccin proactifs, statistiques praticien)</w:t>
       </w:r>
     </w:p>
     <w:p>
@@ -4631,7 +4631,7 @@
         <w:spacing w:after="160" w:line="300"/>
       </w:pPr>
       <w:r>
-        <w:t xml:space="preserve">Le tableau de bord praticien est organisé en sept onglets, pilotés par le paramètre d'URL ?tab= et le type DoctorTab (src/lib/doctorDashboardTabs.ts). Cinq onglets sont visibles directement dans la barre de navigation (Accueil, Mes patients, Tarifs, Disponibilités, Avis) ; les deux autres (Profil, Messages) sont accessibles via les icônes de la barre de navigation plutôt que par un onglet dédié.</w:t>
+        <w:t>Le tableau de bord praticien est organisé en huit onglets, pilotés par le paramètre d'URL ?tab= et le type DoctorTab (src/lib/doctorDashboardTabs.ts). Six onglets sont visibles directement dans la barre de navigation (Accueil, Mes patients, Tarifs, Disponibilités, Avis, Statistiques) ; les deux autres (Profil, Messages) sont accessibles via les icônes de la barre de navigation plutôt que par un onglet dédié.</w:t>
       </w:r>
     </w:p>
     <w:p>
@@ -4751,6 +4751,23 @@
       </w:pPr>
       <w:r>
         <w:t xml:space="preserve">Interface de messagerie complète, reprenant l'essentiel de la page Messages patient mais dans le contexte praticien (voir section 8).</w:t>
+      </w:r>
+    </w:p>
+    <w:p>
+      <w:pPr>
+        <w:pStyle w:val="Heading2"/>
+        <w:spacing w:after="150" w:before="300"/>
+      </w:pPr>
+      <w:r>
+        <w:t>7.8 Statistiques</w:t>
+      </w:r>
+    </w:p>
+    <w:p>
+      <w:pPr>
+        <w:spacing w:after="160" w:line="300"/>
+      </w:pPr>
+      <w:r>
+        <w:t>Ajouté le 23 juillet 2026. Vue d'ensemble de l'activité du praticien, entièrement calculée côté client à partir des données déjà chargées par le tableau de bord (appointments, availabilities, doctor.consultation_price) — aucune requête ni migration dédiée. Quatre indicateurs : revenu total et sur les 30 derniers jours (somme du tarif de consultation sur les RDV au statut terminé), taux de no-show (no_show / (terminé + no_show) parmi les RDV passés), taux d'annulation (annulé / total RDV passés). Une barre de progression indique en complément le taux de remplissage sur les 30 derniers jours : nombre de RDV non annulés sur cette période, rapporté au nombre théorique de créneaux déductible des disponibilités récurrentes (jour de la semaine × amplitude horaire / slot_duration_minutes) — une estimation qui ne tient pas compte des congés posés (blocked_slots), donc légèrement optimiste.</w:t>
       </w:r>
     </w:p>
     <w:p>

</xml_diff>

<commit_message>
Docs: cahier des charges v1.29 — mise en place des premiers tests unitaires
Documente l'ajout de Vitest + Testing Library et les deux premières
suites de tests (sanitizeHtml, geo.ts).
</commit_message>
<xml_diff>
--- a/cahier_des_charges_animeaux.docx
+++ b/cahier_des_charges_animeaux.docx
@@ -58,7 +58,7 @@
           <w:sz w:val="22"/>
           <w:szCs w:val="22"/>
         </w:rPr>
-        <w:t>Version 1.28 — document mis à jour avec les évolutions de juillet 2026 (vérification des praticiens par documents, correctif critique inscriptions, espace secrétariat en compte dédié, statut administrateur découplé du rôle, tableau de bord admin complet, domaine d'envoi Resend vérifié, carte Leaflet sur la fiche praticien avec géocodage des cabinets, domaine monanimeaux.fr connecté au site, modération avancée admin, rappels de RDV par SMS, liste d'attente, rappels de vaccin proactifs, statistiques praticien)</w:t>
+        <w:t>Version 1.29 — document mis à jour avec les évolutions de juillet 2026 (vérification des praticiens par documents, correctif critique inscriptions, espace secrétariat en compte dédié, statut administrateur découplé du rôle, tableau de bord admin complet, domaine d'envoi Resend vérifié, carte Leaflet sur la fiche praticien avec géocodage des cabinets, domaine monanimeaux.fr connecté au site, modération avancée admin, rappels de RDV par SMS, liste d'attente, rappels de vaccin proactifs, statistiques praticien, premiers tests unitaires)</w:t>
       </w:r>
     </w:p>
     <w:p>
@@ -6977,6 +6977,19 @@
       </w:pPr>
       <w:r>
         <w:t>Résolu le 23 juillet 2026 : deux réglages dépendant du nom de domaine devaient être mis à jour après la connexion de monanimeaux.fr (voir section 9.3) — la liste des Redirect URLs de Supabase Auth (Authentication &gt; URL Configuration) et le secret APP_URL de la fonction Edge invite-clinic-secretary (qui retombait sur l'ancienne URL .vercel.app par défaut). À refaire pour tout futur domaine ou sous-domaine ajouté au projet.</w:t>
+      </w:r>
+    </w:p>
+    <w:p>
+      <w:pPr>
+        <w:pStyle w:val="ListParagraph"/>
+        <w:numPr>
+          <w:ilvl w:val="0"/>
+          <w:numId w:val="2"/>
+        </w:numPr>
+        <w:spacing w:after="100"/>
+      </w:pPr>
+      <w:r>
+        <w:t>Ajouté le 23 juillet 2026 : mise en place de Vitest + Testing Library (jsdom), le projet n'ayant jusqu'ici aucune infrastructure de test (npm run test / npm run test:watch, config dans vite.config.ts). Deux premières suites ciblent la logique la plus critique et la plus isolée du reste de l'appli : sanitizeHtml.ts (nettoyage anti-XSS de la bio praticien, affichée publiquement sans connexion) et geo.ts (calcul de distance haversine, géocodage avec réseau mocké). Aucune couverture pour l'instant sur les hooks Supabase (useData.ts) ni les composants React — à construire progressivement plutôt qu'en un seul chantier, en commençant par toute nouvelle logique pure ajoutée au fil de l'eau.</w:t>
       </w:r>
     </w:p>
     <w:sectPr>

</xml_diff>

<commit_message>
Docs: cahier des charges v1.30 — couverture de tests étendue à 46 tests
Documente doctorStats.ts, slots.ts et les tests d'intégrité sur les
données statiques, ainsi que le réflexe permanent d'un test par
nouvelle fonction pure.
</commit_message>
<xml_diff>
--- a/cahier_des_charges_animeaux.docx
+++ b/cahier_des_charges_animeaux.docx
@@ -58,7 +58,7 @@
           <w:sz w:val="22"/>
           <w:szCs w:val="22"/>
         </w:rPr>
-        <w:t>Version 1.29 — document mis à jour avec les évolutions de juillet 2026 (vérification des praticiens par documents, correctif critique inscriptions, espace secrétariat en compte dédié, statut administrateur découplé du rôle, tableau de bord admin complet, domaine d'envoi Resend vérifié, carte Leaflet sur la fiche praticien avec géocodage des cabinets, domaine monanimeaux.fr connecté au site, modération avancée admin, rappels de RDV par SMS, liste d'attente, rappels de vaccin proactifs, statistiques praticien, premiers tests unitaires)</w:t>
+        <w:t>Version 1.30 — document mis à jour avec les évolutions de juillet 2026 (vérification des praticiens par documents, correctif critique inscriptions, espace secrétariat en compte dédié, statut administrateur découplé du rôle, tableau de bord admin complet, domaine d'envoi Resend vérifié, carte Leaflet sur la fiche praticien avec géocodage des cabinets, domaine monanimeaux.fr connecté au site, modération avancée admin, rappels de RDV par SMS, liste d'attente, rappels de vaccin proactifs, statistiques praticien, tests unitaires (46 tests, statistiques et génération de créneaux extraites en modules testables))</w:t>
       </w:r>
     </w:p>
     <w:p>
@@ -6989,7 +6989,7 @@
         <w:spacing w:after="100"/>
       </w:pPr>
       <w:r>
-        <w:t>Ajouté le 23 juillet 2026 : mise en place de Vitest + Testing Library (jsdom), le projet n'ayant jusqu'ici aucune infrastructure de test (npm run test / npm run test:watch, config dans vite.config.ts). Deux premières suites ciblent la logique la plus critique et la plus isolée du reste de l'appli : sanitizeHtml.ts (nettoyage anti-XSS de la bio praticien, affichée publiquement sans connexion) et geo.ts (calcul de distance haversine, géocodage avec réseau mocké). Aucune couverture pour l'instant sur les hooks Supabase (useData.ts) ni les composants React — à construire progressivement plutôt qu'en un seul chantier, en commençant par toute nouvelle logique pure ajoutée au fil de l'eau.</w:t>
+        <w:t>Ajouté le 23 juillet 2026 : mise en place de Vitest + Testing Library (jsdom), le projet n'ayant jusqu'ici aucune infrastructure de test (npm run test / npm run test:watch, config dans vite.config.ts). Réflexe permanent depuis cette date : toute nouvelle fonction pure ajoutée au projet doit venir avec son test, quitte à extraire une logique inline dans un composant vers son propre module src/lib/ spécifiquement pour la rendre testable (c'est ce qui a été fait pour les statistiques praticien et la génération de créneaux). 46 tests au total sur 6 fichiers : sanitizeHtml.ts (anti-XSS de la bio praticien, publique sans connexion), geo.ts (distance haversine, géocodage avec réseau mocké), doctorStats.ts (revenu, no-show, annulation, taux de remplissage — extrait de DoctorDashboard.tsx), slots.ts (génération des créneaux réservables d'une journée — extrait de useAvailableSlots dans useData.ts), et des tests d'intégrité sur les données statiques animalSpecies.ts / practitionerTypes.ts (pas de doublon d'id/nom, pas de clé orpheline dans les tables de correspondance). Aucune couverture pour l'instant sur les hooks Supabase eux-mêmes ni les composants React (nécessiterait de mocker le client Supabase) — à construire progressivement, sans bloquer sur ce chantier plus lourd.</w:t>
       </w:r>
     </w:p>
     <w:sectPr>

</xml_diff>

<commit_message>
Docs: cahier des charges v1.31 — tests étendus aux hooks Supabase (53 tests)
Documente supabaseMock.ts et les 7 premiers tests sur la couche
hooks, jusqu'ici hors périmètre.
</commit_message>
<xml_diff>
--- a/cahier_des_charges_animeaux.docx
+++ b/cahier_des_charges_animeaux.docx
@@ -58,7 +58,7 @@
           <w:sz w:val="22"/>
           <w:szCs w:val="22"/>
         </w:rPr>
-        <w:t>Version 1.30 — document mis à jour avec les évolutions de juillet 2026 (vérification des praticiens par documents, correctif critique inscriptions, espace secrétariat en compte dédié, statut administrateur découplé du rôle, tableau de bord admin complet, domaine d'envoi Resend vérifié, carte Leaflet sur la fiche praticien avec géocodage des cabinets, domaine monanimeaux.fr connecté au site, modération avancée admin, rappels de RDV par SMS, liste d'attente, rappels de vaccin proactifs, statistiques praticien, tests unitaires (46 tests, statistiques et génération de créneaux extraites en modules testables))</w:t>
+        <w:t>Version 1.31 — document mis à jour avec les évolutions de juillet 2026 (vérification des praticiens par documents, correctif critique inscriptions, espace secrétariat en compte dédié, statut administrateur découplé du rôle, tableau de bord admin complet, domaine d'envoi Resend vérifié, carte Leaflet sur la fiche praticien avec géocodage des cabinets, domaine monanimeaux.fr connecté au site, modération avancée admin, rappels de RDV par SMS, liste d'attente, rappels de vaccin proactifs, statistiques praticien, tests unitaires étendus aux hooks Supabase (53 tests, client mocké))</w:t>
       </w:r>
     </w:p>
     <w:p>
@@ -6989,7 +6989,7 @@
         <w:spacing w:after="100"/>
       </w:pPr>
       <w:r>
-        <w:t>Ajouté le 23 juillet 2026 : mise en place de Vitest + Testing Library (jsdom), le projet n'ayant jusqu'ici aucune infrastructure de test (npm run test / npm run test:watch, config dans vite.config.ts). Réflexe permanent depuis cette date : toute nouvelle fonction pure ajoutée au projet doit venir avec son test, quitte à extraire une logique inline dans un composant vers son propre module src/lib/ spécifiquement pour la rendre testable (c'est ce qui a été fait pour les statistiques praticien et la génération de créneaux). 46 tests au total sur 6 fichiers : sanitizeHtml.ts (anti-XSS de la bio praticien, publique sans connexion), geo.ts (distance haversine, géocodage avec réseau mocké), doctorStats.ts (revenu, no-show, annulation, taux de remplissage — extrait de DoctorDashboard.tsx), slots.ts (génération des créneaux réservables d'une journée — extrait de useAvailableSlots dans useData.ts), et des tests d'intégrité sur les données statiques animalSpecies.ts / practitionerTypes.ts (pas de doublon d'id/nom, pas de clé orpheline dans les tables de correspondance). Aucune couverture pour l'instant sur les hooks Supabase eux-mêmes ni les composants React (nécessiterait de mocker le client Supabase) — à construire progressivement, sans bloquer sur ce chantier plus lourd.</w:t>
+        <w:t>Ajouté le 23 juillet 2026 : mise en place de Vitest + Testing Library (jsdom), le projet n'ayant jusqu'ici aucune infrastructure de test (npm run test / npm run test:watch, config dans vite.config.ts). Réflexe permanent depuis cette date : toute nouvelle fonction pure ajoutée au projet doit venir avec son test, quitte à extraire une logique inline dans un composant vers son propre module src/lib/ spécifiquement pour la rendre testable (c'est ce qui a été fait pour les statistiques praticien et la génération de créneaux). 46 tests au total sur 6 fichiers : sanitizeHtml.ts (anti-XSS de la bio praticien, publique sans connexion), geo.ts (distance haversine, géocodage avec réseau mocké), doctorStats.ts (revenu, no-show, annulation, taux de remplissage — extrait de DoctorDashboard.tsx), slots.ts (génération des créneaux réservables d'une journée — extrait de useAvailableSlots dans useData.ts), et des tests d'intégrité sur les données statiques animalSpecies.ts / practitionerTypes.ts (pas de doublon d'id/nom, pas de clé orpheline dans les tables de correspondance). Complément du 23 juillet 2026 : ajout de src/test/supabaseMock.ts, un mock réutilisable du client Supabase (query builder chaînable "thenable", rpc, auth, storage, channel), permettant de tester la couche hooks (useData.ts) sans réseau ni compte de test — 7 premiers tests sur useAvailabilities, useMyWaitlistEntry, useJoinWaitlist et useConversationPartners (succès, erreurs Supabase, hook désactivé sans utilisateur connecté). 53 tests au total. Les composants React eux-mêmes (rendu, interactions) restent non couverts — prochaine étape si le besoin s'en fait sentir, sur le même principe (Testing Library, déjà installé).</w:t>
       </w:r>
     </w:p>
     <w:sectPr>

</xml_diff>

<commit_message>
Docs: cahier des charges v1.32 — pyramide de tests complète (68 tests)
Documente les tests de composants React et le correctif Tailwind
content glob. Chaque niveau de la pyramide de tests (fonctions
pures, données, hooks, composants) est désormais couvert au moins
une fois.
</commit_message>
<xml_diff>
--- a/cahier_des_charges_animeaux.docx
+++ b/cahier_des_charges_animeaux.docx
@@ -58,7 +58,7 @@
           <w:sz w:val="22"/>
           <w:szCs w:val="22"/>
         </w:rPr>
-        <w:t>Version 1.31 — document mis à jour avec les évolutions de juillet 2026 (vérification des praticiens par documents, correctif critique inscriptions, espace secrétariat en compte dédié, statut administrateur découplé du rôle, tableau de bord admin complet, domaine d'envoi Resend vérifié, carte Leaflet sur la fiche praticien avec géocodage des cabinets, domaine monanimeaux.fr connecté au site, modération avancée admin, rappels de RDV par SMS, liste d'attente, rappels de vaccin proactifs, statistiques praticien, tests unitaires étendus aux hooks Supabase (53 tests, client mocké))</w:t>
+        <w:t>Version 1.32 — document mis à jour avec les évolutions de juillet 2026 (vérification des praticiens par documents, correctif critique inscriptions, espace secrétariat en compte dédié, statut administrateur découplé du rôle, tableau de bord admin complet, domaine d'envoi Resend vérifié, carte Leaflet sur la fiche praticien avec géocodage des cabinets, domaine monanimeaux.fr connecté au site, modération avancée admin, rappels de RDV par SMS, liste d'attente, rappels de vaccin proactifs, statistiques praticien, pyramide de tests complète (68 tests : fonctions pures, données, hooks, composants))</w:t>
       </w:r>
     </w:p>
     <w:p>
@@ -6989,7 +6989,7 @@
         <w:spacing w:after="100"/>
       </w:pPr>
       <w:r>
-        <w:t>Ajouté le 23 juillet 2026 : mise en place de Vitest + Testing Library (jsdom), le projet n'ayant jusqu'ici aucune infrastructure de test (npm run test / npm run test:watch, config dans vite.config.ts). Réflexe permanent depuis cette date : toute nouvelle fonction pure ajoutée au projet doit venir avec son test, quitte à extraire une logique inline dans un composant vers son propre module src/lib/ spécifiquement pour la rendre testable (c'est ce qui a été fait pour les statistiques praticien et la génération de créneaux). 46 tests au total sur 6 fichiers : sanitizeHtml.ts (anti-XSS de la bio praticien, publique sans connexion), geo.ts (distance haversine, géocodage avec réseau mocké), doctorStats.ts (revenu, no-show, annulation, taux de remplissage — extrait de DoctorDashboard.tsx), slots.ts (génération des créneaux réservables d'une journée — extrait de useAvailableSlots dans useData.ts), et des tests d'intégrité sur les données statiques animalSpecies.ts / practitionerTypes.ts (pas de doublon d'id/nom, pas de clé orpheline dans les tables de correspondance). Complément du 23 juillet 2026 : ajout de src/test/supabaseMock.ts, un mock réutilisable du client Supabase (query builder chaînable "thenable", rpc, auth, storage, channel), permettant de tester la couche hooks (useData.ts) sans réseau ni compte de test — 7 premiers tests sur useAvailabilities, useMyWaitlistEntry, useJoinWaitlist et useConversationPartners (succès, erreurs Supabase, hook désactivé sans utilisateur connecté). 53 tests au total. Les composants React eux-mêmes (rendu, interactions) restent non couverts — prochaine étape si le besoin s'en fait sentir, sur le même principe (Testing Library, déjà installé).</w:t>
+        <w:t>Ajouté le 23 juillet 2026 : mise en place de Vitest + Testing Library (jsdom), le projet n'ayant jusqu'ici aucune infrastructure de test (npm run test / npm run test:watch, config dans vite.config.ts). Réflexe permanent depuis cette date : toute nouvelle fonction pure ajoutée au projet doit venir avec son test, quitte à extraire une logique inline dans un composant vers son propre module src/lib/ spécifiquement pour la rendre testable (c'est ce qui a été fait pour les statistiques praticien et la génération de créneaux). 46 tests au total sur 6 fichiers : sanitizeHtml.ts (anti-XSS de la bio praticien, publique sans connexion), geo.ts (distance haversine, géocodage avec réseau mocké), doctorStats.ts (revenu, no-show, annulation, taux de remplissage — extrait de DoctorDashboard.tsx), slots.ts (génération des créneaux réservables d'une journée — extrait de useAvailableSlots dans useData.ts), et des tests d'intégrité sur les données statiques animalSpecies.ts / practitionerTypes.ts (pas de doublon d'id/nom, pas de clé orpheline dans les tables de correspondance). Complément du 23 juillet 2026 : ajout de src/test/supabaseMock.ts, un mock réutilisable du client Supabase (query builder chaînable "thenable", rpc, auth, storage, channel), permettant de tester la couche hooks (useData.ts) sans réseau ni compte de test — 7 premiers tests sur useAvailabilities, useMyWaitlistEntry, useJoinWaitlist et useConversationPartners (succès, erreurs Supabase, hook désactivé sans utilisateur connecté). 53 tests au total. Complément du 23 juillet 2026 (fin) : premiers tests de composants React avec Testing Library — StarRating.tsx (remplissage des étoiles sur note décimale, bornes 0-100%, mode interactif vs affichage), BackButton.tsx (historique de navigation vs fallback, react-router-dom mocké), et AvailabilityCalendar.tsx (sélection de jour, créneaux affichés/exclus, callback onSelect — via le mock Supabase). Corrigé au passage : tailwind.config.js scannait aussi les fichiers *.test.tsx pour générer les classes utilitaires de production, faisant dériver légèrement le CSS buildé à chaque nouveau test sans changement fonctionnel réel — exclus du content glob. 68 tests au total, la pyramide de tests (fonctions pures → intégrité des données → hooks Supabase mockés → composants React) couvre désormais chaque niveau au moins une fois ; à étoffer au fil de l'eau plutôt qu'en viser une couverture exhaustive d'un coup.</w:t>
       </w:r>
     </w:p>
     <w:sectPr>

</xml_diff>

<commit_message>
Docs: cahier des charges v1.33 — 85 tests, tout src/lib couvert
Documente supabase.ts, authStore.ts, doctorDashboardTabs.ts et les
4 nouveaux hooks mutations testés.
</commit_message>
<xml_diff>
--- a/cahier_des_charges_animeaux.docx
+++ b/cahier_des_charges_animeaux.docx
@@ -58,7 +58,7 @@
           <w:sz w:val="22"/>
           <w:szCs w:val="22"/>
         </w:rPr>
-        <w:t>Version 1.32 — document mis à jour avec les évolutions de juillet 2026 (vérification des praticiens par documents, correctif critique inscriptions, espace secrétariat en compte dédié, statut administrateur découplé du rôle, tableau de bord admin complet, domaine d'envoi Resend vérifié, carte Leaflet sur la fiche praticien avec géocodage des cabinets, domaine monanimeaux.fr connecté au site, modération avancée admin, rappels de RDV par SMS, liste d'attente, rappels de vaccin proactifs, statistiques praticien, pyramide de tests complète (68 tests : fonctions pures, données, hooks, composants))</w:t>
+        <w:t>Version 1.33 — document mis à jour avec les évolutions de juillet 2026 (vérification des praticiens par documents, correctif critique inscriptions, espace secrétariat en compte dédié, statut administrateur découplé du rôle, tableau de bord admin complet, domaine d'envoi Resend vérifié, carte Leaflet sur la fiche praticien avec géocodage des cabinets, domaine monanimeaux.fr connecté au site, modération avancée admin, rappels de RDV par SMS, liste d'attente, rappels de vaccin proactifs, statistiques praticien, 85 tests unitaires couvrant tout src/lib)</w:t>
       </w:r>
     </w:p>
     <w:p>
@@ -6990,6 +6990,19 @@
       </w:pPr>
       <w:r>
         <w:t>Ajouté le 23 juillet 2026 : mise en place de Vitest + Testing Library (jsdom), le projet n'ayant jusqu'ici aucune infrastructure de test (npm run test / npm run test:watch, config dans vite.config.ts). Réflexe permanent depuis cette date : toute nouvelle fonction pure ajoutée au projet doit venir avec son test, quitte à extraire une logique inline dans un composant vers son propre module src/lib/ spécifiquement pour la rendre testable (c'est ce qui a été fait pour les statistiques praticien et la génération de créneaux). 46 tests au total sur 6 fichiers : sanitizeHtml.ts (anti-XSS de la bio praticien, publique sans connexion), geo.ts (distance haversine, géocodage avec réseau mocké), doctorStats.ts (revenu, no-show, annulation, taux de remplissage — extrait de DoctorDashboard.tsx), slots.ts (génération des créneaux réservables d'une journée — extrait de useAvailableSlots dans useData.ts), et des tests d'intégrité sur les données statiques animalSpecies.ts / practitionerTypes.ts (pas de doublon d'id/nom, pas de clé orpheline dans les tables de correspondance). Complément du 23 juillet 2026 : ajout de src/test/supabaseMock.ts, un mock réutilisable du client Supabase (query builder chaînable "thenable", rpc, auth, storage, channel), permettant de tester la couche hooks (useData.ts) sans réseau ni compte de test — 7 premiers tests sur useAvailabilities, useMyWaitlistEntry, useJoinWaitlist et useConversationPartners (succès, erreurs Supabase, hook désactivé sans utilisateur connecté). 53 tests au total. Complément du 23 juillet 2026 (fin) : premiers tests de composants React avec Testing Library — StarRating.tsx (remplissage des étoiles sur note décimale, bornes 0-100%, mode interactif vs affichage), BackButton.tsx (historique de navigation vs fallback, react-router-dom mocké), et AvailabilityCalendar.tsx (sélection de jour, créneaux affichés/exclus, callback onSelect — via le mock Supabase). Corrigé au passage : tailwind.config.js scannait aussi les fichiers *.test.tsx pour générer les classes utilitaires de production, faisant dériver légèrement le CSS buildé à chaque nouveau test sans changement fonctionnel réel — exclus du content glob. 68 tests au total, la pyramide de tests (fonctions pures → intégrité des données → hooks Supabase mockés → composants React) couvre désormais chaque niveau au moins une fois ; à étoffer au fil de l'eau plutôt qu'en viser une couverture exhaustive d'un coup.</w:t>
+      </w:r>
+    </w:p>
+    <w:p>
+      <w:pPr>
+        <w:pStyle w:val="ListParagraph"/>
+        <w:numPr>
+          <w:ilvl w:val="0"/>
+          <w:numId w:val="2"/>
+        </w:numPr>
+        <w:spacing w:after="100"/>
+      </w:pPr>
+      <w:r>
+        <w:t>Complément du 24 juillet 2026 : le reste de src/lib couvert — supabase.ts (getMyUserDataWithRetry : retry sur erreur logique et sur exception réseau, abandon après 3 échecs, timeout par tentative, testé avec de faux timers pour rester rapide malgré les délais réels de 800ms/8s), authStore.ts (setters, signOut), doctorDashboardTabs.ts (intégrité des données). Quatre hooks mutations supplémentaires testés dans useData.ts : useLeaveWaitlist, useSendMessage, useUpdateAppointmentStatus, useCreateReview. Plus aucun fichier de src/lib sans test. 85 tests au total, à étoffer au fil de l'eau plutôt qu'en viser une couverture exhaustive d'un coup.</w:t>
       </w:r>
     </w:p>
     <w:sectPr>

</xml_diff>

<commit_message>
Test: derniers composants (Navbar, Footer, Turnstile, RichTextEditor, LocationMap) — 317 tests
Couverture complète : 105/105 hooks useData.ts et quasi-totalité des
composants React (seul AnimalBackground.tsx, purement décoratif, est
volontairement sans test). Corrige aussi un bug de timing dans
SearchBar.test.tsx (attente de la résolution du mock avant la frappe
plutôt qu'un délai fixe) et une erreur de build TypeScript dans
Turnstile.test.tsx (mock non typé).

Docs: cahier des charges v1.34 — 317 tests unitaires

Co-Authored-By: Claude Sonnet 5 <noreply@anthropic.com>
</commit_message>
<xml_diff>
--- a/cahier_des_charges_animeaux.docx
+++ b/cahier_des_charges_animeaux.docx
@@ -58,7 +58,7 @@
           <w:sz w:val="22"/>
           <w:szCs w:val="22"/>
         </w:rPr>
-        <w:t>Version 1.33 — document mis à jour avec les évolutions de juillet 2026 (vérification des praticiens par documents, correctif critique inscriptions, espace secrétariat en compte dédié, statut administrateur découplé du rôle, tableau de bord admin complet, domaine d'envoi Resend vérifié, carte Leaflet sur la fiche praticien avec géocodage des cabinets, domaine monanimeaux.fr connecté au site, modération avancée admin, rappels de RDV par SMS, liste d'attente, rappels de vaccin proactifs, statistiques praticien, 85 tests unitaires couvrant tout src/lib)</w:t>
+        <w:t>Version 1.34 — document mis à jour avec les évolutions de juillet 2026 (vérification des praticiens par documents, correctif critique inscriptions, espace secrétariat en compte dédié, statut administrateur découplé du rôle, tableau de bord admin complet, domaine d'envoi Resend vérifié, carte Leaflet sur la fiche praticien avec géocodage des cabinets, domaine monanimeaux.fr connecté au site, modération avancée admin, rappels de RDV par SMS, liste d'attente, rappels de vaccin proactifs, statistiques praticien, 317 tests unitaires couvrant l'intégralité des hooks useData.ts et la quasi-totalité des composants React)</w:t>
       </w:r>
     </w:p>
     <w:p>
@@ -7003,6 +7003,19 @@
       </w:pPr>
       <w:r>
         <w:t>Complément du 24 juillet 2026 : le reste de src/lib couvert — supabase.ts (getMyUserDataWithRetry : retry sur erreur logique et sur exception réseau, abandon après 3 échecs, timeout par tentative, testé avec de faux timers pour rester rapide malgré les délais réels de 800ms/8s), authStore.ts (setters, signOut), doctorDashboardTabs.ts (intégrité des données). Quatre hooks mutations supplémentaires testés dans useData.ts : useLeaveWaitlist, useSendMessage, useUpdateAppointmentStatus, useCreateReview. Plus aucun fichier de src/lib sans test. 85 tests au total, à étoffer au fil de l'eau plutôt qu'en viser une couverture exhaustive d'un coup.</w:t>
+      </w:r>
+    </w:p>
+    <w:p>
+      <w:pPr>
+        <w:pStyle w:val="ListParagraph"/>
+        <w:numPr>
+          <w:ilvl w:val="0"/>
+          <w:numId w:val="2"/>
+        </w:numPr>
+        <w:spacing w:after="100"/>
+      </w:pPr>
+      <w:r>
+        <w:t>Complément du 28 juillet 2026 : couverture de tests étendue jusqu'à son terme naturel — les 105 hooks exportés par useData.ts sont désormais tous testés (vérifié par diff automatique entre les exports du fichier et les hooks couverts), répartis sur une douzaine de fichiers par domaine (recherche, animaux/vaccins/poids, notifications, rendez-vous, disponibilités, documents, cabinets, compte, admin). Côté composants React, ajout de ProtectedRoute, PasswordInput, DoctorCard, ClinicCard, SpeciesSelect, SearchBar, AppointmentCard, NotificationBell, Navbar, Footer, Turnstile, RichTextEditor et LocationMap (react-leaflet mocké) — seul AnimalBackground.tsx (motif SVG décoratif sans props ni logique) reste volontairement sans test, n'ayant rien de significatif à vérifier. 317 tests au total. Bug de timing corrigé au passage dans SearchBar.test.tsx : les suggestions de spécialité sont recalculées depuis une ref synchronisée par un useEffect une fois useSpecialties() résolue — taper avant cette résolution, ou l'attendre par un simple délai fixe, passait sous charge (suite complète) ; le test attend désormais explicitement la résolution de la promesse du mock Supabase avant de simuler la frappe. Bilan de la marche : toutes les fonctions pures de src/lib, tous les hooks Supabase et la quasi-totalité des composants React sont couverts ; à maintenir au fil de l'eau (chaque nouvelle fonction pure vient avec son test) plutôt qu'à ré-auditer en bloc.</w:t>
       </w:r>
     </w:p>
     <w:sectPr>

</xml_diff>

<commit_message>
Perf: code-splitting par route + PWA installable
Bundle JS principal 1521 Ko -> 513 Ko (gzip 422 -> 153 Ko) via
React.lazy/Suspense sur chaque page dans App.tsx : un visiteur ne
télécharge plus le code des dashboards/admin/stats tant qu'il n'y
accède pas.

Ajout d'une PWA (vite-plugin-pwa) : manifest + service worker
généré au build, icônes public/pwa-192.png et pwa-512.png dérivées
de favicon.svg, app shell précaché pour un démarrage hors-ligne
minimal (les données restent dépendantes du réseau).

Docs: cahier des charges v1.35

Co-Authored-By: Claude Sonnet 5 <noreply@anthropic.com>
</commit_message>
<xml_diff>
--- a/cahier_des_charges_animeaux.docx
+++ b/cahier_des_charges_animeaux.docx
@@ -58,7 +58,7 @@
           <w:sz w:val="22"/>
           <w:szCs w:val="22"/>
         </w:rPr>
-        <w:t>Version 1.34 — document mis à jour avec les évolutions de juillet 2026 (vérification des praticiens par documents, correctif critique inscriptions, espace secrétariat en compte dédié, statut administrateur découplé du rôle, tableau de bord admin complet, domaine d'envoi Resend vérifié, carte Leaflet sur la fiche praticien avec géocodage des cabinets, domaine monanimeaux.fr connecté au site, modération avancée admin, rappels de RDV par SMS, liste d'attente, rappels de vaccin proactifs, statistiques praticien, 317 tests unitaires couvrant l'intégralité des hooks useData.ts et la quasi-totalité des composants React)</w:t>
+        <w:t>Version 1.35 — document mis à jour avec les évolutions de juillet 2026 (vérification des praticiens par documents, correctif critique inscriptions, espace secrétariat en compte dédié, statut administrateur découplé du rôle, tableau de bord admin complet, domaine d'envoi Resend vérifié, carte Leaflet sur la fiche praticien avec géocodage des cabinets, domaine monanimeaux.fr connecté au site, modération avancée admin, rappels de RDV par SMS, liste d'attente, rappels de vaccin proactifs, statistiques praticien, 317 tests unitaires, code-splitting par route et PWA installable avec app shell hors-ligne)</w:t>
       </w:r>
     </w:p>
     <w:p>
@@ -7016,6 +7016,19 @@
       </w:pPr>
       <w:r>
         <w:t>Complément du 28 juillet 2026 : couverture de tests étendue jusqu'à son terme naturel — les 105 hooks exportés par useData.ts sont désormais tous testés (vérifié par diff automatique entre les exports du fichier et les hooks couverts), répartis sur une douzaine de fichiers par domaine (recherche, animaux/vaccins/poids, notifications, rendez-vous, disponibilités, documents, cabinets, compte, admin). Côté composants React, ajout de ProtectedRoute, PasswordInput, DoctorCard, ClinicCard, SpeciesSelect, SearchBar, AppointmentCard, NotificationBell, Navbar, Footer, Turnstile, RichTextEditor et LocationMap (react-leaflet mocké) — seul AnimalBackground.tsx (motif SVG décoratif sans props ni logique) reste volontairement sans test, n'ayant rien de significatif à vérifier. 317 tests au total. Bug de timing corrigé au passage dans SearchBar.test.tsx : les suggestions de spécialité sont recalculées depuis une ref synchronisée par un useEffect une fois useSpecialties() résolue — taper avant cette résolution, ou l'attendre par un simple délai fixe, passait sous charge (suite complète) ; le test attend désormais explicitement la résolution de la promesse du mock Supabase avant de simuler la frappe. Bilan de la marche : toutes les fonctions pures de src/lib, tous les hooks Supabase et la quasi-totalité des composants React sont couverts ; à maintenir au fil de l'eau (chaque nouvelle fonction pure vient avec son test) plutôt qu'à ré-auditer en bloc.</w:t>
+      </w:r>
+    </w:p>
+    <w:p>
+      <w:pPr>
+        <w:pStyle w:val="ListParagraph"/>
+        <w:numPr>
+          <w:ilvl w:val="0"/>
+          <w:numId w:val="2"/>
+        </w:numPr>
+        <w:spacing w:after="100"/>
+      </w:pPr>
+      <w:r>
+        <w:t>Ajouté le 28 juillet 2026 : code-splitting par route (React.lazy + Suspense dans App.tsx) — chaque page n'est plus incluse dans le bundle principal mais chargée à la demande. Le bundle JS principal passe de 1 521 Ko à 513 Ko (gzip : 422 Ko → 153 Ko) ; un visiteur de la page de connexion ne télécharge plus le code du dashboard praticien, de l'admin ou des statistiques. ProtectedRoute reste en import statique (composant léger utilisé par la quasi-totalité des routes protégées). Complément du même jour : mise en place d'une PWA installable via vite-plugin-pwa (service worker généré au build, manifest.webmanifest avec les icônes public/pwa-192.png et pwa-512.png générées depuis favicon.svg via sips, app shell précaché pour un démarrage minimal hors-ligne — les données restent dépendantes du réseau, seule l'interface se charge sans connexion). Vérifié en local avec npm run preview : le service worker s'enregistre et s'active, le manifeste est correctement servi. Les icônes ne sont pas déclarées « maskable » : le logo va jusqu'aux bords du carré (oreilles proches des coins), un recadrage en cercle de sécurité couperait probablement le motif.</w:t>
       </w:r>
     </w:p>
     <w:sectPr>

</xml_diff>

<commit_message>
Docs: cahier des charges v1.36
Co-Authored-By: Claude Sonnet 5 <noreply@anthropic.com>
</commit_message>
<xml_diff>
--- a/cahier_des_charges_animeaux.docx
+++ b/cahier_des_charges_animeaux.docx
@@ -58,7 +58,7 @@
           <w:sz w:val="22"/>
           <w:szCs w:val="22"/>
         </w:rPr>
-        <w:t>Version 1.35 — document mis à jour avec les évolutions de juillet 2026 (vérification des praticiens par documents, correctif critique inscriptions, espace secrétariat en compte dédié, statut administrateur découplé du rôle, tableau de bord admin complet, domaine d'envoi Resend vérifié, carte Leaflet sur la fiche praticien avec géocodage des cabinets, domaine monanimeaux.fr connecté au site, modération avancée admin, rappels de RDV par SMS, liste d'attente, rappels de vaccin proactifs, statistiques praticien, 317 tests unitaires, code-splitting par route et PWA installable avec app shell hors-ligne)</w:t>
+        <w:t>Version 1.36 — document mis à jour avec les évolutions de juillet 2026 (vérification des praticiens par documents, correctif critique inscriptions, espace secrétariat en compte dédié, statut administrateur découplé du rôle, tableau de bord admin complet, domaine d'envoi Resend vérifié, carte Leaflet sur la fiche praticien avec géocodage des cabinets, domaine monanimeaux.fr connecté au site et indexé par Google, modération avancée admin, rappels de RDV par SMS, liste d'attente, rappels de vaccin proactifs, statistiques praticien, 317 tests unitaires, code-splitting par route, PWA installable, référencement de base (sitemap, robots.txt, favicon multi-format) et découpage vendor du bundle)</w:t>
       </w:r>
     </w:p>
     <w:p>
@@ -7029,6 +7029,19 @@
       </w:pPr>
       <w:r>
         <w:t>Ajouté le 28 juillet 2026 : code-splitting par route (React.lazy + Suspense dans App.tsx) — chaque page n'est plus incluse dans le bundle principal mais chargée à la demande. Le bundle JS principal passe de 1 521 Ko à 513 Ko (gzip : 422 Ko → 153 Ko) ; un visiteur de la page de connexion ne télécharge plus le code du dashboard praticien, de l'admin ou des statistiques. ProtectedRoute reste en import statique (composant léger utilisé par la quasi-totalité des routes protégées). Complément du même jour : mise en place d'une PWA installable via vite-plugin-pwa (service worker généré au build, manifest.webmanifest avec les icônes public/pwa-192.png et pwa-512.png générées depuis favicon.svg via sips, app shell précaché pour un démarrage minimal hors-ligne — les données restent dépendantes du réseau, seule l'interface se charge sans connexion). Vérifié en local avec npm run preview : le service worker s'enregistre et s'active, le manifeste est correctement servi. Les icônes ne sont pas déclarées « maskable » : le logo va jusqu'aux bords du carré (oreilles proches des coins), un recadrage en cercle de sécurité couperait probablement le motif.</w:t>
+      </w:r>
+    </w:p>
+    <w:p>
+      <w:pPr>
+        <w:pStyle w:val="ListParagraph"/>
+        <w:numPr>
+          <w:ilvl w:val="0"/>
+          <w:numId w:val="2"/>
+        </w:numPr>
+        <w:spacing w:after="100"/>
+      </w:pPr>
+      <w:r>
+        <w:t>Ajouté le 29 juillet 2026 : le domaine monanimeaux.fr est maintenant indexé par Google (confirmé par une recherche directe le jour même, après soumission du sitemap dans Search Console — la propriété avait été vérifiée par TXT DNS chez OVH, voir plus haut). Complément SEO : ajout de public/robots.txt et public/sitemap.xml (pages publiques statiques uniquement — les fiches praticien/cabinet, dynamiques, n'y figurent pas encore), d'une meta description dans index.html, et d'un favicon multi-format (favicon-32.png, favicon-16.png, favicon.ico en plus du SVG existant) car Google n'affiche l'icône du site dans les résultats de recherche que s'il trouve un format raster standard, pas seulement du SVG — la mise à jour de cette icône côté Google reste plus lente que l'indexation elle-même, sans action possible pour l'accélérer. Complément performance du même jour : le bundle JS principal, jusque-là un seul bloc de 513 Ko, est découpé en chunks vendor séparés (react/react-dom/react-router-dom, @tanstack/react-query, @supabase/supabase-js) via manualChunks dans vite.config.ts, pour que les visiteurs récurrents réutilisent le cache navigateur des libs tierces (rarement modifiées) même après un déploiement qui ne touche que le code applicatif — fait aussi disparaître l'avertissement Vite « chunk supérieur à 500 Ko ». Le logo utilisé dans Navbar/Footer/pages d'authentification passait de 107 Ko : c'était en réalité un SVG enveloppant un PNG encodé en base64, sans aucun vecteur réel dedans. Remplacé par un WebP de 40 Ko (même image, recompressée) — logo-navbar.png, logo-navbar.svg et le doublon logo-full.{png,svg} (jamais importé nulle part) ont été supprimés.</w:t>
       </w:r>
     </w:p>
     <w:sectPr>

</xml_diff>

<commit_message>
Docs: cahier des charges v1.37
Co-Authored-By: Claude Sonnet 5 <noreply@anthropic.com>
</commit_message>
<xml_diff>
--- a/cahier_des_charges_animeaux.docx
+++ b/cahier_des_charges_animeaux.docx
@@ -58,7 +58,7 @@
           <w:sz w:val="22"/>
           <w:szCs w:val="22"/>
         </w:rPr>
-        <w:t>Version 1.36 — document mis à jour avec les évolutions de juillet 2026 (vérification des praticiens par documents, correctif critique inscriptions, espace secrétariat en compte dédié, statut administrateur découplé du rôle, tableau de bord admin complet, domaine d'envoi Resend vérifié, carte Leaflet sur la fiche praticien avec géocodage des cabinets, domaine monanimeaux.fr connecté au site et indexé par Google, modération avancée admin, rappels de RDV par SMS, liste d'attente, rappels de vaccin proactifs, statistiques praticien, 317 tests unitaires, code-splitting par route, PWA installable, référencement de base (sitemap, robots.txt, favicon multi-format) et découpage vendor du bundle)</w:t>
+        <w:t>Version 1.37 — document mis à jour avec les évolutions de juillet 2026 (vérification des praticiens par documents, correctif critique inscriptions, espace secrétariat en compte dédié, statut administrateur découplé du rôle, tableau de bord admin complet, domaine d'envoi Resend vérifié, carte Leaflet sur la fiche praticien avec géocodage des cabinets, domaine monanimeaux.fr connecté au site et indexé par Google, modération avancée admin, rappels de RDV par SMS, liste d'attente, rappels de vaccin proactifs, statistiques praticien, 330 tests unitaires, code-splitting par route, PWA installable, référencement de base, découpage vendor du bundle, réponse du praticien aux avis, export .ics du RDV et carnet de santé exportable)</w:t>
       </w:r>
     </w:p>
     <w:p>
@@ -7042,6 +7042,19 @@
       </w:pPr>
       <w:r>
         <w:t>Ajouté le 29 juillet 2026 : le domaine monanimeaux.fr est maintenant indexé par Google (confirmé par une recherche directe le jour même, après soumission du sitemap dans Search Console — la propriété avait été vérifiée par TXT DNS chez OVH, voir plus haut). Complément SEO : ajout de public/robots.txt et public/sitemap.xml (pages publiques statiques uniquement — les fiches praticien/cabinet, dynamiques, n'y figurent pas encore), d'une meta description dans index.html, et d'un favicon multi-format (favicon-32.png, favicon-16.png, favicon.ico en plus du SVG existant) car Google n'affiche l'icône du site dans les résultats de recherche que s'il trouve un format raster standard, pas seulement du SVG — la mise à jour de cette icône côté Google reste plus lente que l'indexation elle-même, sans action possible pour l'accélérer. Complément performance du même jour : le bundle JS principal, jusque-là un seul bloc de 513 Ko, est découpé en chunks vendor séparés (react/react-dom/react-router-dom, @tanstack/react-query, @supabase/supabase-js) via manualChunks dans vite.config.ts, pour que les visiteurs récurrents réutilisent le cache navigateur des libs tierces (rarement modifiées) même après un déploiement qui ne touche que le code applicatif — fait aussi disparaître l'avertissement Vite « chunk supérieur à 500 Ko ». Le logo utilisé dans Navbar/Footer/pages d'authentification passait de 107 Ko : c'était en réalité un SVG enveloppant un PNG encodé en base64, sans aucun vecteur réel dedans. Remplacé par un WebP de 40 Ko (même image, recompressée) — logo-navbar.png, logo-navbar.svg et le doublon logo-full.{png,svg} (jamais importé nulle part) ont été supprimés.</w:t>
+      </w:r>
+    </w:p>
+    <w:p>
+      <w:pPr>
+        <w:pStyle w:val="ListParagraph"/>
+        <w:numPr>
+          <w:ilvl w:val="0"/>
+          <w:numId w:val="2"/>
+        </w:numPr>
+        <w:spacing w:after="100"/>
+      </w:pPr>
+      <w:r>
+        <w:t>Ajouté le 29 juillet 2026 : trois fonctionnalités inspirées de Doctolib, identifiées manquantes après audit du code. (1) Réponse du praticien aux avis (migration 067) : reviews gagne doctor_reply/doctor_reply_at, modifiables uniquement via la RPC SECURITY DEFINER reply_to_review() — une policy RLS classique aurait aussi autorisé le praticien à modifier rating/comment (propriété du patient), la RPC vérifie donc explicitement que l'appelant est le praticien concerné et ne touche jamais qu'aux deux colonnes de réponse. Affichée publiquement sous l'avis sur la fiche praticien, éditable depuis l'onglet Avis du tableau de bord. (2) Export .ics du rendez-vous confirmé (src/lib/ics.ts, fonction pure testée) : bouton « Ajouter à mon calendrier » sur AppointmentCard, génère le fichier .ics côté client (aucune dépendance ajoutée, aucun appel serveur). (3) Carnet de santé exportable (/animal/:id/carnet) : vue imprimable du dossier d'un animal (identité, vaccins, suivi de poids, historique de soins), pensée pour être montrée à un nouveau praticien ou une clinique d'urgence — export via window.print() et CSS d'impression, sans librairie PDF ajoutée (les navigateurs savent nativement « Enregistrer en PDF » depuis la boîte de dialogue d'impression). Accessible au propriétaire de l'animal et à tout praticien ayant déjà accès au dossier (mêmes règles que /animal/:id) — pas encore de lien public partageable sans connexion, envisageable en évolution future si le besoin se confirme. 330 tests au total.</w:t>
       </w:r>
     </w:p>
     <w:sectPr>

</xml_diff>

<commit_message>
Docs: cahier des charges v1.38
Co-Authored-By: Claude Sonnet 5 <noreply@anthropic.com>
</commit_message>
<xml_diff>
--- a/cahier_des_charges_animeaux.docx
+++ b/cahier_des_charges_animeaux.docx
@@ -58,7 +58,7 @@
           <w:sz w:val="22"/>
           <w:szCs w:val="22"/>
         </w:rPr>
-        <w:t>Version 1.37 — document mis à jour avec les évolutions de juillet 2026 (vérification des praticiens par documents, correctif critique inscriptions, espace secrétariat en compte dédié, statut administrateur découplé du rôle, tableau de bord admin complet, domaine d'envoi Resend vérifié, carte Leaflet sur la fiche praticien avec géocodage des cabinets, domaine monanimeaux.fr connecté au site et indexé par Google, modération avancée admin, rappels de RDV par SMS, liste d'attente, rappels de vaccin proactifs, statistiques praticien, 330 tests unitaires, code-splitting par route, PWA installable, référencement de base, découpage vendor du bundle, réponse du praticien aux avis, export .ics du RDV et carnet de santé exportable)</w:t>
+        <w:t>Version 1.38 — document mis à jour avec les évolutions de juillet 2026 (vérification des praticiens par documents, correctif critique inscriptions, espace secrétariat en compte dédié, statut administrateur découplé du rôle, tableau de bord admin complet, domaine d'envoi Resend vérifié, carte Leaflet sur la fiche praticien avec géocodage des cabinets, domaine monanimeaux.fr connecté au site et indexé par Google, modération avancée admin, rappels de RDV par SMS, liste d'attente, rappels de vaccin proactifs, statistiques praticien, 360 tests unitaires, code-splitting par route, PWA installable, référencement de base, découpage vendor du bundle, réponse du praticien aux avis, export .ics du RDV, carnet de santé exportable, tri par prochaine disponibilité en recherche, notifications push navigateur)</w:t>
       </w:r>
     </w:p>
     <w:p>
@@ -7055,6 +7055,19 @@
       </w:pPr>
       <w:r>
         <w:t>Ajouté le 29 juillet 2026 : trois fonctionnalités inspirées de Doctolib, identifiées manquantes après audit du code. (1) Réponse du praticien aux avis (migration 067) : reviews gagne doctor_reply/doctor_reply_at, modifiables uniquement via la RPC SECURITY DEFINER reply_to_review() — une policy RLS classique aurait aussi autorisé le praticien à modifier rating/comment (propriété du patient), la RPC vérifie donc explicitement que l'appelant est le praticien concerné et ne touche jamais qu'aux deux colonnes de réponse. Affichée publiquement sous l'avis sur la fiche praticien, éditable depuis l'onglet Avis du tableau de bord. (2) Export .ics du rendez-vous confirmé (src/lib/ics.ts, fonction pure testée) : bouton « Ajouter à mon calendrier » sur AppointmentCard, génère le fichier .ics côté client (aucune dépendance ajoutée, aucun appel serveur). (3) Carnet de santé exportable (/animal/:id/carnet) : vue imprimable du dossier d'un animal (identité, vaccins, suivi de poids, historique de soins), pensée pour être montrée à un nouveau praticien ou une clinique d'urgence — export via window.print() et CSS d'impression, sans librairie PDF ajoutée (les navigateurs savent nativement « Enregistrer en PDF » depuis la boîte de dialogue d'impression). Accessible au propriétaire de l'animal et à tout praticien ayant déjà accès au dossier (mêmes règles que /animal/:id) — pas encore de lien public partageable sans connexion, envisageable en évolution future si le besoin se confirme. 330 tests au total.</w:t>
+      </w:r>
+    </w:p>
+    <w:p>
+      <w:pPr>
+        <w:pStyle w:val="ListParagraph"/>
+        <w:numPr>
+          <w:ilvl w:val="0"/>
+          <w:numId w:val="2"/>
+        </w:numPr>
+        <w:spacing w:after="100"/>
+      </w:pPr>
+      <w:r>
+        <w:t>Ajouté le 30 juillet 2026 : notifications push navigateur — chantier plus lourd que les précédents, avec plusieurs étapes manuelles côté Supabase (voir section suivante). Le service worker généré automatiquement par la PWA (vite-plugin-pwa en mode generateSW) ne peut pas recevoir de gestionnaires d'événements custom : bascule en mode injectManifest, avec src/sw.ts écrit à la main (precacheAndRoute pour l'app shell + gestionnaires push/notificationclick). Migration 068 : table push_subscriptions (RLS propriétaire uniquement), extension pg_net, et un trigger sur la table notifications — déjà le point central de toutes les notifications existantes (RDV confirmé/annulé, nouveau message, avis, liste d'attente, rappel de vaccin) — qui appelle la fonction Edge supabase/functions/send-push à chaque INSERT, sans avoir eu à modifier chacun de ces points d'insertion. La clé service_role n'est jamais committée : le trigger la lit depuis Supabase Vault au moment de l'appel (secret nommé service_role_key, à créer manuellement) ; si ce secret est absent, la notification in-app part quand même normalement, seul l'envoi du push est silencieusement sauté — aucune régression possible sur l'existant. La fonction Edge envoie via la librairie web-push (protocole VAPID) et supprime automatiquement les abonnements expirés ou révoqués (réponses 410/404) pour ne pas réessayer indéfiniment sur un endpoint mort. Toggle d'activation/désactivation ajouté dans /profil, visible seulement si le navigateur supporte l'API Push. 360 tests au total, dont la logique pure extraite du service worker (routage au clic sur la notification, conversion de la clé VAPID) et les trois hooks côté client, testés avec navigator/Notification/PushManager stubbés.</w:t>
       </w:r>
     </w:p>
     <w:sectPr>

</xml_diff>

<commit_message>
Docs: cahier des charges v1.39
Co-Authored-By: Claude Sonnet 5 <noreply@anthropic.com>
</commit_message>
<xml_diff>
--- a/cahier_des_charges_animeaux.docx
+++ b/cahier_des_charges_animeaux.docx
@@ -58,7 +58,7 @@
           <w:sz w:val="22"/>
           <w:szCs w:val="22"/>
         </w:rPr>
-        <w:t>Version 1.38 — document mis à jour avec les évolutions de juillet 2026 (vérification des praticiens par documents, correctif critique inscriptions, espace secrétariat en compte dédié, statut administrateur découplé du rôle, tableau de bord admin complet, domaine d'envoi Resend vérifié, carte Leaflet sur la fiche praticien avec géocodage des cabinets, domaine monanimeaux.fr connecté au site et indexé par Google, modération avancée admin, rappels de RDV par SMS, liste d'attente, rappels de vaccin proactifs, statistiques praticien, 360 tests unitaires, code-splitting par route, PWA installable, référencement de base, découpage vendor du bundle, réponse du praticien aux avis, export .ics du RDV, carnet de santé exportable, tri par prochaine disponibilité en recherche, notifications push navigateur)</w:t>
+        <w:t>Version 1.39 — document mis à jour avec les évolutions de juillet 2026 (vérification des praticiens par documents, correctif critique inscriptions, espace secrétariat en compte dédié, statut administrateur découplé du rôle, tableau de bord admin complet, domaine d'envoi Resend vérifié, carte Leaflet sur la fiche praticien avec géocodage des cabinets, domaine monanimeaux.fr connecté au site et indexé par Google, modération avancée admin, rappels de RDV par SMS, liste d'attente, rappels de vaccin proactifs, statistiques praticien, 360 tests unitaires, code-splitting par route, PWA installable, référencement de base, découpage vendor du bundle, réponse du praticien aux avis, export .ics du RDV, carnet de santé exportable, tri par prochaine disponibilité en recherche, notifications push navigateur — vérifiées en conditions réelles pour patients et praticiens)</w:t>
       </w:r>
     </w:p>
     <w:p>
@@ -7068,6 +7068,19 @@
       </w:pPr>
       <w:r>
         <w:t>Ajouté le 30 juillet 2026 : notifications push navigateur — chantier plus lourd que les précédents, avec plusieurs étapes manuelles côté Supabase (voir section suivante). Le service worker généré automatiquement par la PWA (vite-plugin-pwa en mode generateSW) ne peut pas recevoir de gestionnaires d'événements custom : bascule en mode injectManifest, avec src/sw.ts écrit à la main (precacheAndRoute pour l'app shell + gestionnaires push/notificationclick). Migration 068 : table push_subscriptions (RLS propriétaire uniquement), extension pg_net, et un trigger sur la table notifications — déjà le point central de toutes les notifications existantes (RDV confirmé/annulé, nouveau message, avis, liste d'attente, rappel de vaccin) — qui appelle la fonction Edge supabase/functions/send-push à chaque INSERT, sans avoir eu à modifier chacun de ces points d'insertion. La clé service_role n'est jamais committée : le trigger la lit depuis Supabase Vault au moment de l'appel (secret nommé service_role_key, à créer manuellement) ; si ce secret est absent, la notification in-app part quand même normalement, seul l'envoi du push est silencieusement sauté — aucune régression possible sur l'existant. La fonction Edge envoie via la librairie web-push (protocole VAPID) et supprime automatiquement les abonnements expirés ou révoqués (réponses 410/404) pour ne pas réessayer indéfiniment sur un endpoint mort. Toggle d'activation/désactivation ajouté dans /profil, visible seulement si le navigateur supporte l'API Push. 360 tests au total, dont la logique pure extraite du service worker (routage au clic sur la notification, conversion de la clé VAPID) et les trois hooks côté client, testés avec navigator/Notification/PushManager stubbés.</w:t>
+      </w:r>
+    </w:p>
+    <w:p>
+      <w:pPr>
+        <w:pStyle w:val="ListParagraph"/>
+        <w:numPr>
+          <w:ilvl w:val="0"/>
+          <w:numId w:val="2"/>
+        </w:numPr>
+        <w:spacing w:after="100"/>
+      </w:pPr>
+      <w:r>
+        <w:t>Complément du 30 juillet 2026 : deux bugs réels trouvés et corrigés pendant le déploiement des notifications push, tous deux repérés par l'utilisatrice en testant en conditions réelles. (1) src/sw.ts (nouveau, mode injectManifest pour pouvoir ajouter les gestionnaires push/notificationclick) n'appelait ni self.skipWaiting() ni clientsClaim() : un ancien service worker continuait de servir un index.html référençant des chunks JS déjà supprimés du serveur au déploiement suivant (les noms de fichiers changent à chaque build), plantant l'app pour quiconque avait déjà visité le site avant un déploiement — corrigé, et cleanupOutdatedCaches() ajouté au passage. (2) La section Notifications ajoutée dans ProfilPage.tsx (route /profil) restait invisible pour tout praticien : leur lien « Mon profil » dans la navbar pointe vers /dashboard/doctor?tab=profil, un formulaire entièrement séparé dans DoctorDashboard.tsx qui ne réutilise jamais ProfilPage.tsx — piège à garder en tête, ces deux pages de profil doivent être maintenues en double pour toute future fonctionnalité de compte (patient/admin passent par /profil, praticien par son propre onglet, secrétariat n'a pas de page profil du tout). Notifications testées de bout en bout et confirmées fonctionnelles en conditions réelles : réception d'une vraie notification système côté praticien suite à un message patient.</w:t>
       </w:r>
     </w:p>
     <w:sectPr>

</xml_diff>

<commit_message>
Docs: cahier des charges v1.40
Co-Authored-By: Claude Sonnet 5 <noreply@anthropic.com>
</commit_message>
<xml_diff>
--- a/cahier_des_charges_animeaux.docx
+++ b/cahier_des_charges_animeaux.docx
@@ -58,7 +58,7 @@
           <w:sz w:val="22"/>
           <w:szCs w:val="22"/>
         </w:rPr>
-        <w:t>Version 1.39 — document mis à jour avec les évolutions de juillet 2026 (vérification des praticiens par documents, correctif critique inscriptions, espace secrétariat en compte dédié, statut administrateur découplé du rôle, tableau de bord admin complet, domaine d'envoi Resend vérifié, carte Leaflet sur la fiche praticien avec géocodage des cabinets, domaine monanimeaux.fr connecté au site et indexé par Google, modération avancée admin, rappels de RDV par SMS, liste d'attente, rappels de vaccin proactifs, statistiques praticien, 360 tests unitaires, code-splitting par route, PWA installable, référencement de base, découpage vendor du bundle, réponse du praticien aux avis, export .ics du RDV, carnet de santé exportable, tri par prochaine disponibilité en recherche, notifications push navigateur — vérifiées en conditions réelles pour patients et praticiens)</w:t>
+        <w:t>Version 1.40 — document mis à jour avec les évolutions de juillet 2026 (vérification des praticiens par documents, correctif critique inscriptions, espace secrétariat en compte dédié, statut administrateur découplé du rôle, tableau de bord admin complet, domaine d'envoi Resend vérifié, carte Leaflet sur la fiche praticien avec géocodage des cabinets, domaine monanimeaux.fr connecté au site et indexé par Google, modération avancée admin, rappels de RDV par SMS, liste d'attente, rappels de vaccin proactifs, statistiques praticien, 360 tests unitaires, code-splitting par route, PWA installable, référencement de base, découpage vendor du bundle, réponse du praticien aux avis, export .ics du RDV, carnet de santé exportable, tri par prochaine disponibilité en recherche, notifications push navigateur, email + SMS de confirmation immédiate à la réservation — email vérifié en conditions réelles, SMS en attente de validation de l'expéditeur OVH)</w:t>
       </w:r>
     </w:p>
     <w:p>
@@ -7081,6 +7081,19 @@
       </w:pPr>
       <w:r>
         <w:t>Complément du 30 juillet 2026 : deux bugs réels trouvés et corrigés pendant le déploiement des notifications push, tous deux repérés par l'utilisatrice en testant en conditions réelles. (1) src/sw.ts (nouveau, mode injectManifest pour pouvoir ajouter les gestionnaires push/notificationclick) n'appelait ni self.skipWaiting() ni clientsClaim() : un ancien service worker continuait de servir un index.html référençant des chunks JS déjà supprimés du serveur au déploiement suivant (les noms de fichiers changent à chaque build), plantant l'app pour quiconque avait déjà visité le site avant un déploiement — corrigé, et cleanupOutdatedCaches() ajouté au passage. (2) La section Notifications ajoutée dans ProfilPage.tsx (route /profil) restait invisible pour tout praticien : leur lien « Mon profil » dans la navbar pointe vers /dashboard/doctor?tab=profil, un formulaire entièrement séparé dans DoctorDashboard.tsx qui ne réutilise jamais ProfilPage.tsx — piège à garder en tête, ces deux pages de profil doivent être maintenues en double pour toute future fonctionnalité de compte (patient/admin passent par /profil, praticien par son propre onglet, secrétariat n'a pas de page profil du tout). Notifications testées de bout en bout et confirmées fonctionnelles en conditions réelles : réception d'une vraie notification système côté praticien suite à un message patient.</w:t>
+      </w:r>
+    </w:p>
+    <w:p>
+      <w:pPr>
+        <w:pStyle w:val="ListParagraph"/>
+        <w:numPr>
+          <w:ilvl w:val="0"/>
+          <w:numId w:val="2"/>
+        </w:numPr>
+        <w:spacing w:after="100"/>
+      </w:pPr>
+      <w:r>
+        <w:t>Complément du 30 juillet 2026 : send-appointment-confirmation (email de confirmation à la réservation, section 9.2) n'avait en réalité jamais fonctionné depuis sa création — trois bugs empilés, tous découverts en testant une vraie réservation avec l'utilisatrice plutôt qu'en se fiant à la documentation existante. (1) La fonction n'avait jamais été déployée sur Supabase (0 invocation historique constatée dans le dashboard) : le code existait dans le repo sans jamais avoir tourné en prod — confirme une fois de plus qu'un fichier dans supabase/functions/ ne prouve rien tant qu'il n'a pas été collé manuellement dans le dashboard Supabase (voir aussi la même remarque pour les migrations SQL, section 13). (2) CORS manquant : la fonction est appelée depuis le navigateur (useCreateAppointment) mais sans gestion du preflight OPTIONS ni d'en-têtes Access-Control-Allow-Origin — contrairement à invite-clinic-secretary qui a déjà ce pattern depuis le début, seule autre fonction appelée côté client. Sans ces headers, le fetch échoue avant même d'atteindre le code, ce qui remonte côté client comme un 404 trompeur mêlé à une erreur CORS. (3) Requête Postgres invalide : specialty était demandé sous doctors.profiles(...) alors que cette colonne vit directement sur doctors — erreur 42703 ('column profiles_2.specialty does not exist'), jamais remontée puisque la fonction n'avait jamais réellement tourné pour la révéler. Un SMS de confirmation a été ajouté au passage (même mécanisme OVH que le rappel 24h). L'email a été vérifié reçu en conditions réelles après ces trois corrections ; le SMS attend la validation d'un expéditeur alphanumérique OVH (délai annoncé 1-2 jours ouvrés, aucun expéditeur n'existait jusqu'ici sur le service SMS).</w:t>
       </w:r>
     </w:p>
     <w:sectPr>

</xml_diff>

<commit_message>
Docs: cahier des charges v1.41
Co-Authored-By: Claude Sonnet 5 <noreply@anthropic.com>
</commit_message>
<xml_diff>
--- a/cahier_des_charges_animeaux.docx
+++ b/cahier_des_charges_animeaux.docx
@@ -58,7 +58,7 @@
           <w:sz w:val="22"/>
           <w:szCs w:val="22"/>
         </w:rPr>
-        <w:t>Version 1.40 — document mis à jour avec les évolutions de juillet 2026 (vérification des praticiens par documents, correctif critique inscriptions, espace secrétariat en compte dédié, statut administrateur découplé du rôle, tableau de bord admin complet, domaine d'envoi Resend vérifié, carte Leaflet sur la fiche praticien avec géocodage des cabinets, domaine monanimeaux.fr connecté au site et indexé par Google, modération avancée admin, rappels de RDV par SMS, liste d'attente, rappels de vaccin proactifs, statistiques praticien, 360 tests unitaires, code-splitting par route, PWA installable, référencement de base, découpage vendor du bundle, réponse du praticien aux avis, export .ics du RDV, carnet de santé exportable, tri par prochaine disponibilité en recherche, notifications push navigateur, email + SMS de confirmation immédiate à la réservation — email vérifié en conditions réelles, SMS en attente de validation de l'expéditeur OVH)</w:t>
+        <w:t>Version 1.41 — document mis à jour avec les évolutions de juillet 2026 (vérification des praticiens par documents, correctif critique inscriptions, espace secrétariat en compte dédié, statut administrateur découplé du rôle, tableau de bord admin complet, domaine d'envoi Resend vérifié, carte Leaflet sur la fiche praticien avec géocodage des cabinets, domaine monanimeaux.fr connecté au site et indexé par Google, modération avancée admin, rappels de RDV par SMS, liste d'attente, rappels de vaccin proactifs, statistiques praticien, 361 tests unitaires, code-splitting par route, PWA installable, référencement de base, découpage vendor du bundle, réponse du praticien aux avis, export .ics du RDV, carnet de santé exportable, tri par prochaine disponibilité en recherche, notifications push navigateur, email + SMS de confirmation immédiate à la réservation, pages légales finalisées avec le SIRET, annulation de RDV patient corrigée)</w:t>
       </w:r>
     </w:p>
     <w:p>
@@ -7094,6 +7094,19 @@
       </w:pPr>
       <w:r>
         <w:t>Complément du 30 juillet 2026 : send-appointment-confirmation (email de confirmation à la réservation, section 9.2) n'avait en réalité jamais fonctionné depuis sa création — trois bugs empilés, tous découverts en testant une vraie réservation avec l'utilisatrice plutôt qu'en se fiant à la documentation existante. (1) La fonction n'avait jamais été déployée sur Supabase (0 invocation historique constatée dans le dashboard) : le code existait dans le repo sans jamais avoir tourné en prod — confirme une fois de plus qu'un fichier dans supabase/functions/ ne prouve rien tant qu'il n'a pas été collé manuellement dans le dashboard Supabase (voir aussi la même remarque pour les migrations SQL, section 13). (2) CORS manquant : la fonction est appelée depuis le navigateur (useCreateAppointment) mais sans gestion du preflight OPTIONS ni d'en-têtes Access-Control-Allow-Origin — contrairement à invite-clinic-secretary qui a déjà ce pattern depuis le début, seule autre fonction appelée côté client. Sans ces headers, le fetch échoue avant même d'atteindre le code, ce qui remonte côté client comme un 404 trompeur mêlé à une erreur CORS. (3) Requête Postgres invalide : specialty était demandé sous doctors.profiles(...) alors que cette colonne vit directement sur doctors — erreur 42703 ('column profiles_2.specialty does not exist'), jamais remontée puisque la fonction n'avait jamais réellement tourné pour la révéler. Un SMS de confirmation a été ajouté au passage (même mécanisme OVH que le rappel 24h). L'email a été vérifié reçu en conditions réelles après ces trois corrections ; le SMS attend la validation d'un expéditeur alphanumérique OVH (délai annoncé 1-2 jours ouvrés, aucun expéditeur n'existait jusqu'ici sur le service SMS).</w:t>
+      </w:r>
+    </w:p>
+    <w:p>
+      <w:pPr>
+        <w:pStyle w:val="ListParagraph"/>
+        <w:numPr>
+          <w:ilvl w:val="0"/>
+          <w:numId w:val="2"/>
+        </w:numPr>
+        <w:spacing w:after="100"/>
+      </w:pPr>
+      <w:r>
+        <w:t>Complément du 30 juillet 2026 : l'annulation de RDV était cassée depuis toujours côté patient — trouvé en vérifiant la fonctionnalité à la demande de l'utilisatrice, trois bugs sur deux couches. (1) UI (AppointmentCard.tsx) : le bouton générique « Annuler » n'était filtré par aucun rôle, s'affichant en double pour un praticien en plus de ses propres boutons (Refuser sur un RDV en attente, Terminé/Absent(e) sur un RDV confirmé) — corrigé en excluant le rôle docteur, prouvé par un test qui échouait avant correction. (2) RLS (migration 069) : la policy « patient peut annuler le sien » (001_schema.sql) n'avait pas de clause WITH CHECK explicite — sans elle, Postgres réutilise la clause USING (qui exige status in ('pending', 'confirmed')) pour valider aussi la ligne après modification, alors qu'annuler fait justement passer le statut à 'cancelled'. La base rejetait donc silencieusement toute tentative, sans qu'aucune erreur ne remonte à l'écran (aucune gestion d'erreur câblée sur ce bouton) — confirmé en conditions réelles avant correction, puis vérifié fonctionnel après. (3) Contrainte unique (migration 070) : une fois l'annulation débloquée, un créneau libéré s'affichait comme disponible (get_booked_slots exclut déjà les RDV annulés) mais restait en réalité impossible à re-réserver — la contrainte no_double_booking (doctor_id, start_at) ne tenait pas compte du statut, donc l'ancienne ligne annulée bloquait toujours ce créneau. Remplacée par un index unique partiel filtré sur ('pending', 'confirmed'), même filtre que get_booked_slots. Testé de bout en bout : annulation patient effective, puis re-réservation du même créneau réussie. 361 tests au total.</w:t>
       </w:r>
     </w:p>
     <w:sectPr>

</xml_diff>

<commit_message>
Documentation : mise à jour du cahier des charges (interface mobile patient)
Documente la refonte mobile de l'espace patient (coquille Wow/Aurora,
routes /animaux et /rendez-vous, recherche à 2 champs, cartes animaux
en bannière photo), le statut de l'expéditeur SMS OVH (refusé, resoumis
en "MonAnimeaux"), et le piège du montage parallèle desktop/mobile sur
une ressource globale unique (canal Realtime).
</commit_message>
<xml_diff>
--- a/cahier_des_charges_animeaux.docx
+++ b/cahier_des_charges_animeaux.docx
@@ -58,7 +58,7 @@
           <w:sz w:val="22"/>
           <w:szCs w:val="22"/>
         </w:rPr>
-        <w:t>Version 1.41 — document mis à jour avec les évolutions de juillet 2026 (vérification des praticiens par documents, correctif critique inscriptions, espace secrétariat en compte dédié, statut administrateur découplé du rôle, tableau de bord admin complet, domaine d'envoi Resend vérifié, carte Leaflet sur la fiche praticien avec géocodage des cabinets, domaine monanimeaux.fr connecté au site et indexé par Google, modération avancée admin, rappels de RDV par SMS, liste d'attente, rappels de vaccin proactifs, statistiques praticien, 361 tests unitaires, code-splitting par route, PWA installable, référencement de base, découpage vendor du bundle, réponse du praticien aux avis, export .ics du RDV, carnet de santé exportable, tri par prochaine disponibilité en recherche, notifications push navigateur, email + SMS de confirmation immédiate à la réservation, pages légales finalisées avec le SIRET, annulation de RDV patient corrigée)</w:t>
+        <w:t>Version 1.42 — document mis à jour avec les évolutions de juillet et août 2026 (vérification des praticiens par documents, correctif critique inscriptions, espace secrétariat en compte dédié, statut administrateur découplé du rôle, tableau de bord admin complet, domaine d'envoi Resend vérifié, carte Leaflet sur la fiche praticien avec géocodage des cabinets, domaine monanimeaux.fr connecté au site et indexé par Google, modération avancée admin, rappels de RDV par SMS, liste d'attente, rappels de vaccin proactifs, statistiques praticien, 361 tests unitaires, code-splitting par route, PWA installable, référencement de base, découpage vendor du bundle, réponse du praticien aux avis, export .ics du RDV, carnet de santé exportable, tri par prochaine disponibilité en recherche, notifications push navigateur, email + SMS de confirmation immédiate à la réservation, pages légales finalisées avec le SIRET, annulation de RDV patient corrigée, interface mobile dédiée pour l'espace patient avec recherche à deux champs et cartes animaux en bannière photo)</w:t>
       </w:r>
     </w:p>
     <w:p>
@@ -71,7 +71,7 @@
           <w:sz w:val="22"/>
           <w:szCs w:val="22"/>
         </w:rPr>
-        <w:t xml:space="preserve">Juillet 2026</w:t>
+        <w:t xml:space="preserve">Juillet – Août 2026</w:t>
       </w:r>
     </w:p>
     <w:p>
@@ -4509,6 +4509,14 @@
     </w:p>
     <w:p>
       <w:pPr>
+        <w:spacing w:after="160" w:line="300"/>
+      </w:pPr>
+      <w:r>
+        <w:t xml:space="preserve">Mise à jour du 07/08/2026 : ajout d'une interface mobile dédiée à l'espace patient (« coquille Wow / Aurora »), volontairement distincte du responsive desktop plutôt qu'une simple adaptation de la même mise en page — validée sur aperçu avant développement. Chaque page concernée (accueil, animaux, rendez-vous, messages, profil, recherche, page d'accueil publique) porte deux arborescences JSX parallèles dans le même composant : hidden md:block (desktop, strictement inchangé) et md:hidden (mobile), la bascule se faisant uniquement en CSS, sans démontage conditionnel. Composants partagés : SplashScreen (écran de démarrage affiché le temps de la vérification de session, redirection directe vers le tableau de bord si déjà connecté), MobileHeader (cloche de notifications + accès messagerie), MobileTabBar (Accueil / Animaux / bouton central flottant Réserver / RDV / Profil). Deux nouvelles routes réservées au rôle patient : /animaux (AnimalsPage, liste des animaux avec carte illustrée en bannière photo pleine largeur, genre et âge calculé depuis la date de naissance) et /rendez-vous (RendezVousPage). Sur l'accueil mobile, la recherche est passée d'une barre unique à un formulaire à deux champs (spécialité ou nom du praticien, lieu), la grille de raccourcis inclut désormais Mes documents à côté de Mes RDV et Rappels, et la bande « Mes compagnons » a été retirée. Sur l'onglet Profil mobile, le bouton de déconnexion (auparavant uniquement dans la Navbar desktop masquée sur mobile) est désormais un bouton dédié et visible ; l'icône Messages a pris la place de l'avatar profil dans l'en-tête, Profil étant accessible depuis la barre d'onglets du bas.</w:t>
+      </w:r>
+    </w:p>
+    <w:p>
+      <w:pPr>
         <w:pStyle w:val="Heading2"/>
         <w:spacing w:after="150" w:before="300"/>
       </w:pPr>
@@ -6062,6 +6070,130 @@
                 <w:sz w:val="19"/>
                 <w:szCs w:val="19"/>
               </w:rPr>
+              <w:t xml:space="preserve">/animaux</w:t>
+            </w:r>
+          </w:p>
+        </w:tc>
+        <w:tc>
+          <w:tcPr>
+            <w:tcW w:type="dxa" w:w="2600"/>
+            <w:tcMar>
+              <w:top w:type="dxa" w:w="60"/>
+              <w:left w:type="dxa" w:w="100"/>
+              <w:bottom w:type="dxa" w:w="60"/>
+              <w:right w:type="dxa" w:w="100"/>
+            </w:tcMar>
+          </w:tcPr>
+          <w:p>
+            <w:r>
+              <w:rPr>
+                <w:sz w:val="19"/>
+                <w:szCs w:val="19"/>
+              </w:rPr>
+              <w:t xml:space="preserve">Patient</w:t>
+            </w:r>
+          </w:p>
+        </w:tc>
+        <w:tc>
+          <w:tcPr>
+            <w:tcW w:type="dxa" w:w="3820"/>
+            <w:tcMar>
+              <w:top w:type="dxa" w:w="60"/>
+              <w:left w:type="dxa" w:w="100"/>
+              <w:bottom w:type="dxa" w:w="60"/>
+              <w:right w:type="dxa" w:w="100"/>
+            </w:tcMar>
+          </w:tcPr>
+          <w:p>
+            <w:r>
+              <w:rPr>
+                <w:sz w:val="19"/>
+                <w:szCs w:val="19"/>
+              </w:rPr>
+              <w:t xml:space="preserve">AnimalsPage</w:t>
+            </w:r>
+          </w:p>
+        </w:tc>
+      </w:tr>
+      <w:tr>
+        <w:tc>
+          <w:tcPr>
+            <w:tcW w:type="dxa" w:w="2600"/>
+            <w:tcMar>
+              <w:top w:type="dxa" w:w="60"/>
+              <w:left w:type="dxa" w:w="100"/>
+              <w:bottom w:type="dxa" w:w="60"/>
+              <w:right w:type="dxa" w:w="100"/>
+            </w:tcMar>
+          </w:tcPr>
+          <w:p>
+            <w:r>
+              <w:rPr>
+                <w:sz w:val="19"/>
+                <w:szCs w:val="19"/>
+              </w:rPr>
+              <w:t xml:space="preserve">/rendez-vous</w:t>
+            </w:r>
+          </w:p>
+        </w:tc>
+        <w:tc>
+          <w:tcPr>
+            <w:tcW w:type="dxa" w:w="2600"/>
+            <w:tcMar>
+              <w:top w:type="dxa" w:w="60"/>
+              <w:left w:type="dxa" w:w="100"/>
+              <w:bottom w:type="dxa" w:w="60"/>
+              <w:right w:type="dxa" w:w="100"/>
+            </w:tcMar>
+          </w:tcPr>
+          <w:p>
+            <w:r>
+              <w:rPr>
+                <w:sz w:val="19"/>
+                <w:szCs w:val="19"/>
+              </w:rPr>
+              <w:t xml:space="preserve">Patient</w:t>
+            </w:r>
+          </w:p>
+        </w:tc>
+        <w:tc>
+          <w:tcPr>
+            <w:tcW w:type="dxa" w:w="3820"/>
+            <w:tcMar>
+              <w:top w:type="dxa" w:w="60"/>
+              <w:left w:type="dxa" w:w="100"/>
+              <w:bottom w:type="dxa" w:w="60"/>
+              <w:right w:type="dxa" w:w="100"/>
+            </w:tcMar>
+          </w:tcPr>
+          <w:p>
+            <w:r>
+              <w:rPr>
+                <w:sz w:val="19"/>
+                <w:szCs w:val="19"/>
+              </w:rPr>
+              <w:t xml:space="preserve">RendezVousPage</w:t>
+            </w:r>
+          </w:p>
+        </w:tc>
+      </w:tr>
+      <w:tr>
+        <w:tc>
+          <w:tcPr>
+            <w:tcW w:type="dxa" w:w="2600"/>
+            <w:tcMar>
+              <w:top w:type="dxa" w:w="60"/>
+              <w:left w:type="dxa" w:w="100"/>
+              <w:bottom w:type="dxa" w:w="60"/>
+              <w:right w:type="dxa" w:w="100"/>
+            </w:tcMar>
+          </w:tcPr>
+          <w:p>
+            <w:r>
+              <w:rPr>
+                <w:sz w:val="19"/>
+                <w:szCs w:val="19"/>
+              </w:rPr>
               <w:t xml:space="preserve">/dashboard/doctor</w:t>
             </w:r>
           </w:p>
@@ -7098,6 +7230,14 @@
     </w:p>
     <w:p>
       <w:pPr>
+        <w:spacing w:after="160" w:line="300"/>
+      </w:pPr>
+      <w:r>
+        <w:t xml:space="preserve">Mise à jour du 07/08/2026 : le premier expéditeur alphanumérique soumis (« Animeaux ») a été refusé par OVH, motif « nom d'expéditeur trop générique » — un second expéditeur, « MonAnimeaux » (11 caractères, la longueur maximale autorisée), accompagné d'une description d'usage, a été resoumis le même jour. Toujours en attente de validation au moment de la rédaction ; aucun SMS (rappel 24h, rappel vaccin, confirmation de RDV) ne part tant qu'aucun expéditeur n'est validé. Vérifier le statut dans OVH Manager → Télécom → SMS → sms-ys52270-1 → Expéditeurs avant d'assumer que la fonctionnalité est opérationnelle.</w:t>
+      </w:r>
+    </w:p>
+    <w:p>
+      <w:pPr>
         <w:pStyle w:val="ListParagraph"/>
         <w:numPr>
           <w:ilvl w:val="0"/>
@@ -7107,6 +7247,14 @@
       </w:pPr>
       <w:r>
         <w:t>Complément du 30 juillet 2026 : l'annulation de RDV était cassée depuis toujours côté patient — trouvé en vérifiant la fonctionnalité à la demande de l'utilisatrice, trois bugs sur deux couches. (1) UI (AppointmentCard.tsx) : le bouton générique « Annuler » n'était filtré par aucun rôle, s'affichant en double pour un praticien en plus de ses propres boutons (Refuser sur un RDV en attente, Terminé/Absent(e) sur un RDV confirmé) — corrigé en excluant le rôle docteur, prouvé par un test qui échouait avant correction. (2) RLS (migration 069) : la policy « patient peut annuler le sien » (001_schema.sql) n'avait pas de clause WITH CHECK explicite — sans elle, Postgres réutilise la clause USING (qui exige status in ('pending', 'confirmed')) pour valider aussi la ligne après modification, alors qu'annuler fait justement passer le statut à 'cancelled'. La base rejetait donc silencieusement toute tentative, sans qu'aucune erreur ne remonte à l'écran (aucune gestion d'erreur câblée sur ce bouton) — confirmé en conditions réelles avant correction, puis vérifié fonctionnel après. (3) Contrainte unique (migration 070) : une fois l'annulation débloquée, un créneau libéré s'affichait comme disponible (get_booked_slots exclut déjà les RDV annulés) mais restait en réalité impossible à re-réserver — la contrainte no_double_booking (doctor_id, start_at) ne tenait pas compte du statut, donc l'ancienne ligne annulée bloquait toujours ce créneau. Remplacée par un index unique partiel filtré sur ('pending', 'confirmed'), même filtre que get_booked_slots. Testé de bout en bout : annulation patient effective, puis re-réservation du même créneau réussie. 361 tests au total.</w:t>
+      </w:r>
+    </w:p>
+    <w:p>
+      <w:pPr>
+        <w:spacing w:after="160" w:line="300"/>
+      </w:pPr>
+      <w:r>
+        <w:t xml:space="preserve">Complément du 07/08/2026 : le motif « deux arborescences JSX parallèles, bascule en CSS » utilisé par l'interface mobile patient (section 6.9) a un piège spécifique — un composant dont un effet dépend d'une ressource globale unique (par exemple un nom de canal Supabase Realtime fixe) échoue silencieusement si les deux arborescences sont montées en parallèle, même si une seule est visible : les deux instances existent bel et bien dans le DOM. Repéré sur NotificationBell (monté à la fois par la Navbar desktop et le MobileHeader mobile), corrigé en suffixant le nom du canal par l'id utilisateur et une chaîne aléatoire à chaque montage plutôt qu'un nom fixe.</w:t>
       </w:r>
     </w:p>
     <w:sectPr>

</xml_diff>

<commit_message>
Met à jour le cahier des charges (v1.43) avec les évolutions du 09/08/2026
Favoris praticiens, annulation de RDV côté praticien avec notification
patient (in-app/email/SMS), correctif de redirection post-connexion,
logo Animéaux dans les emails, et décision produit de ne pas poursuivre
BIMI pour l'instant.

Co-Authored-By: Claude Sonnet 5 <noreply@anthropic.com>
</commit_message>
<xml_diff>
--- a/cahier_des_charges_animeaux.docx
+++ b/cahier_des_charges_animeaux.docx
@@ -58,7 +58,7 @@
           <w:sz w:val="22"/>
           <w:szCs w:val="22"/>
         </w:rPr>
-        <w:t>Version 1.42 — document mis à jour avec les évolutions de juillet et août 2026 (vérification des praticiens par documents, correctif critique inscriptions, espace secrétariat en compte dédié, statut administrateur découplé du rôle, tableau de bord admin complet, domaine d'envoi Resend vérifié, carte Leaflet sur la fiche praticien avec géocodage des cabinets, domaine monanimeaux.fr connecté au site et indexé par Google, modération avancée admin, rappels de RDV par SMS, liste d'attente, rappels de vaccin proactifs, statistiques praticien, 361 tests unitaires, code-splitting par route, PWA installable, référencement de base, découpage vendor du bundle, réponse du praticien aux avis, export .ics du RDV, carnet de santé exportable, tri par prochaine disponibilité en recherche, notifications push navigateur, email + SMS de confirmation immédiate à la réservation, pages légales finalisées avec le SIRET, annulation de RDV patient corrigée, interface mobile dédiée pour l'espace patient avec recherche à deux champs et cartes animaux en bannière photo)</w:t>
+        <w:t>Version 1.43 — document mis à jour avec les évolutions de juillet et août 2026 (vérification des praticiens par documents, correctif critique inscriptions, espace secrétariat en compte dédié, statut administrateur découplé du rôle, tableau de bord admin complet, domaine d'envoi Resend vérifié, carte Leaflet sur la fiche praticien avec géocodage des cabinets, domaine monanimeaux.fr connecté au site et indexé par Google, modération avancée admin, rappels de RDV par SMS, liste d'attente, rappels de vaccin proactifs, statistiques praticien, 361 tests unitaires, code-splitting par route, PWA installable, référencement de base, découpage vendor du bundle, réponse du praticien aux avis, export .ics du RDV, carnet de santé exportable, tri par prochaine disponibilité en recherche, notifications push navigateur, email + SMS de confirmation immédiate à la réservation, pages légales finalisées avec le SIRET, annulation de RDV patient corrigée, interface mobile dédiée pour l'espace patient avec recherche à deux champs et cartes animaux en bannière photo, rappel automatique pour laisser un avis après un RDV terminé, favoris praticiens, annulation de RDV côté praticien avec notification patient (in-app, email, SMS), correctif de redirection post-connexion, logo Animéaux dans tous les emails transactionnels)</w:t>
       </w:r>
     </w:p>
     <w:p>
@@ -4517,6 +4517,14 @@
     </w:p>
     <w:p>
       <w:pPr>
+        <w:spacing w:after="160" w:line="300"/>
+      </w:pPr>
+      <w:r>
+        <w:t xml:space="preserve">Mise à jour du 09/08/2026 : ajout des favoris praticiens (icône étoile sur la fiche praticien, table favorites en RLS « propriétaire seul » — migration 073), affichés en tête de l'accueil mobile patient dans une section « ⭐ Mes favoris » au-dessus de « Derniers praticiens consultés » (les deux réutilisent désormais le même composant DoctorMiniRow). Le praticien peut désormais annuler un rendez-vous confirmé (bouton « Annuler » avec confirmation sur AppointmentCard) ; le patient en est averti sur trois canaux : notification in-app (trigger SQL sur appointments, migration 074, ne se déclenche que si l'annulation vient bien du praticien et pas d'une auto-annulation du patient), email et SMS (nouvelle fonction Edge send-appointment-cancellation, déclenchée par un second trigger pg_net/Vault sur l'insertion de la notification, migration 075 — même mécanisme que le trigger email de la liste d'attente). Correctif : un lien vers une page protégée par ProtectedRoute (ex. « Voir mes rendez-vous » dans un email) ouvert sans session active perdait sa destination après connexion et renvoyait systématiquement vers le tableau de bord par défaut du rôle ; ProtectedRoute transmet désormais la page d'origine via /login?redirect=..., et LoginPage y renvoie après connexion réussie. Le logo Animéaux (https://monanimeaux.fr/pwa-192.png) a été ajouté en en-tête du corps de tous les emails envoyés par l'application (confirmation et annulation de RDV, rappel de RDV, rappel de vaccin, rappel d'avis, liste d'attente, invitation secrétariat), qui n'affichaient auparavant qu'un titre texte.</w:t>
+      </w:r>
+    </w:p>
+    <w:p>
+      <w:pPr>
         <w:pStyle w:val="Heading2"/>
         <w:spacing w:after="150" w:before="300"/>
       </w:pPr>
@@ -7255,6 +7263,14 @@
       </w:pPr>
       <w:r>
         <w:t xml:space="preserve">Complément du 07/08/2026 : le motif « deux arborescences JSX parallèles, bascule en CSS » utilisé par l'interface mobile patient (section 6.9) a un piège spécifique — un composant dont un effet dépend d'une ressource globale unique (par exemple un nom de canal Supabase Realtime fixe) échoue silencieusement si les deux arborescences sont montées en parallèle, même si une seule est visible : les deux instances existent bel et bien dans le DOM. Repéré sur NotificationBell (monté à la fois par la Navbar desktop et le MobileHeader mobile), corrigé en suffixant le nom du canal par l'id utilisateur et une chaîne aléatoire à chaque montage plutôt qu'un nom fixe.</w:t>
+      </w:r>
+    </w:p>
+    <w:p>
+      <w:pPr>
+        <w:spacing w:after="160" w:line="300"/>
+      </w:pPr>
+      <w:r>
+        <w:t xml:space="preserve">Complément du 09/08/2026 : les emails transactionnels envoyés en réaction à une notification (liste d'attente, annulation de RDV par le praticien) suivent tous le même schéma — un trigger SQL after insert on notifications, filtré par type via une clause WHEN, appelle une fonction Edge dédiée en HTTP via pg_net, authentifiée avec le secret Vault service_role_key (le même secret pour toutes ces fonctions, créé une seule fois). Sans ce secret Vault configuré, le trigger part quand même (il ne bloque jamais l'insertion de la notification elle-même) mais l'appel HTTP est silencieusement sauté — aucune erreur visible, juste rien qui part. Décision produit du 09/08/2026 : BIMI (logo affiché comme avatar expéditeur dans Gmail) volontairement écarté pour l'instant — Gmail exige un VMC payant (~1000-1500€/an) adossé à une marque déposée à l'INPI, distincte du SIRET/RCS déjà obtenu ; le logo reste en revanche affiché dans le corps de chaque email (voir section 6.9).</w:t>
       </w:r>
     </w:p>
     <w:sectPr>

</xml_diff>

<commit_message>
Met à jour le cahier des charges (v1.44) : bannière push et report de RDV
Documente la bannière d'invitation aux notifications push, le report de
RDV côté praticien, et la leçon retenue sur les tests (relancer npm run
test après toute modif d'un composant partagé, pas seulement le build).

Co-Authored-By: Claude Sonnet 5 <noreply@anthropic.com>
</commit_message>
<xml_diff>
--- a/cahier_des_charges_animeaux.docx
+++ b/cahier_des_charges_animeaux.docx
@@ -58,7 +58,7 @@
           <w:sz w:val="22"/>
           <w:szCs w:val="22"/>
         </w:rPr>
-        <w:t>Version 1.43 — document mis à jour avec les évolutions de juillet et août 2026 (vérification des praticiens par documents, correctif critique inscriptions, espace secrétariat en compte dédié, statut administrateur découplé du rôle, tableau de bord admin complet, domaine d'envoi Resend vérifié, carte Leaflet sur la fiche praticien avec géocodage des cabinets, domaine monanimeaux.fr connecté au site et indexé par Google, modération avancée admin, rappels de RDV par SMS, liste d'attente, rappels de vaccin proactifs, statistiques praticien, 361 tests unitaires, code-splitting par route, PWA installable, référencement de base, découpage vendor du bundle, réponse du praticien aux avis, export .ics du RDV, carnet de santé exportable, tri par prochaine disponibilité en recherche, notifications push navigateur, email + SMS de confirmation immédiate à la réservation, pages légales finalisées avec le SIRET, annulation de RDV patient corrigée, interface mobile dédiée pour l'espace patient avec recherche à deux champs et cartes animaux en bannière photo, rappel automatique pour laisser un avis après un RDV terminé, favoris praticiens, annulation de RDV côté praticien avec notification patient (in-app, email, SMS), correctif de redirection post-connexion, logo Animéaux dans tous les emails transactionnels)</w:t>
+        <w:t>Version 1.44 — document mis à jour avec les évolutions de juillet et août 2026 (vérification des praticiens par documents, correctif critique inscriptions, espace secrétariat en compte dédié, statut administrateur découplé du rôle, tableau de bord admin complet, domaine d'envoi Resend vérifié, carte Leaflet sur la fiche praticien avec géocodage des cabinets, domaine monanimeaux.fr connecté au site et indexé par Google, modération avancée admin, rappels de RDV par SMS, liste d'attente, rappels de vaccin proactifs, statistiques praticien, 361 tests unitaires, code-splitting par route, PWA installable, référencement de base, découpage vendor du bundle, réponse du praticien aux avis, export .ics du RDV, carnet de santé exportable, tri par prochaine disponibilité en recherche, notifications push navigateur, email + SMS de confirmation immédiate à la réservation, pages légales finalisées avec le SIRET, annulation de RDV patient corrigée, interface mobile dédiée pour l'espace patient avec recherche à deux champs et cartes animaux en bannière photo, rappel automatique pour laisser un avis après un RDV terminé, favoris praticiens, annulation de RDV côté praticien avec notification patient (in-app, email, SMS), correctif de redirection post-connexion, logo Animéaux dans tous les emails transactionnels)</w:t>
       </w:r>
     </w:p>
     <w:p>
@@ -4525,6 +4525,14 @@
     </w:p>
     <w:p>
       <w:pPr>
+        <w:spacing w:after="160" w:line="300"/>
+      </w:pPr>
+      <w:r>
+        <w:t xml:space="preserve">Complément du 09/08/2026 (soir) : deux nouvelles fonctionnalités côté rendez-vous. Une bannière discrète et fermable invite désormais à activer les notifications push (réglage qui existait déjà dans Profil / Mon espace mais que personne n'activait spontanément) sur l'accueil patient et praticien — se cache dès que l'utilisateur est abonné, a refusé la permission navigateur, ou a cliqué « Plus tard » (mémorisé en local). Le praticien peut désormais reporter un rendez-vous confirmé vers un nouveau créneau (bouton « Reporter » sur AppointmentCard, réutilise le composant AvailabilityCalendar de la réservation patient) plutôt que de devoir l'annuler purement et simplement ; le nouveau créneau est appliqué directement, sans étape de validation par le patient, qui est simplement notifié du changement sur les trois mêmes canaux que l'annulation (in-app, email, SMS — nouvelle fonction Edge send-appointment-reschedule, migrations 076/077).</w:t>
+      </w:r>
+    </w:p>
+    <w:p>
+      <w:pPr>
         <w:pStyle w:val="Heading2"/>
         <w:spacing w:after="150" w:before="300"/>
       </w:pPr>
@@ -7271,6 +7279,14 @@
       </w:pPr>
       <w:r>
         <w:t xml:space="preserve">Complément du 09/08/2026 : les emails transactionnels envoyés en réaction à une notification (liste d'attente, annulation de RDV par le praticien) suivent tous le même schéma — un trigger SQL after insert on notifications, filtré par type via une clause WHEN, appelle une fonction Edge dédiée en HTTP via pg_net, authentifiée avec le secret Vault service_role_key (le même secret pour toutes ces fonctions, créé une seule fois). Sans ce secret Vault configuré, le trigger part quand même (il ne bloque jamais l'insertion de la notification elle-même) mais l'appel HTTP est silencieusement sauté — aucune erreur visible, juste rien qui part. Décision produit du 09/08/2026 : BIMI (logo affiché comme avatar expéditeur dans Gmail) volontairement écarté pour l'instant — Gmail exige un VMC payant (~1000-1500€/an) adossé à une marque déposée à l'INPI, distincte du SIRET/RCS déjà obtenu ; le logo reste en revanche affiché dans le corps de chaque email (voir section 6.9).</w:t>
+      </w:r>
+    </w:p>
+    <w:p>
+      <w:pPr>
+        <w:spacing w:after="160" w:line="300"/>
+      </w:pPr>
+      <w:r>
+        <w:t xml:space="preserve">Complément du 09/08/2026 (soir), leçon de tests : deux évolutions faites plus tôt dans la journée (le correctif de redirection post-connexion sur ProtectedRoute, et la navigation au clic sur une notification dans NotificationBell) avaient chacune introduit un hook de react-router-dom (useLocation, useNavigate) sans jamais relancer la suite de tests — deux fichiers de tests préexistants (ProtectedRoute.test.tsx, NotificationBell.test.tsx) ne fournissaient pas de contexte Router et se sont mis à planter en cascade (17 tests) une fois la suite complète relancée. Corrigé en ajoutant le contexte manquant (mock ciblé de useLocation pour le premier, MemoryRouter pour le second) et en mettant à jour les assertions devenues obsolètes (nom de canal Realtime dynamique, paramètre ?redirect= sur l'URL de connexion). Retenu comme rappel : relancer npm run test après toute modification d'un composant partagé, pas seulement npm run build.</w:t>
       </w:r>
     </w:p>
     <w:sectPr>

</xml_diff>

<commit_message>
Met à jour le cahier des charges (v1.45) : confirmation de présence RDV
Documente la confirmation de présence patient sur le rappel de RDV à 24h
(page publique /confirmer-presence/:id, fonction Edge dédiée, badge
côté praticien), testée et validée de bout en bout le 10/08/2026.

Co-Authored-By: Claude Sonnet 5 <noreply@anthropic.com>
</commit_message>
<xml_diff>
--- a/cahier_des_charges_animeaux.docx
+++ b/cahier_des_charges_animeaux.docx
@@ -58,7 +58,7 @@
           <w:sz w:val="22"/>
           <w:szCs w:val="22"/>
         </w:rPr>
-        <w:t>Version 1.44 — document mis à jour avec les évolutions de juillet et août 2026 (vérification des praticiens par documents, correctif critique inscriptions, espace secrétariat en compte dédié, statut administrateur découplé du rôle, tableau de bord admin complet, domaine d'envoi Resend vérifié, carte Leaflet sur la fiche praticien avec géocodage des cabinets, domaine monanimeaux.fr connecté au site et indexé par Google, modération avancée admin, rappels de RDV par SMS, liste d'attente, rappels de vaccin proactifs, statistiques praticien, 361 tests unitaires, code-splitting par route, PWA installable, référencement de base, découpage vendor du bundle, réponse du praticien aux avis, export .ics du RDV, carnet de santé exportable, tri par prochaine disponibilité en recherche, notifications push navigateur, email + SMS de confirmation immédiate à la réservation, pages légales finalisées avec le SIRET, annulation de RDV patient corrigée, interface mobile dédiée pour l'espace patient avec recherche à deux champs et cartes animaux en bannière photo, rappel automatique pour laisser un avis après un RDV terminé, favoris praticiens, annulation de RDV côté praticien avec notification patient (in-app, email, SMS), correctif de redirection post-connexion, logo Animéaux dans tous les emails transactionnels)</w:t>
+        <w:t>Version 1.45 — document mis à jour avec les évolutions de juillet et août 2026 (vérification des praticiens par documents, correctif critique inscriptions, espace secrétariat en compte dédié, statut administrateur découplé du rôle, tableau de bord admin complet, domaine d'envoi Resend vérifié, carte Leaflet sur la fiche praticien avec géocodage des cabinets, domaine monanimeaux.fr connecté au site et indexé par Google, modération avancée admin, rappels de RDV par SMS, liste d'attente, rappels de vaccin proactifs, statistiques praticien, 361 tests unitaires, code-splitting par route, PWA installable, référencement de base, découpage vendor du bundle, réponse du praticien aux avis, export .ics du RDV, carnet de santé exportable, tri par prochaine disponibilité en recherche, notifications push navigateur, email + SMS de confirmation immédiate à la réservation, pages légales finalisées avec le SIRET, annulation de RDV patient corrigée, interface mobile dédiée pour l'espace patient avec recherche à deux champs et cartes animaux en bannière photo, rappel automatique pour laisser un avis après un RDV terminé, favoris praticiens, annulation de RDV côté praticien avec notification patient (in-app, email, SMS), correctif de redirection post-connexion, logo Animéaux dans tous les emails transactionnels)</w:t>
       </w:r>
     </w:p>
     <w:p>
@@ -7287,6 +7287,14 @@
       </w:pPr>
       <w:r>
         <w:t xml:space="preserve">Complément du 09/08/2026 (soir), leçon de tests : deux évolutions faites plus tôt dans la journée (le correctif de redirection post-connexion sur ProtectedRoute, et la navigation au clic sur une notification dans NotificationBell) avaient chacune introduit un hook de react-router-dom (useLocation, useNavigate) sans jamais relancer la suite de tests — deux fichiers de tests préexistants (ProtectedRoute.test.tsx, NotificationBell.test.tsx) ne fournissaient pas de contexte Router et se sont mis à planter en cascade (17 tests) une fois la suite complète relancée. Corrigé en ajoutant le contexte manquant (mock ciblé de useLocation pour le premier, MemoryRouter pour le second) et en mettant à jour les assertions devenues obsolètes (nom de canal Realtime dynamique, paramètre ?redirect= sur l'URL de connexion). Retenu comme rappel : relancer npm run test après toute modification d'un composant partagé, pas seulement npm run build.</w:t>
+      </w:r>
+    </w:p>
+    <w:p>
+      <w:pPr>
+        <w:spacing w:after="160" w:line="300"/>
+      </w:pPr>
+      <w:r>
+        <w:t xml:space="preserve">Complément du 10/08/2026 : ajout d'une confirmation de présence patient sur le rappel de RDV à 24h — un bouton « Je confirme ma présence » dans l'email de rappel renvoie vers une page publique (/confirmer-presence/:id, hors ProtectedRoute puisque cliquée depuis un email, souvent sans session active sur cet appareil), qui appelle une fonction Edge dédiée (confirm-appointment-presence, l'UUID du RDV servant de jeton d'accès non devinable). Objectif : réduire le no-show et donner au praticien une visibilité avant l'heure du RDV, matérialisée par un badge « ✓ Présence confirmée par le patient » sur AppointmentCard. Nouvelle colonne appointments.confirmed_by_patient_at (migration 078).</w:t>
       </w:r>
     </w:p>
     <w:sectPr>

</xml_diff>

<commit_message>
Met à jour le cahier des charges (v1.46) : refonte navigation praticien
Documente la fusion RDV/Disponibilités, l'indicateur de fidélité sur
Mes patients, le bouton de déconnexion en fin de Profil, la nouvelle
barre d'onglets mobile praticien (DoctorMobileTabBar), et le correctif
viewport-fit=cover.

Co-Authored-By: Claude Sonnet 5 <noreply@anthropic.com>
</commit_message>
<xml_diff>
--- a/cahier_des_charges_animeaux.docx
+++ b/cahier_des_charges_animeaux.docx
@@ -58,7 +58,7 @@
           <w:sz w:val="22"/>
           <w:szCs w:val="22"/>
         </w:rPr>
-        <w:t>Version 1.45 — document mis à jour avec les évolutions de juillet et août 2026 (vérification des praticiens par documents, correctif critique inscriptions, espace secrétariat en compte dédié, statut administrateur découplé du rôle, tableau de bord admin complet, domaine d'envoi Resend vérifié, carte Leaflet sur la fiche praticien avec géocodage des cabinets, domaine monanimeaux.fr connecté au site et indexé par Google, modération avancée admin, rappels de RDV par SMS, liste d'attente, rappels de vaccin proactifs, statistiques praticien, 361 tests unitaires, code-splitting par route, PWA installable, référencement de base, découpage vendor du bundle, réponse du praticien aux avis, export .ics du RDV, carnet de santé exportable, tri par prochaine disponibilité en recherche, notifications push navigateur, email + SMS de confirmation immédiate à la réservation, pages légales finalisées avec le SIRET, annulation de RDV patient corrigée, interface mobile dédiée pour l'espace patient avec recherche à deux champs et cartes animaux en bannière photo, rappel automatique pour laisser un avis après un RDV terminé, favoris praticiens, annulation de RDV côté praticien avec notification patient (in-app, email, SMS), correctif de redirection post-connexion, logo Animéaux dans tous les emails transactionnels)</w:t>
+        <w:t>Version 1.46 — document mis à jour avec les évolutions de juillet et août 2026 (vérification des praticiens par documents, correctif critique inscriptions, espace secrétariat en compte dédié, statut administrateur découplé du rôle, tableau de bord admin complet, domaine d'envoi Resend vérifié, carte Leaflet sur la fiche praticien avec géocodage des cabinets, domaine monanimeaux.fr connecté au site et indexé par Google, modération avancée admin, rappels de RDV par SMS, liste d'attente, rappels de vaccin proactifs, statistiques praticien, 361 tests unitaires, code-splitting par route, PWA installable, référencement de base, découpage vendor du bundle, réponse du praticien aux avis, export .ics du RDV, carnet de santé exportable, tri par prochaine disponibilité en recherche, notifications push navigateur, email + SMS de confirmation immédiate à la réservation, pages légales finalisées avec le SIRET, annulation de RDV patient corrigée, interface mobile dédiée pour l'espace patient avec recherche à deux champs et cartes animaux en bannière photo, rappel automatique pour laisser un avis après un RDV terminé, favoris praticiens, annulation de RDV côté praticien avec notification patient (in-app, email, SMS), correctif de redirection post-connexion, logo Animéaux dans tous les emails transactionnels)</w:t>
       </w:r>
     </w:p>
     <w:p>
@@ -4655,7 +4655,7 @@
         <w:spacing w:after="160" w:line="300"/>
       </w:pPr>
       <w:r>
-        <w:t>Le tableau de bord praticien est organisé en huit onglets, pilotés par le paramètre d'URL ?tab= et le type DoctorTab (src/lib/doctorDashboardTabs.ts). Six onglets sont visibles directement dans la barre de navigation (Accueil, Mes patients, Tarifs, Disponibilités, Avis, Statistiques) ; les deux autres (Profil, Messages) sont accessibles via les icônes de la barre de navigation plutôt que par un onglet dédié.</w:t>
+        <w:t>Le tableau de bord praticien est organisé en huit onglets, pilotés par le paramètre d'URL ?tab= et le type DoctorTab (src/lib/doctorDashboardTabs.ts). Six onglets sont visibles directement dans la barre de navigation (Accueil, Mes patients, Tarifs, RDV, Avis, Statistiques) ; les deux autres (Profil, Messages) sont accessibles via les icônes de la barre de navigation plutôt que par un onglet dédié.</w:t>
       </w:r>
     </w:p>
     <w:p>
@@ -4672,7 +4672,7 @@
         <w:spacing w:after="160" w:line="300"/>
       </w:pPr>
       <w:r>
-        <w:t xml:space="preserve">Bannière du prochain rendez-vous, quatre cartes d'indicateurs clés (KPI), un mini calendrier de la semaine, une liste de rendez-vous filtrable (aujourd'hui / cette semaine / tous / jour sélectionné) et un encart latéral récapitulant le profil.</w:t>
+        <w:t xml:space="preserve">Aperçu léger : bannière du prochain rendez-vous, quatre cartes d'indicateurs clés (KPI), un encart récapitulant le profil et un bloc d'actions rapides. Le mini calendrier et la liste détaillée des rendez-vous ont déménagé dans l'onglet RDV (7.4) le 14/08/2026, pour ne pas dupliquer le même contenu sur deux onglets.</w:t>
       </w:r>
     </w:p>
     <w:p>
@@ -4715,15 +4715,15 @@
         <w:spacing w:after="150" w:before="300"/>
       </w:pPr>
       <w:r>
-        <w:t xml:space="preserve">7.4 Disponibilités</w:t>
-      </w:r>
-    </w:p>
-    <w:p>
-      <w:pPr>
-        <w:spacing w:after="160" w:line="300"/>
-      </w:pPr>
-      <w:r>
-        <w:t xml:space="preserve">Deux volets : les créneaux hebdomadaires personnels et les congés (blocked_slots) du praticien, et un sous-onglet « Partagées » dédié au cabinet — création d'un nouveau cabinet ou adhésion à un cabinet existant via un code d'invitation, puis, une fois membre, un calendrier d'équipe complet (sélecteur de jour + grille horaire, une colonne par praticien membre, cellules de rendez-vous cliquables ouvrant une fenêtre de détail, jours de congé signalés par l'icône 🌴).</w:t>
+        <w:t xml:space="preserve">7.4 RDV</w:t>
+      </w:r>
+    </w:p>
+    <w:p>
+      <w:pPr>
+        <w:spacing w:after="160" w:line="300"/>
+      </w:pPr>
+      <w:r>
+        <w:t xml:space="preserve">Depuis le 14/08/2026, regroupe sur une seule page ce qui vivait auparavant sur deux onglets distincts. En haut : le mini calendrier de la semaine et la liste des rendez-vous filtrable (aujourd'hui / cette semaine / tous / jour sélectionné), identiques à ce qu'affichait l'onglet Accueil avant ce changement. Tout en bas de la même page : la gestion des disponibilités, sur deux volets — les créneaux hebdomadaires personnels et les congés (blocked_slots) du praticien, et un sous-onglet « Partagées » dédié au cabinet (création d'un nouveau cabinet ou adhésion à un cabinet existant via un code d'invitation, puis, une fois membre, un calendrier d'équipe complet — sélecteur de jour + grille horaire, une colonne par praticien membre, cellules de rendez-vous cliquables ouvrant une fenêtre de détail, jours de congé signalés par l'icône 🌴). L'id technique de l'onglet (disponibilites) est resté inchangé pour ne pas casser les liens ?tab=disponibilites déjà en place ailleurs dans le code.</w:t>
       </w:r>
     </w:p>
     <w:p>
@@ -7279,6 +7279,14 @@
       </w:pPr>
       <w:r>
         <w:t xml:space="preserve">Complément du 09/08/2026 : les emails transactionnels envoyés en réaction à une notification (liste d'attente, annulation de RDV par le praticien) suivent tous le même schéma — un trigger SQL after insert on notifications, filtré par type via une clause WHEN, appelle une fonction Edge dédiée en HTTP via pg_net, authentifiée avec le secret Vault service_role_key (le même secret pour toutes ces fonctions, créé une seule fois). Sans ce secret Vault configuré, le trigger part quand même (il ne bloque jamais l'insertion de la notification elle-même) mais l'appel HTTP est silencieusement sauté — aucune erreur visible, juste rien qui part. Décision produit du 09/08/2026 : BIMI (logo affiché comme avatar expéditeur dans Gmail) volontairement écarté pour l'instant — Gmail exige un VMC payant (~1000-1500€/an) adossé à une marque déposée à l'INPI, distincte du SIRET/RCS déjà obtenu ; le logo reste en revanche affiché dans le corps de chaque email (voir section 6.9).</w:t>
+      </w:r>
+    </w:p>
+    <w:p>
+      <w:pPr>
+        <w:spacing w:after="160" w:line="300"/>
+      </w:pPr>
+      <w:r>
+        <w:t xml:space="preserve">Complément du 14/08/2026 : plusieurs ajustements côté praticien. « Mes patients » affiche désormais un indicateur de fidélité par propriétaire (nombre de rendez-vous et date du dernier, tous confrères du cabinet confondus) sous chaque animal, calculé côté client à partir des données déjà chargées par useDoctorPatientAnimals, sans requête supplémentaire. Un bouton de déconnexion a été ajouté tout en bas de l'onglet Profil ; celui de la Navbar (en haut) est désormais masqué sur mobile pour ce rôle spécifiquement (patient/admin/secrétariat n'ayant pas cette alternative, ils gardent le bouton du haut). Les six onglets du dashboard, auparavant uniquement dans la Navbar du haut (illisibles sur petit écran), sont repris dans une barre dédiée en bas d'écran sur mobile (DoctorMobileTabBar, masquée sur desktop) — validée en aperçu (option « fond teinté + repère sous l'onglet actif ») avant implémentation. Enfin, ajout de viewport-fit=cover dans index.html : sans lui, env(safe-area-inset-bottom) restait bloqué à 0 sur iOS, et les barres du bas (patient comme praticien) n'avaient donc jamais de vraie marge de sécurité au-dessus de l'indicateur d'accueil — chevauchement corrigé pour les deux.</w:t>
       </w:r>
     </w:p>
     <w:p>

</xml_diff>

<commit_message>
Met à jour le cahier des charges (v1.47) : historique patient + debug rappel avis
Documente useMyHistoryWithDoctor (fiche praticien) et le diagnostic du
rappel "laisser un avis" (redéploiement en retard, calage du test sur
l'horaire exact du cron).

Co-Authored-By: Claude Sonnet 5 <noreply@anthropic.com>
</commit_message>
<xml_diff>
--- a/cahier_des_charges_animeaux.docx
+++ b/cahier_des_charges_animeaux.docx
@@ -58,7 +58,7 @@
           <w:sz w:val="22"/>
           <w:szCs w:val="22"/>
         </w:rPr>
-        <w:t>Version 1.46 — document mis à jour avec les évolutions de juillet et août 2026 (vérification des praticiens par documents, correctif critique inscriptions, espace secrétariat en compte dédié, statut administrateur découplé du rôle, tableau de bord admin complet, domaine d'envoi Resend vérifié, carte Leaflet sur la fiche praticien avec géocodage des cabinets, domaine monanimeaux.fr connecté au site et indexé par Google, modération avancée admin, rappels de RDV par SMS, liste d'attente, rappels de vaccin proactifs, statistiques praticien, 361 tests unitaires, code-splitting par route, PWA installable, référencement de base, découpage vendor du bundle, réponse du praticien aux avis, export .ics du RDV, carnet de santé exportable, tri par prochaine disponibilité en recherche, notifications push navigateur, email + SMS de confirmation immédiate à la réservation, pages légales finalisées avec le SIRET, annulation de RDV patient corrigée, interface mobile dédiée pour l'espace patient avec recherche à deux champs et cartes animaux en bannière photo, rappel automatique pour laisser un avis après un RDV terminé, favoris praticiens, annulation de RDV côté praticien avec notification patient (in-app, email, SMS), correctif de redirection post-connexion, logo Animéaux dans tous les emails transactionnels)</w:t>
+        <w:t>Version 1.47 — document mis à jour avec les évolutions de juillet et août 2026 (vérification des praticiens par documents, correctif critique inscriptions, espace secrétariat en compte dédié, statut administrateur découplé du rôle, tableau de bord admin complet, domaine d'envoi Resend vérifié, carte Leaflet sur la fiche praticien avec géocodage des cabinets, domaine monanimeaux.fr connecté au site et indexé par Google, modération avancée admin, rappels de RDV par SMS, liste d'attente, rappels de vaccin proactifs, statistiques praticien, 361 tests unitaires, code-splitting par route, PWA installable, référencement de base, découpage vendor du bundle, réponse du praticien aux avis, export .ics du RDV, carnet de santé exportable, tri par prochaine disponibilité en recherche, notifications push navigateur, email + SMS de confirmation immédiate à la réservation, pages légales finalisées avec le SIRET, annulation de RDV patient corrigée, interface mobile dédiée pour l'espace patient avec recherche à deux champs et cartes animaux en bannière photo, rappel automatique pour laisser un avis après un RDV terminé, favoris praticiens, annulation de RDV côté praticien avec notification patient (in-app, email, SMS), correctif de redirection post-connexion, logo Animéaux dans tous les emails transactionnels)</w:t>
       </w:r>
     </w:p>
     <w:p>
@@ -7287,6 +7287,14 @@
       </w:pPr>
       <w:r>
         <w:t xml:space="preserve">Complément du 14/08/2026 : plusieurs ajustements côté praticien. « Mes patients » affiche désormais un indicateur de fidélité par propriétaire (nombre de rendez-vous et date du dernier, tous confrères du cabinet confondus) sous chaque animal, calculé côté client à partir des données déjà chargées par useDoctorPatientAnimals, sans requête supplémentaire. Un bouton de déconnexion a été ajouté tout en bas de l'onglet Profil ; celui de la Navbar (en haut) est désormais masqué sur mobile pour ce rôle spécifiquement (patient/admin/secrétariat n'ayant pas cette alternative, ils gardent le bouton du haut). Les six onglets du dashboard, auparavant uniquement dans la Navbar du haut (illisibles sur petit écran), sont repris dans une barre dédiée en bas d'écran sur mobile (DoctorMobileTabBar, masquée sur desktop) — validée en aperçu (option « fond teinté + repère sous l'onglet actif ») avant implémentation. Enfin, ajout de viewport-fit=cover dans index.html : sans lui, env(safe-area-inset-bottom) restait bloqué à 0 sur iOS, et les barres du bas (patient comme praticien) n'avaient donc jamais de vraie marge de sécurité au-dessus de l'indicateur d'accueil — chevauchement corrigé pour les deux.</w:t>
+      </w:r>
+    </w:p>
+    <w:p>
+      <w:pPr>
+        <w:spacing w:after="160" w:line="300"/>
+      </w:pPr>
+      <w:r>
+        <w:t xml:space="preserve">Complément du 14/08/2026 (suite) : ajout, sur la fiche publique d'un praticien, d'un rappel d'historique pour le patient connecté (« Vous avez déjà consulté ce praticien X fois, dernier RDV le... »), symétrique à l'indicateur de fidélité ajouté côté praticien plus tôt dans la journée — nouveau hook useMyHistoryWithDoctor, requête dédiée sur un seul doctor_id plutôt que de réutiliser la liste complète des rendez-vous du patient. Par ailleurs, vérification en conditions réelles du rappel « laisser un avis » (send-reminders) : le code avait de nouveau 5 jours de retard sur le dépôt (le lien de confirmation de présence, ajouté entre-temps, n'était jamais parti en prod malgré un premier échange à ce sujet) — redéployé. Le test par antidatation de completed_at a d'abord raté sa fenêtre : le cron `send-reminders-hourly` (vérifié via `select * from cron.job`) tourne à l'heure ronde exacte (`0 * * * *`), pas N minutes après le déclenchement du test — la requête de test a été ajustée pour se caler sur `date_trunc('hour', now()) + interval '1 hour'` plutôt que sur `now()`, afin de retomber au centre de la fenêtre de 3 à 4h quelle que soit l'heure à laquelle le test est lancé.</w:t>
       </w:r>
     </w:p>
     <w:p>

</xml_diff>

<commit_message>
Docs: consigne l'audit du 08/09 dans le cahier des charges
Deux entrées ajoutées en section 13 : le vrai mécanisme du bug
PASSWORD_RECOVERY (timing du listener onAuthStateChange) et le
garde-fou OVH/Resend backporté sur les deux Edge Functions qui ne
l'avaient pas encore.

Co-Authored-By: Claude Sonnet 5 <noreply@anthropic.com>
</commit_message>
<xml_diff>
--- a/cahier_des_charges_animeaux.docx
+++ b/cahier_des_charges_animeaux.docx
@@ -7311,6 +7311,22 @@
       </w:pPr>
       <w:r>
         <w:t xml:space="preserve">Complément du 10/08/2026 : ajout d'une confirmation de présence patient sur le rappel de RDV à 24h — un bouton « Je confirme ma présence » dans l'email de rappel renvoie vers une page publique (/confirmer-presence/:id, hors ProtectedRoute puisque cliquée depuis un email, souvent sans session active sur cet appareil), qui appelle une fonction Edge dédiée (confirm-appointment-presence, l'UUID du RDV servant de jeton d'accès non devinable). Objectif : réduire le no-show et donner au praticien une visibilité avant l'heure du RDV, matérialisée par un badge « ✓ Présence confirmée par le patient » sur AppointmentCard. Nouvelle colonne appointments.confirmed_by_patient_at (migration 078).</w:t>
+      </w:r>
+    </w:p>
+    <w:p>
+      <w:pPr>
+        <w:spacing w:after="160" w:line="300"/>
+      </w:pPr>
+      <w:r>
+        <w:t>Complément du 08/09/2026 : audit proactif demandé par l'utilisatrice après le bug de réinitialisation de mot de passe (« ce type de problème je ne veux pas devoir les trouver moi-même »). Le correctif posé plus tôt dans la journée sur App.tsx (ignorer l'événement PASSWORD_RECOVERY pour ne pas connecter l'utilisateur depuis le lien reçu par email) reposait uniquement sur le type d'événement — or GoTrue (le client d'auth de Supabase) émet cet événement via un setTimeout à délai nul, adressé aux seuls listeners déjà abonnés à cet instant précis ; comme onAuthStateChange s'abonne dans un useEffect (donc après le premier rendu), il le manque souvent et reçoit à la place la même session rejouée sous la forme d'un INITIAL_SESSION classique, indiscernable d'une vraie connexion par le seul type d'événement. Risque résiduel identifié : un compte suspendu cliquant sur son lien de réinitialisation se faisait rediriger vers /login avant même de voir le formulaire. Corrigé en basculant le garde-fou sur le chemin affiché (window.location.pathname === '/reset-password'), vérifié avant tout traitement d'événement quel qu'il soit — ResetPassword.tsx garde en plus son propre filet de sécurité indépendant (réinitialisation du store dans un useEffect au montage).</w:t>
+      </w:r>
+    </w:p>
+    <w:p>
+      <w:pPr>
+        <w:spacing w:after="160" w:line="300"/>
+      </w:pPr>
+      <w:r>
+        <w:t>Complément du 08/09/2026 (suite) : même audit, deuxième constat — send-appointment-cancellation et send-appointment-reschedule n'avaient pas reçu le même garde-fou (délai de 10s + try/catch sur chaque appel réseau externe, OVH SMS et Resend) que send-reminders, qui l'avait déjà. Sans lui, un OVH ou un Resend lent ou en panne pouvait faire planter toute l'invocation (fetch qui ne répond jamais, AbortError non intercepté) alors que ces fonctions doivent rester best-effort — l'annulation ou le report d'un RDV ne doit jamais dépendre de la notification associée. Corrigé de façon identique dans les deux fonctions, déployées manuellement via l'éditeur en ligne du dashboard Supabase (rappel section 13 : jamais de déploiement automatique pour les Edge Functions).</w:t>
       </w:r>
     </w:p>
     <w:sectPr>

</xml_diff>

<commit_message>
Docs: consigne le correctif "Dr réservé aux vétérinaires"
Section 13 : bug signalé par l'utilisatrice, root cause (titre codé en
dur, jamais conditionné à la spécialité) et les deux points qui ne
remontaient pas encore specialty jusqu'au front (get_clinic_agenda,
usePatientDoctorDocuments).

Co-Authored-By: Claude Sonnet 5 <noreply@anthropic.com>
</commit_message>
<xml_diff>
--- a/cahier_des_charges_animeaux.docx
+++ b/cahier_des_charges_animeaux.docx
@@ -7327,6 +7327,14 @@
       </w:pPr>
       <w:r>
         <w:t>Complément du 08/09/2026 (suite) : même audit, deuxième constat — send-appointment-cancellation et send-appointment-reschedule n'avaient pas reçu le même garde-fou (délai de 10s + try/catch sur chaque appel réseau externe, OVH SMS et Resend) que send-reminders, qui l'avait déjà. Sans lui, un OVH ou un Resend lent ou en panne pouvait faire planter toute l'invocation (fetch qui ne répond jamais, AbortError non intercepté) alors que ces fonctions doivent rester best-effort — l'annulation ou le report d'un RDV ne doit jamais dépendre de la notification associée. Corrigé de façon identique dans les deux fonctions, déployées manuellement via l'éditeur en ligne du dashboard Supabase (rappel section 13 : jamais de déploiement automatique pour les Edge Functions).</w:t>
+      </w:r>
+    </w:p>
+    <w:p>
+      <w:pPr>
+        <w:spacing w:after="160" w:line="300"/>
+      </w:pPr>
+      <w:r>
+        <w:t>Complément du 08/09/2026 (bug signalé par l'utilisatrice) : le préfixe « Dr » était codé en dur partout où le nom d'un praticien apparaît — 6 Edge Functions (confirmation, annulation, report, rappel de RDV, confirmation de présence, flux calendrier ICS), le tableau de bord secrétariat et la page Rappels du patient — sans jamais tenir compte du métier réel choisi à l'inscription (practitionerTypes.ts). Une comportementaliste, un toiletteur, un éducateur canin ou tout autre métier non-vétérinaire de la liste étaient donc appelés « Dr », alors que seul un vétérinaire porte ce titre. Corrigé via une nouvelle fonction partagée formatDoctorName() (src/lib/practitionerTypes.ts), qui compare specialty (le libellé stocké en base, ex. « Vétérinaire », pas l'id) au libellé du type 'veterinaire' avant d'ajouter le titre — dupliquée localement dans chaque Edge Function comme les autres petites fonctions déjà en place (toE164, escapeHtml), les Edge Functions Deno n'important pas src/. Deux points ne remontaient pas encore la spécialité jusqu'au composant d'affichage : la RPC get_clinic_agenda (migration 089, ajoute la colonne doctor_specialty — nécessite un DROP FUNCTION préalable pour changer le row type, Postgres refusant un simple CREATE OR REPLACE dans ce cas, erreur 42P13) et le select de usePatientDoctorDocuments (specialty ajouté à l'embed doctors).</w:t>
       </w:r>
     </w:p>
     <w:sectPr>

</xml_diff>

<commit_message>
Docs: consigne la vérification du parcours praticien non-vétérinaire
Section 13 : les 4 correctifs trouvés en préparant la démo à une
comportementaliste (recherche par spécialité, motifs de RDV, placeholder
tarifs, onglets Vaccins/Poids masqués).

Co-Authored-By: Claude Sonnet 5 <noreply@anthropic.com>
</commit_message>
<xml_diff>
--- a/cahier_des_charges_animeaux.docx
+++ b/cahier_des_charges_animeaux.docx
@@ -7335,6 +7335,14 @@
       </w:pPr>
       <w:r>
         <w:t>Complément du 08/09/2026 (bug signalé par l'utilisatrice) : le préfixe « Dr » était codé en dur partout où le nom d'un praticien apparaît — 6 Edge Functions (confirmation, annulation, report, rappel de RDV, confirmation de présence, flux calendrier ICS), le tableau de bord secrétariat et la page Rappels du patient — sans jamais tenir compte du métier réel choisi à l'inscription (practitionerTypes.ts). Une comportementaliste, un toiletteur, un éducateur canin ou tout autre métier non-vétérinaire de la liste étaient donc appelés « Dr », alors que seul un vétérinaire porte ce titre. Corrigé via une nouvelle fonction partagée formatDoctorName() (src/lib/practitionerTypes.ts), qui compare specialty (le libellé stocké en base, ex. « Vétérinaire », pas l'id) au libellé du type 'veterinaire' avant d'ajouter le titre — dupliquée localement dans chaque Edge Function comme les autres petites fonctions déjà en place (toE164, escapeHtml), les Edge Functions Deno n'important pas src/. Deux points ne remontaient pas encore la spécialité jusqu'au composant d'affichage : la RPC get_clinic_agenda (migration 089, ajoute la colonne doctor_specialty — nécessite un DROP FUNCTION préalable pour changer le row type, Postgres refusant un simple CREATE OR REPLACE dans ce cas, erreur 42P13) et le select de usePatientDoctorDocuments (specialty ajouté à l'embed doctors).</w:t>
+      </w:r>
+    </w:p>
+    <w:p>
+      <w:pPr>
+        <w:spacing w:after="160" w:line="300"/>
+      </w:pPr>
+      <w:r>
+        <w:t>Complément du 08/09/2026 : vérification complète du parcours praticien non-vétérinaire en préparant une démo à une comportementaliste, quatre correctifs réels trouvés en testant en conditions réelles (recherche publique en prod, pas seulement lecture de code). (1) La recherche par spécialité (useDoctors, useData.ts) filtrait côté client par un simple specialty.includes(term) à sens unique — chercher "Comportementaliste animalier" (le libellé exact suggéré par l'autocomplétion) renvoyait 0 résultat pour une comportementaliste réellement inscrite, dont la fiche portait encore l'ancien intitulé "Comportementaliste" (renommé depuis, commit ba0133f, sans backfill des fiches existantes). Corrigé par une comparaison dans les deux sens, extraite en fonction pure et testée (matchesSpecialtySearch, src/lib/doctorSearch.ts) pour que ce type de régression silencieuse ne repasse plus inaperçu au prochain renommage de libellé métier. (2) BookPage proposait toujours les mêmes motifs de RDV vétérinaires ("Renouvellement ordonnance", "Urgence"...) quel que soit le métier du praticien réservé — remplacés par les prestations propres au métier (practitionerTypes.ts) pour tout non-vétérinaire, via un nouveau getPractitionerTypeBySpecialty (même comparaison à double sens). (3) Le placeholder "Nom (ex: Vaccination)" du formulaire d'ajout de tarif, sur le tableau de bord praticien, est du même principe adapté au métier réel. (4) Sur demande explicite de l'utilisatrice : les onglets Vaccins et Poids du dossier de santé d'un animal (AnimalHealthPage.tsx) sont désormais masqués pour tout praticien dont la spécialité n'est pas "Vétérinaire" — restent visibles pour les patients et, par défaut, tant que la spécialité du praticien connecté n'est pas encore chargée (évite un flash chez un vétérinaire).</w:t>
       </w:r>
     </w:p>
     <w:sectPr>

</xml_diff>

<commit_message>
Docs: consigne l'ajout "Nouveau RDV" + praticiens déjà consultés
Section 13.

Co-Authored-By: Claude Sonnet 5 <noreply@anthropic.com>
</commit_message>
<xml_diff>
--- a/cahier_des_charges_animeaux.docx
+++ b/cahier_des_charges_animeaux.docx
@@ -7343,6 +7343,14 @@
       </w:pPr>
       <w:r>
         <w:t>Complément du 08/09/2026 : vérification complète du parcours praticien non-vétérinaire en préparant une démo à une comportementaliste, quatre correctifs réels trouvés en testant en conditions réelles (recherche publique en prod, pas seulement lecture de code). (1) La recherche par spécialité (useDoctors, useData.ts) filtrait côté client par un simple specialty.includes(term) à sens unique — chercher "Comportementaliste animalier" (le libellé exact suggéré par l'autocomplétion) renvoyait 0 résultat pour une comportementaliste réellement inscrite, dont la fiche portait encore l'ancien intitulé "Comportementaliste" (renommé depuis, commit ba0133f, sans backfill des fiches existantes). Corrigé par une comparaison dans les deux sens, extraite en fonction pure et testée (matchesSpecialtySearch, src/lib/doctorSearch.ts) pour que ce type de régression silencieuse ne repasse plus inaperçu au prochain renommage de libellé métier. (2) BookPage proposait toujours les mêmes motifs de RDV vétérinaires ("Renouvellement ordonnance", "Urgence"...) quel que soit le métier du praticien réservé — remplacés par les prestations propres au métier (practitionerTypes.ts) pour tout non-vétérinaire, via un nouveau getPractitionerTypeBySpecialty (même comparaison à double sens). (3) Le placeholder "Nom (ex: Vaccination)" du formulaire d'ajout de tarif, sur le tableau de bord praticien, est du même principe adapté au métier réel. (4) Sur demande explicite de l'utilisatrice : les onglets Vaccins et Poids du dossier de santé d'un animal (AnimalHealthPage.tsx) sont désormais masqués pour tout praticien dont la spécialité n'est pas "Vétérinaire" — restent visibles pour les patients et, par défaut, tant que la spécialité du praticien connecté n'est pas encore chargée (évite un flash chez un vétérinaire).</w:t>
+      </w:r>
+    </w:p>
+    <w:p>
+      <w:pPr>
+        <w:spacing w:after="160" w:line="300"/>
+      </w:pPr>
+      <w:r>
+        <w:t>Ajouté le 08/09/2026 : sur "Mes rendez-vous" (RendezVousPage.tsx), un bouton "+ Nouveau rendez-vous" est désormais toujours visible (avant, réservé au CTA de l'état vide "aucun RDV à venir"), accompagné d'une section "Praticiens déjà consultés" pour reprendre RDV en un clic — réutilise telle quelle la dérivation recentDoctors et le composant DoctorMiniRow déjà en place sur l'accueil patient (PatientDashboard.tsx, section "Derniers praticiens consultés"). Le CTA de l'état vide a été retiré pour ne pas dupliquer le nouveau bouton, même logique que la décision prise sur PatientDashboard le 07/09/2026 (bouton "+ Prendre rendez-vous" retiré de l'accueil car redondant avec les actions rapides).</w:t>
       </w:r>
     </w:p>
     <w:sectPr>

</xml_diff>

<commit_message>
Docs: consigne l'ajout des 3 métiers + contexte veille Tobalgo
Section 13.

Co-Authored-By: Claude Sonnet 5 <noreply@anthropic.com>
</commit_message>
<xml_diff>
--- a/cahier_des_charges_animeaux.docx
+++ b/cahier_des_charges_animeaux.docx
@@ -7351,6 +7351,14 @@
       </w:pPr>
       <w:r>
         <w:t>Ajouté le 08/09/2026 : sur "Mes rendez-vous" (RendezVousPage.tsx), un bouton "+ Nouveau rendez-vous" est désormais toujours visible (avant, réservé au CTA de l'état vide "aucun RDV à venir"), accompagné d'une section "Praticiens déjà consultés" pour reprendre RDV en un clic — réutilise telle quelle la dérivation recentDoctors et le composant DoctorMiniRow déjà en place sur l'accueil patient (PatientDashboard.tsx, section "Derniers praticiens consultés"). Le CTA de l'état vide a été retiré pour ne pas dupliquer le nouveau bouton, même logique que la décision prise sur PatientDashboard le 07/09/2026 (bouton "+ Prendre rendez-vous" retiré de l'accueil car redondant avec les actions rapides).</w:t>
+      </w:r>
+    </w:p>
+    <w:p>
+      <w:pPr>
+        <w:spacing w:after="160" w:line="300"/>
+      </w:pPr>
+      <w:r>
+        <w:t>Ajouté le 08/09/2026 : trois nouveaux métiers praticien (Communication animale, Médiation animale, Photographe animalier — practitionerTypes.ts + migration 090 pour la table specialties), suite à une veille concurrentielle sur Tobalgo (plateforme concurrente positionnée uniquement sur les métiers non-médicaux, sans réservation par créneaux ni dossier de santé numérique, mais avec une charte éthique co-écrite avec l'association Argos 42 — piste à envisager pour Animéaux si le sujet revient). Décision explicite de l'utilisatrice de ne PAS ajouter "Éleveur" (pas un vrai rendez-vous, même logique que "vendeur en animalerie" déjà exclu) ; "Pension/garderie" également écarté pour l'instant, le modèle de RDV actuel (start_at/end_at le même jour) ne gère pas les réservations multi-jours.</w:t>
       </w:r>
     </w:p>
     <w:sectPr>

</xml_diff>

<commit_message>
Docs: consigne le retrait des 3 métiers ajoutés puis annulés
Section 13.

Co-Authored-By: Claude Sonnet 5 <noreply@anthropic.com>
</commit_message>
<xml_diff>
--- a/cahier_des_charges_animeaux.docx
+++ b/cahier_des_charges_animeaux.docx
@@ -7359,6 +7359,14 @@
       </w:pPr>
       <w:r>
         <w:t>Ajouté le 08/09/2026 : trois nouveaux métiers praticien (Communication animale, Médiation animale, Photographe animalier — practitionerTypes.ts + migration 090 pour la table specialties), suite à une veille concurrentielle sur Tobalgo (plateforme concurrente positionnée uniquement sur les métiers non-médicaux, sans réservation par créneaux ni dossier de santé numérique, mais avec une charte éthique co-écrite avec l'association Argos 42 — piste à envisager pour Animéaux si le sujet revient). Décision explicite de l'utilisatrice de ne PAS ajouter "Éleveur" (pas un vrai rendez-vous, même logique que "vendeur en animalerie" déjà exclu) ; "Pension/garderie" également écarté pour l'instant, le modèle de RDV actuel (start_at/end_at le même jour) ne gère pas les réservations multi-jours.</w:t>
+      </w:r>
+    </w:p>
+    <w:p>
+      <w:pPr>
+        <w:spacing w:after="160" w:line="300"/>
+      </w:pPr>
+      <w:r>
+        <w:t>Retiré le 08/09/2026 (quelques minutes après leur ajout, décision d'Anaïs) : les trois métiers Communication animale, Médiation animale, Photographe animalier — practitionerTypes.ts revenu en arrière, migration 091 (delete) appliquée en prod en complément de la 090 (insert), jamais éditée elle-même une fois appliquée.</w:t>
       </w:r>
     </w:p>
     <w:sectPr>

</xml_diff>

<commit_message>
Docs: consigne l'ajout de l'engagement bien-être animal
Section 13.

Co-Authored-By: Claude Sonnet 5 <noreply@anthropic.com>
</commit_message>
<xml_diff>
--- a/cahier_des_charges_animeaux.docx
+++ b/cahier_des_charges_animeaux.docx
@@ -7367,6 +7367,14 @@
       </w:pPr>
       <w:r>
         <w:t>Retiré le 08/09/2026 (quelques minutes après leur ajout, décision d'Anaïs) : les trois métiers Communication animale, Médiation animale, Photographe animalier — practitionerTypes.ts revenu en arrière, migration 091 (delete) appliquée en prod en complément de la 090 (insert), jamais éditée elle-même une fois appliquée.</w:t>
+      </w:r>
+    </w:p>
+    <w:p>
+      <w:pPr>
+        <w:spacing w:after="160" w:line="300"/>
+      </w:pPr>
+      <w:r>
+        <w:t>Ajouté le 08-09/09/2026 : engagement bien-être animal (charte praticien), différenciateur face à Tobalgo dont l'argument principal est une charte éthique co-écrite avec l'association Argos 42. Contenu centralisé dans src/lib/ethicsCharter.ts (six clauses + un paragraphe déclaratif explicite sur l'absence de vérification des méthodes au quotidien, avec canal de signalement contact.animeaux@gmail.com) — non relu par un juriste, même réserve que sur /cgu et /confidentialite. Case à cocher obligatoire à l'inscription praticien (RegisterPage.tsx), badge sur la fiche publique (DoctorPage.tsx, doctors.ethics_charter_accepted_at non nul), page légale dédiée (/engagement, LegalPage.tsx). Migration 092 : colonne horodatée sur doctors (même mécanisme que terms_accepted_at, migration 049), posée par handle_new_user() à l'inscription. Les praticiens déjà inscrits avant cette fonctionnalité ne l'ont jamais tacitement acceptée : une bannière avec bouton d'acceptation (useAcceptEthicsCharter) leur est présentée sur DoctorDashboard.tsx tant qu'ils n'ont pas validé.</w:t>
       </w:r>
     </w:p>
     <w:sectPr>

</xml_diff>